<commit_message>
bab 2 still progres masih mentah
</commit_message>
<xml_diff>
--- a/docx.docx
+++ b/docx.docx
@@ -1517,6 +1517,4732 @@
           <w:color w:val="000000" w:themeColor="text1"/>
         </w:rPr>
         <w:t>Musala</w:t>
+      </w:r>
+      <w:r>
+        <w:rPr>
+          <w:color w:val="000000" w:themeColor="text1"/>
+        </w:rPr>
+        <w:t>.</w:t>
+      </w:r>
+    </w:p>
+    <w:p>
+      <w:pPr>
+        <w:tabs>
+          <w:tab w:val="left" w:pos="1728"/>
+        </w:tabs>
+      </w:pPr>
+    </w:p>
+    <w:p>
+      <w:pPr>
+        <w:tabs>
+          <w:tab w:val="left" w:pos="1728"/>
+        </w:tabs>
+      </w:pPr>
+    </w:p>
+    <w:p>
+      <w:pPr>
+        <w:tabs>
+          <w:tab w:val="left" w:pos="1728"/>
+        </w:tabs>
+      </w:pPr>
+    </w:p>
+    <w:p>
+      <w:pPr>
+        <w:tabs>
+          <w:tab w:val="left" w:pos="1728"/>
+        </w:tabs>
+      </w:pPr>
+    </w:p>
+    <w:p>
+      <w:pPr>
+        <w:tabs>
+          <w:tab w:val="left" w:pos="1728"/>
+        </w:tabs>
+      </w:pPr>
+    </w:p>
+    <w:p>
+      <w:pPr>
+        <w:tabs>
+          <w:tab w:val="left" w:pos="1728"/>
+        </w:tabs>
+      </w:pPr>
+    </w:p>
+    <w:p>
+      <w:pPr>
+        <w:tabs>
+          <w:tab w:val="left" w:pos="1728"/>
+        </w:tabs>
+      </w:pPr>
+    </w:p>
+    <w:p>
+      <w:pPr>
+        <w:tabs>
+          <w:tab w:val="left" w:pos="1728"/>
+        </w:tabs>
+      </w:pPr>
+    </w:p>
+    <w:p>
+      <w:pPr>
+        <w:tabs>
+          <w:tab w:val="left" w:pos="1728"/>
+        </w:tabs>
+      </w:pPr>
+    </w:p>
+    <w:p>
+      <w:pPr>
+        <w:tabs>
+          <w:tab w:val="left" w:pos="1728"/>
+        </w:tabs>
+      </w:pPr>
+    </w:p>
+    <w:p>
+      <w:pPr>
+        <w:tabs>
+          <w:tab w:val="left" w:pos="1728"/>
+        </w:tabs>
+      </w:pPr>
+    </w:p>
+    <w:p>
+      <w:pPr>
+        <w:tabs>
+          <w:tab w:val="left" w:pos="1728"/>
+        </w:tabs>
+      </w:pPr>
+    </w:p>
+    <w:p>
+      <w:pPr>
+        <w:tabs>
+          <w:tab w:val="left" w:pos="1728"/>
+        </w:tabs>
+      </w:pPr>
+    </w:p>
+    <w:p>
+      <w:pPr>
+        <w:tabs>
+          <w:tab w:val="left" w:pos="1728"/>
+        </w:tabs>
+      </w:pPr>
+    </w:p>
+    <w:p>
+      <w:pPr>
+        <w:tabs>
+          <w:tab w:val="left" w:pos="1728"/>
+        </w:tabs>
+      </w:pPr>
+    </w:p>
+    <w:p>
+      <w:pPr>
+        <w:tabs>
+          <w:tab w:val="left" w:pos="1728"/>
+        </w:tabs>
+      </w:pPr>
+    </w:p>
+    <w:p>
+      <w:pPr>
+        <w:tabs>
+          <w:tab w:val="left" w:pos="1728"/>
+        </w:tabs>
+      </w:pPr>
+    </w:p>
+    <w:p>
+      <w:pPr>
+        <w:tabs>
+          <w:tab w:val="left" w:pos="1728"/>
+        </w:tabs>
+      </w:pPr>
+    </w:p>
+    <w:p>
+      <w:pPr>
+        <w:tabs>
+          <w:tab w:val="left" w:pos="1728"/>
+        </w:tabs>
+      </w:pPr>
+    </w:p>
+    <w:p>
+      <w:pPr>
+        <w:pStyle w:val="Heading1"/>
+      </w:pPr>
+      <w:r>
+        <w:lastRenderedPageBreak/>
+        <w:br/>
+        <w:t>LANDASAN TEORI</w:t>
+      </w:r>
+    </w:p>
+    <w:p/>
+    <w:p>
+      <w:pPr>
+        <w:pStyle w:val="Heading2"/>
+        <w:rPr>
+          <w:b w:val="0"/>
+          <w:bCs/>
+        </w:rPr>
+      </w:pPr>
+      <w:r>
+        <w:rPr>
+          <w:bCs/>
+        </w:rPr>
+        <w:t>Tinjauan Pustaka</w:t>
+      </w:r>
+    </w:p>
+    <w:p>
+      <w:pPr>
+        <w:spacing w:line="480" w:lineRule="auto"/>
+        <w:ind w:firstLine="720"/>
+        <w:jc w:val="both"/>
+        <w:rPr>
+          <w:color w:val="000000" w:themeColor="text1"/>
+        </w:rPr>
+      </w:pPr>
+      <w:r>
+        <w:rPr>
+          <w:color w:val="000000" w:themeColor="text1"/>
+        </w:rPr>
+        <w:t>Dalam penulisan skripsi, tinjauan pustaka merupakan bagian yang sangat penting karena berfungsi sebagai landasan teoritis dari penelitian yang dilakukan. Tinjauan pustaka disusun melalui pengkajian dan pengutipan berbagai sumber pustaka yang relevan, baik dari jurnal nasional maupun internasional, guna mendukung dan memperkuat dasar ilmiah penelitian.</w:t>
+      </w:r>
+    </w:p>
+    <w:p>
+      <w:pPr>
+        <w:spacing w:line="480" w:lineRule="auto"/>
+        <w:ind w:firstLine="720"/>
+        <w:jc w:val="both"/>
+        <w:rPr>
+          <w:color w:val="000000" w:themeColor="text1"/>
+        </w:rPr>
+      </w:pPr>
+      <w:r>
+        <w:rPr>
+          <w:color w:val="000000" w:themeColor="text1"/>
+        </w:rPr>
+        <w:t>Melalui tinjauan pustaka, penulis dapat menunjukkan pemahaman yang komprehensif terhadap konsep, teori, dan teknologi yang berkaitan dengan topik penelitian. Selain itu, tinjauan pustaka juga berperan dalam memastikan bahwa penelitian yang dilakukan memiliki keterkaitan dengan penelitian sebelumnya serta didasarkan pada literatur yang relevan dan mutakhir.</w:t>
+      </w:r>
+    </w:p>
+    <w:p>
+      <w:pPr>
+        <w:pStyle w:val="Heading3"/>
+      </w:pPr>
+      <w:r>
+        <w:t>Internet of Things (IoT)</w:t>
+      </w:r>
+    </w:p>
+    <w:p>
+      <w:pPr>
+        <w:pStyle w:val="NoSpacing"/>
+        <w:ind w:left="720"/>
+        <w:jc w:val="both"/>
+        <w:rPr>
+          <w:rFonts w:cs="Times New Roman"/>
+          <w:color w:val="000000" w:themeColor="text1"/>
+        </w:rPr>
+      </w:pPr>
+      <w:r>
+        <w:rPr>
+          <w:rFonts w:cs="Times New Roman"/>
+          <w:i/>
+          <w:iCs/>
+          <w:color w:val="000000" w:themeColor="text1"/>
+        </w:rPr>
+        <w:t>Internet of Things</w:t>
+      </w:r>
+      <w:r>
+        <w:rPr>
+          <w:rFonts w:cs="Times New Roman"/>
+          <w:color w:val="000000" w:themeColor="text1"/>
+        </w:rPr>
+        <w:t xml:space="preserve"> (IoT) merupakan konsep teknologi yang memungkinkan berbagai perangkat fisik terhubung ke jaringan internet sehingga perangkat tersebut mampu mengumpulkan, mengirimkan, dan memproses data secara otomatis. IoT memungkinkan perangkat bekerja secara mandiri tanpa keterlibatan manusia secara langsung, sehingga sangat sesuai diterapkan pada sistem </w:t>
+      </w:r>
+      <w:r>
+        <w:rPr>
+          <w:rFonts w:cs="Times New Roman"/>
+          <w:i/>
+          <w:iCs/>
+          <w:color w:val="000000" w:themeColor="text1"/>
+        </w:rPr>
+        <w:t>monitoring</w:t>
+      </w:r>
+      <w:r>
+        <w:rPr>
+          <w:rFonts w:cs="Times New Roman"/>
+          <w:color w:val="000000" w:themeColor="text1"/>
+        </w:rPr>
+        <w:t xml:space="preserve"> dan otomasi (Hercog et al., 2023: 1).</w:t>
+      </w:r>
+    </w:p>
+    <w:p>
+      <w:pPr>
+        <w:pStyle w:val="NoSpacing"/>
+        <w:ind w:left="567"/>
+        <w:jc w:val="both"/>
+        <w:rPr>
+          <w:rFonts w:cs="Times New Roman"/>
+          <w:color w:val="000000" w:themeColor="text1"/>
+        </w:rPr>
+      </w:pPr>
+    </w:p>
+    <w:p>
+      <w:pPr>
+        <w:spacing w:line="480" w:lineRule="auto"/>
+        <w:ind w:firstLine="720"/>
+        <w:jc w:val="both"/>
+        <w:rPr>
+          <w:color w:val="000000" w:themeColor="text1"/>
+        </w:rPr>
+      </w:pPr>
+      <w:r>
+        <w:rPr>
+          <w:color w:val="000000" w:themeColor="text1"/>
+        </w:rPr>
+        <w:lastRenderedPageBreak/>
+        <w:t>Secara konseptual, IoT menekankan pada konektivitas antarperangkat yang memungkinkan terjadinya proses penginderaan, pengambilan keputusan, dan respons terhadap kondisi lingkungan. Hal ini ditegaskan oleh Hercog et al. (2023) yang menyatakan bahwa:</w:t>
+      </w:r>
+      <w:r>
+        <w:rPr>
+          <w:color w:val="000000" w:themeColor="text1"/>
+        </w:rPr>
+        <w:t xml:space="preserve"> </w:t>
+      </w:r>
+      <w:r>
+        <w:rPr>
+          <w:i/>
+          <w:iCs/>
+          <w:color w:val="000000" w:themeColor="text1"/>
+        </w:rPr>
+        <w:t xml:space="preserve">“The Internet of Things (IoT) is a network of devices, users, and services; their connectivity enables sensing, decision-making, and reactions.” (Hercog et al., 2023: 1) </w:t>
+      </w:r>
+    </w:p>
+    <w:p>
+      <w:pPr>
+        <w:spacing w:line="480" w:lineRule="auto"/>
+        <w:ind w:firstLine="720"/>
+        <w:jc w:val="both"/>
+        <w:rPr>
+          <w:color w:val="000000" w:themeColor="text1"/>
+        </w:rPr>
+      </w:pPr>
+      <w:r>
+        <w:rPr>
+          <w:color w:val="000000" w:themeColor="text1"/>
+        </w:rPr>
+        <w:t>Pernyataan tersebut menunjukkan bahwa IoT bukan hanya sekadar jaringan perangkat, tetapi juga mencakup kemampuan perangkat untuk bereaksi berdasarkan data yang diperoleh dari sensor. Dalam praktiknya, data yang dikumpulkan oleh sensor akan diproses oleh mikrokontroler, kemudian dikirimkan melalui jaringan untuk disimpan dan dianalisis lebih lanjut.</w:t>
+      </w:r>
+    </w:p>
+    <w:p>
+      <w:pPr>
+        <w:spacing w:line="480" w:lineRule="auto"/>
+        <w:ind w:firstLine="720"/>
+        <w:jc w:val="both"/>
+        <w:rPr>
+          <w:color w:val="000000" w:themeColor="text1"/>
+        </w:rPr>
+      </w:pPr>
+      <w:r>
+        <w:rPr>
+          <w:color w:val="000000" w:themeColor="text1"/>
+        </w:rPr>
+        <w:t>Arsitektur sistem IoT umumnya terdiri dari tiga lapisan utama, yaitu lapisan fisik, lapisan jaringan, dan lapisan aplikasi. Lapisan fisik berfungsi untuk mengumpulkan data dari lingkungan melalui sensor serta mengendalikan perangkat melalui aktuator. Lapisan jaringan berperan sebagai media komunikasi data, sedangkan lapisan aplikasi berfungsi untuk pengolahan, penyimpanan, dan penyajian data kepada pengguna (Hercog et al., 2023: 1). Struktur ini dijelaskan oleh Hercog et al. (2023) sebagai berikut:</w:t>
+      </w:r>
+    </w:p>
+    <w:p>
+      <w:pPr>
+        <w:ind w:left="720"/>
+        <w:jc w:val="both"/>
+        <w:rPr>
+          <w:i/>
+          <w:iCs/>
+          <w:color w:val="000000" w:themeColor="text1"/>
+        </w:rPr>
+      </w:pPr>
+      <w:r>
+        <w:rPr>
+          <w:i/>
+          <w:iCs/>
+          <w:color w:val="000000" w:themeColor="text1"/>
+        </w:rPr>
+        <w:t>“IoT devices support three layers: the physical layer, which comprises sensors and actuators; the network layer, which interconnects the devices via networks all the way to the users; the application layer, which connects physical and network layers digitally and facilitates interactions between the user and other machines, thus allowing people to make decisions at a higher level of control or to automate selected tasks.” (Hercog et al., 2023: 1).</w:t>
+      </w:r>
+    </w:p>
+    <w:p>
+      <w:pPr>
+        <w:spacing w:line="480" w:lineRule="auto"/>
+        <w:ind w:firstLine="720"/>
+        <w:jc w:val="both"/>
+        <w:rPr>
+          <w:color w:val="000000" w:themeColor="text1"/>
+        </w:rPr>
+      </w:pPr>
+      <w:r>
+        <w:rPr>
+          <w:color w:val="000000" w:themeColor="text1"/>
+        </w:rPr>
+        <w:lastRenderedPageBreak/>
+        <w:t xml:space="preserve">Dalam bidang manajemen energi listrik, IoT banyak digunakan untuk memantau konsumsi energi secara </w:t>
+      </w:r>
+      <w:r>
+        <w:rPr>
+          <w:i/>
+          <w:iCs/>
+          <w:color w:val="000000" w:themeColor="text1"/>
+        </w:rPr>
+        <w:t>real-time</w:t>
+      </w:r>
+      <w:r>
+        <w:rPr>
+          <w:color w:val="000000" w:themeColor="text1"/>
+        </w:rPr>
+        <w:t xml:space="preserve">. Dengan memanfaatkan sensor dan perangkat IoT, data penggunaan energi dapat dikumpulkan secara kontinu dan dikirimkan ke </w:t>
+      </w:r>
+      <w:r>
+        <w:rPr>
+          <w:i/>
+          <w:iCs/>
+          <w:color w:val="000000" w:themeColor="text1"/>
+        </w:rPr>
+        <w:t>server</w:t>
+      </w:r>
+      <w:r>
+        <w:rPr>
+          <w:color w:val="000000" w:themeColor="text1"/>
+        </w:rPr>
+        <w:t xml:space="preserve"> untuk dianalisis. Informasi ini sangat berguna untuk mengetahui pola konsumsi energi dan mendukung upaya efisiensi energi (Hercog et al., 2023: 2).</w:t>
+      </w:r>
+    </w:p>
+    <w:p>
+      <w:pPr>
+        <w:spacing w:line="480" w:lineRule="auto"/>
+        <w:ind w:firstLine="720"/>
+        <w:jc w:val="both"/>
+        <w:rPr>
+          <w:color w:val="000000" w:themeColor="text1"/>
+        </w:rPr>
+      </w:pPr>
+      <w:r>
+        <w:rPr>
+          <w:color w:val="000000" w:themeColor="text1"/>
+        </w:rPr>
+        <w:t xml:space="preserve">Penerapan IoT pada pengelolaan energi dikenal sebagai </w:t>
+      </w:r>
+      <w:r>
+        <w:rPr>
+          <w:i/>
+          <w:iCs/>
+          <w:color w:val="000000" w:themeColor="text1"/>
+        </w:rPr>
+        <w:t>smart energy management.</w:t>
+      </w:r>
+      <w:r>
+        <w:rPr>
+          <w:color w:val="000000" w:themeColor="text1"/>
+        </w:rPr>
+        <w:t xml:space="preserve"> Sistem ini memungkinkan pengguna untuk memantau dan mengendalikan penggunaan energi dari jarak jauh. Hercog et al. (2023) menyatakan bahwa: </w:t>
+      </w:r>
+      <w:r>
+        <w:rPr>
+          <w:i/>
+          <w:iCs/>
+          <w:color w:val="000000" w:themeColor="text1"/>
+        </w:rPr>
+        <w:t>“Smart energy management IoT systems are used to monitor and control energy usage. They collect data from smart meters, monitor energy consumption patterns, and enable the remote control of devices to optimize energy efficiency and reduce costs”(Hercog et al., 2023: 2)</w:t>
+      </w:r>
+    </w:p>
+    <w:p>
+      <w:pPr>
+        <w:spacing w:line="480" w:lineRule="auto"/>
+        <w:ind w:firstLine="720"/>
+        <w:jc w:val="both"/>
+        <w:rPr>
+          <w:color w:val="000000" w:themeColor="text1"/>
+        </w:rPr>
+      </w:pPr>
+      <w:r>
+        <w:rPr>
+          <w:color w:val="000000" w:themeColor="text1"/>
+        </w:rPr>
+        <w:t xml:space="preserve">Berdasarkan uraian tersebut, </w:t>
+      </w:r>
+      <w:r>
+        <w:rPr>
+          <w:i/>
+          <w:iCs/>
+          <w:color w:val="000000" w:themeColor="text1"/>
+        </w:rPr>
+        <w:t>Internet of Things</w:t>
+      </w:r>
+      <w:r>
+        <w:rPr>
+          <w:color w:val="000000" w:themeColor="text1"/>
+        </w:rPr>
+        <w:t xml:space="preserve"> (IoT) sangat relevan digunakan dalam perancangan sistem monitoring konsumsi energi lampu dan kipas angin pada bangunan </w:t>
+      </w:r>
+      <w:r>
+        <w:rPr>
+          <w:color w:val="000000" w:themeColor="text1"/>
+        </w:rPr>
+        <w:t>Musala</w:t>
+      </w:r>
+      <w:r>
+        <w:rPr>
+          <w:color w:val="000000" w:themeColor="text1"/>
+        </w:rPr>
+        <w:t xml:space="preserve">. Dengan teknologi IoT, sistem mampu melakukan pemantauan energi secara </w:t>
+      </w:r>
+      <w:r>
+        <w:rPr>
+          <w:i/>
+          <w:iCs/>
+          <w:color w:val="000000" w:themeColor="text1"/>
+        </w:rPr>
+        <w:t>real-time</w:t>
+      </w:r>
+      <w:r>
+        <w:rPr>
+          <w:color w:val="000000" w:themeColor="text1"/>
+        </w:rPr>
+        <w:t xml:space="preserve">, menyimpan data secara terpusat, serta menyajikan informasi penggunaan energi melalui </w:t>
+      </w:r>
+      <w:r>
+        <w:rPr>
+          <w:i/>
+          <w:iCs/>
+          <w:color w:val="000000" w:themeColor="text1"/>
+        </w:rPr>
+        <w:t>website</w:t>
+      </w:r>
+      <w:r>
+        <w:rPr>
+          <w:color w:val="000000" w:themeColor="text1"/>
+        </w:rPr>
+        <w:t xml:space="preserve"> untuk mendukung pengelolaan energi yang lebih efektif dan efisien.</w:t>
+      </w:r>
+    </w:p>
+    <w:p>
+      <w:pPr>
+        <w:pStyle w:val="Heading3"/>
+      </w:pPr>
+      <w:r>
+        <w:t xml:space="preserve">2.1.2 </w:t>
+      </w:r>
+      <w:r>
+        <w:tab/>
+      </w:r>
+      <w:r>
+        <w:t>ESP8266</w:t>
+      </w:r>
+    </w:p>
+    <w:p>
+      <w:pPr>
+        <w:spacing w:line="360" w:lineRule="auto"/>
+        <w:ind w:firstLine="720"/>
+        <w:jc w:val="both"/>
+      </w:pPr>
+      <w:r>
+        <w:t xml:space="preserve">ESP8266 merupakan mikrokontroler yang dilengkapi dengan kemampuan konektivitas Wi-Fi sehingga dapat terhubung dengan jaringan internet dan </w:t>
+      </w:r>
+      <w:r>
+        <w:lastRenderedPageBreak/>
+        <w:t>digunakan dalam sistem Internet of Things (IoT). Penggunaan ESP8266 memungkinkan perangkat dapat dikendalikan dan dimonitor melalui smartphone secara jarak jauh menggunakan aplikasi berbasis internet (Sulistyorini et al., 2022: 40).</w:t>
+      </w:r>
+    </w:p>
+    <w:p>
+      <w:pPr>
+        <w:spacing w:line="360" w:lineRule="auto"/>
+        <w:ind w:firstLine="720"/>
+        <w:jc w:val="both"/>
+      </w:pPr>
+      <w:r>
+        <w:t>ESP8266 juga dapat digunakan sebagai perangkat kendali dalam sistem smart room yang terhubung dengan jaringan komputer. Dengan dukungan teknologi Wi-Fi, ESP8266 mampu mengontrol berbagai perangkat seperti lampu, AC, dan perangkat elektronik lainnya melalui smartphone sehingga memberikan kemudahan dan efisiensi dalam pengoperasian (Nugroho et al., 2023: 55).</w:t>
+      </w:r>
+    </w:p>
+    <w:p>
+      <w:pPr>
+        <w:spacing w:line="360" w:lineRule="auto"/>
+        <w:jc w:val="both"/>
+      </w:pPr>
+      <w:r>
+        <w:t>Selain itu, ESP8266 memiliki kemampuan untuk menerima dan mengirimkan data secara real-time dengan waktu respon yang cepat. Pada penerapan sistem smart key berbasis IoT, ESP8266 mampu mengendalikan perangkat dari jarak jauh dengan waktu respon sekitar 1–2 detik, tergantung pada kualitas koneksi internet yang digunakan (Ritonga et al., 2024).</w:t>
+      </w:r>
+    </w:p>
+    <w:p>
+      <w:pPr>
+        <w:spacing w:line="360" w:lineRule="auto"/>
+        <w:ind w:firstLine="720"/>
+        <w:jc w:val="both"/>
+      </w:pPr>
+      <w:r>
+        <w:t xml:space="preserve">Berdasarkan uraian tersebut, ESP8266 pada penelitian ini berperan sebagai pusat kendali sistem monitoring konsumsi energi. ESP8266 menerima data dari sensor, memproses data, serta mengirimkan data tersebut ke server untuk ditampilkan melalui website. Dengan kemampuan konektivitas, pengolahan data, dan kontrol perangkat yang dimiliki, ESP8266 sangat sesuai digunakan dalam perancangan sistem monitoring energi listrik berbasis </w:t>
+      </w:r>
+      <w:r>
+        <w:rPr>
+          <w:i/>
+          <w:iCs/>
+        </w:rPr>
+        <w:t>Internet of Things.</w:t>
+      </w:r>
+    </w:p>
+    <w:p>
+      <w:pPr>
+        <w:pStyle w:val="NoSpacing"/>
+        <w:jc w:val="both"/>
+        <w:rPr>
+          <w:rFonts w:cs="Times New Roman"/>
+        </w:rPr>
+      </w:pPr>
+    </w:p>
+    <w:p>
+      <w:pPr>
+        <w:pStyle w:val="Heading3"/>
+      </w:pPr>
+      <w:r>
+        <w:t xml:space="preserve">2.1.3 </w:t>
+      </w:r>
+      <w:r>
+        <w:tab/>
+        <w:t>Sensor PIR (HC-SR501)</w:t>
+      </w:r>
+    </w:p>
+    <w:p>
+      <w:pPr>
+        <w:pStyle w:val="NoSpacing"/>
+        <w:ind w:left="720"/>
+        <w:jc w:val="both"/>
+        <w:rPr>
+          <w:rFonts w:cs="Times New Roman"/>
+          <w:color w:val="000000" w:themeColor="text1"/>
+        </w:rPr>
+      </w:pPr>
+      <w:r>
+        <w:rPr>
+          <w:rFonts w:cs="Times New Roman"/>
+          <w:color w:val="000000" w:themeColor="text1"/>
+        </w:rPr>
+        <w:t xml:space="preserve">Sensor </w:t>
+      </w:r>
+      <w:r>
+        <w:rPr>
+          <w:rFonts w:cs="Times New Roman"/>
+          <w:i/>
+          <w:iCs/>
+          <w:color w:val="000000" w:themeColor="text1"/>
+        </w:rPr>
+        <w:t>Passive Infrared</w:t>
+      </w:r>
+      <w:r>
+        <w:rPr>
+          <w:rFonts w:cs="Times New Roman"/>
+          <w:color w:val="000000" w:themeColor="text1"/>
+        </w:rPr>
+        <w:t xml:space="preserve"> (PIR) HC-SR501 merupakan sensor yang digunakan untuk mendeteksi keberadaan atau pergerakan manusia berdasarkan perubahan radiasi infra merah yang dipancarkan oleh tubuh manusia. Sensor ini bersifat pasif karena tidak memancarkan gelombang sendiri, melainkan hanya menerima radiasi panas dari objek di sekitarnya (Juliansyah et al., 2021: 199).</w:t>
+      </w:r>
+    </w:p>
+    <w:p>
+      <w:pPr>
+        <w:pStyle w:val="NoSpacing"/>
+        <w:ind w:left="567"/>
+        <w:jc w:val="both"/>
+        <w:rPr>
+          <w:rFonts w:cs="Times New Roman"/>
+          <w:color w:val="000000" w:themeColor="text1"/>
+        </w:rPr>
+      </w:pPr>
+    </w:p>
+    <w:p>
+      <w:pPr>
+        <w:pStyle w:val="NoSpacing"/>
+        <w:ind w:left="720"/>
+        <w:jc w:val="both"/>
+        <w:rPr>
+          <w:rFonts w:cs="Times New Roman"/>
+        </w:rPr>
+      </w:pPr>
+      <w:r>
+        <w:rPr>
+          <w:rFonts w:cs="Times New Roman"/>
+        </w:rPr>
+        <w:t xml:space="preserve">Prinsip kerja sensor PIR didasarkan pada kemampuan mendeteksi perubahan energi panas yang berada pada rentang panjang gelombang infra merah tertentu. Ketika terdapat pergerakan manusia di area jangkauan </w:t>
+      </w:r>
+      <w:r>
+        <w:rPr>
+          <w:rFonts w:cs="Times New Roman"/>
+        </w:rPr>
+        <w:lastRenderedPageBreak/>
+        <w:t xml:space="preserve">sensor, terjadi perubahan radiasi infra merah yang kemudian diubah menjadi sinyal listrik. Hal tersebut dijelaskan dalam penelitian Juliansyah et al. (2021) yang menyatakan bahwa:  “Sensor PIR digunakan karena sensor tersebut dapat mendeteksi pancaran gelombang inframerah dari manusia, sehingga objek yang tertuju adalah manusia. Sensor PIR juga menerima radiasi panas dari manusia, jadi ketika manusia bergerak sensor ini akan menerima perubahan radiasi yang dipancarkan oleh manusia.” (Juliansyah et al., 2021: 199) </w:t>
+      </w:r>
+    </w:p>
+    <w:p>
+      <w:pPr>
+        <w:pStyle w:val="NoSpacing"/>
+        <w:ind w:left="720"/>
+        <w:jc w:val="both"/>
+        <w:rPr>
+          <w:rFonts w:cs="Times New Roman"/>
+        </w:rPr>
+      </w:pPr>
+    </w:p>
+    <w:p>
+      <w:pPr>
+        <w:spacing w:line="480" w:lineRule="auto"/>
+        <w:ind w:firstLine="720"/>
+        <w:jc w:val="both"/>
+        <w:rPr>
+          <w:color w:val="000000" w:themeColor="text1"/>
+        </w:rPr>
+      </w:pPr>
+      <w:r>
+        <w:rPr>
+          <w:color w:val="000000" w:themeColor="text1"/>
+        </w:rPr>
+        <w:t xml:space="preserve">Sensor PIR HC-SR501 memiliki keunggulan berupa konsumsi daya yang rendah, jangkauan deteksi yang cukup luas, serta kemudahan integrasi dengan mikrokontroler seperti </w:t>
+      </w:r>
+      <w:r>
+        <w:rPr>
+          <w:color w:val="000000" w:themeColor="text1"/>
+        </w:rPr>
+        <w:t>ESP8266</w:t>
+      </w:r>
+      <w:r>
+        <w:rPr>
+          <w:color w:val="000000" w:themeColor="text1"/>
+        </w:rPr>
+        <w:t>. Sensor ini umum digunakan pada sistem keamanan, otomasi ruangan, dan penghematan energi berbasis IoT.</w:t>
+      </w:r>
+    </w:p>
+    <w:p>
+      <w:pPr>
+        <w:spacing w:line="480" w:lineRule="auto"/>
+        <w:ind w:firstLine="720"/>
+        <w:jc w:val="both"/>
+        <w:rPr>
+          <w:i/>
+          <w:iCs/>
+          <w:color w:val="000000" w:themeColor="text1"/>
+        </w:rPr>
+      </w:pPr>
+      <w:r>
+        <w:rPr>
+          <w:color w:val="000000" w:themeColor="text1"/>
+        </w:rPr>
+        <w:t>Dalam kajian literatur tentang sensor gerak, disebutkan bahwa sensor PIR mampu mendeteksi perubahan radiasi panas akibat pergerakan manusia dengan tingkat keandalan yang baik (Lesmana et al., 2021: 2). Review sensor gerak menyebutkan bahwa:</w:t>
+      </w:r>
+    </w:p>
+    <w:p>
+      <w:pPr>
+        <w:ind w:left="720"/>
+        <w:jc w:val="both"/>
+        <w:rPr>
+          <w:i/>
+          <w:iCs/>
+          <w:color w:val="000000" w:themeColor="text1"/>
+        </w:rPr>
+      </w:pPr>
+      <w:r>
+        <w:rPr>
+          <w:i/>
+          <w:iCs/>
+          <w:color w:val="000000" w:themeColor="text1"/>
+        </w:rPr>
+        <w:t>“PIR (Passive Infrared Received) sensor is passive, meaning that this sensor does not emit infrared rays but only captures infrared rays; because all objects emit radiant energy, a motion will be detected when an infrared source with a certain temperature, e.g., humans, passes through another infrared source with a different temperature, e.g., a wall.” (Lesmana et al., 2021: 2)</w:t>
+      </w:r>
+    </w:p>
+    <w:p>
+      <w:pPr>
+        <w:pStyle w:val="NoSpacing"/>
+        <w:ind w:left="720"/>
+        <w:jc w:val="both"/>
+        <w:rPr>
+          <w:rFonts w:cs="Times New Roman"/>
+        </w:rPr>
+      </w:pPr>
+      <w:r>
+        <w:rPr>
+          <w:rFonts w:cs="Times New Roman"/>
+        </w:rPr>
+        <w:t>Sensor PIR HC-SR501 memiliki sudut deteksi yang lebar dan dapat mendeteksi objek bergerak dari berbagai arah, seperti depan, kanan, dan kiri. Kemampuan ini membuat sensor PIR efektif digunakan pada ruangan dengan aktivitas manusia yang dinamis (Juliansyah et al., 2021: 205). Hal ini dibuktikan dalam penelitian sistem deteksi gerak yang menyatakan bahwa: “Sensor PIR HC-SR501 juga bisa mendeteksi objek gerak dari sisi kanan, kiri dan depan.” (Juliansyah et al., 2021: 205)</w:t>
+      </w:r>
+    </w:p>
+    <w:p>
+      <w:pPr>
+        <w:pStyle w:val="NoSpacing"/>
+        <w:ind w:left="720"/>
+        <w:jc w:val="both"/>
+        <w:rPr>
+          <w:rFonts w:cs="Times New Roman"/>
+        </w:rPr>
+      </w:pPr>
+    </w:p>
+    <w:p>
+      <w:pPr>
+        <w:pStyle w:val="NoSpacing"/>
+        <w:ind w:left="720"/>
+        <w:jc w:val="both"/>
+        <w:rPr>
+          <w:rFonts w:cs="Times New Roman"/>
+        </w:rPr>
+      </w:pPr>
+      <w:r>
+        <w:rPr>
+          <w:rFonts w:cs="Times New Roman"/>
+        </w:rPr>
+        <w:t xml:space="preserve">Dalam sistem berbasis </w:t>
+      </w:r>
+      <w:r>
+        <w:rPr>
+          <w:rFonts w:cs="Times New Roman"/>
+          <w:i/>
+          <w:iCs/>
+        </w:rPr>
+        <w:t>Internet of Things</w:t>
+      </w:r>
+      <w:r>
+        <w:rPr>
+          <w:rFonts w:cs="Times New Roman"/>
+        </w:rPr>
+        <w:t xml:space="preserve">, sensor PIR sering dikombinasikan dengan mikrokontroler untuk memicu aksi tertentu ketika terdeteksi adanya pergerakan (Ramschie et al., 2021: 175). Ramschie et al. (2021) menjelaskan bahwa sensor PIR digunakan sebagai pemicu utama </w:t>
+      </w:r>
+      <w:r>
+        <w:rPr>
+          <w:rFonts w:cs="Times New Roman"/>
+        </w:rPr>
+        <w:lastRenderedPageBreak/>
+        <w:t xml:space="preserve">dalam sistem berbasis </w:t>
+      </w:r>
+      <w:r>
+        <w:rPr>
+          <w:rFonts w:cs="Times New Roman"/>
+        </w:rPr>
+        <w:t>ESP8266</w:t>
+      </w:r>
+      <w:r>
+        <w:rPr>
+          <w:rFonts w:cs="Times New Roman"/>
+        </w:rPr>
+        <w:t>:</w:t>
+      </w:r>
+      <w:r>
+        <w:rPr>
+          <w:rFonts w:cs="Times New Roman"/>
+          <w:i/>
+          <w:iCs/>
+        </w:rPr>
+        <w:t xml:space="preserve"> </w:t>
+      </w:r>
+      <w:r>
+        <w:rPr>
+          <w:rFonts w:cs="Times New Roman"/>
+        </w:rPr>
+        <w:t xml:space="preserve">“Sensor Pasif Infra Red (PIR) yang difungsikan untuk mendeteksi orang yang berada dalam ruangan.” (Ramschie et al., 2021: 175) </w:t>
+      </w:r>
+    </w:p>
+    <w:p>
+      <w:pPr>
+        <w:pStyle w:val="NoSpacing"/>
+        <w:ind w:left="720"/>
+        <w:jc w:val="both"/>
+        <w:rPr>
+          <w:rFonts w:cs="Times New Roman"/>
+          <w:i/>
+          <w:iCs/>
+        </w:rPr>
+      </w:pPr>
+    </w:p>
+    <w:p>
+      <w:pPr>
+        <w:spacing w:line="480" w:lineRule="auto"/>
+        <w:ind w:firstLine="720"/>
+        <w:jc w:val="both"/>
+        <w:rPr>
+          <w:color w:val="000000" w:themeColor="text1"/>
+        </w:rPr>
+      </w:pPr>
+      <w:r>
+        <w:rPr>
+          <w:color w:val="000000" w:themeColor="text1"/>
+        </w:rPr>
+        <w:t xml:space="preserve">Pada penelitian ini, sensor PIR HC-SR501 digunakan untuk mendeteksi keberadaan jamaah di dalam </w:t>
+      </w:r>
+      <w:r>
+        <w:rPr>
+          <w:color w:val="000000" w:themeColor="text1"/>
+        </w:rPr>
+        <w:t>Musala</w:t>
+      </w:r>
+      <w:r>
+        <w:rPr>
+          <w:color w:val="000000" w:themeColor="text1"/>
+        </w:rPr>
+        <w:t xml:space="preserve">. Data deteksi dari sensor PIR dimanfaatkan sebagai informasi pendukung dalam sistem monitoring konsumsi energi, sehingga penggunaan lampu dan kipas angin dapat dianalisis berdasarkan aktivitas manusia di dalam ruangan. Dengan demikian, sensor PIR berperan penting dalam mendukung efisiensi energi dan optimalisasi penggunaan perangkat listrik berbasis </w:t>
+      </w:r>
+      <w:r>
+        <w:rPr>
+          <w:i/>
+          <w:iCs/>
+          <w:color w:val="000000" w:themeColor="text1"/>
+        </w:rPr>
+        <w:t>Internet of Things</w:t>
+      </w:r>
+      <w:r>
+        <w:rPr>
+          <w:color w:val="000000" w:themeColor="text1"/>
+        </w:rPr>
+        <w:t>.</w:t>
+      </w:r>
+    </w:p>
+    <w:p>
+      <w:pPr>
+        <w:pStyle w:val="Heading3"/>
+      </w:pPr>
+      <w:r>
+        <w:t xml:space="preserve">2.1.4 </w:t>
+      </w:r>
+      <w:r>
+        <w:tab/>
+        <w:t>Sensor PZEM-004T</w:t>
+      </w:r>
+    </w:p>
+    <w:p>
+      <w:pPr>
+        <w:spacing w:line="480" w:lineRule="auto"/>
+        <w:ind w:firstLine="720"/>
+        <w:jc w:val="both"/>
+        <w:rPr>
+          <w:color w:val="000000" w:themeColor="text1"/>
+        </w:rPr>
+      </w:pPr>
+      <w:r>
+        <w:rPr>
+          <w:color w:val="000000" w:themeColor="text1"/>
+        </w:rPr>
+        <w:t xml:space="preserve">Sensor PZEM-004T merupakan modul pengukuran energi listrik arus bolak-balik (AC) yang digunakan untuk memantau parameter kelistrikan secara </w:t>
+      </w:r>
+      <w:r>
+        <w:rPr>
+          <w:i/>
+          <w:iCs/>
+          <w:color w:val="000000" w:themeColor="text1"/>
+        </w:rPr>
+        <w:t>real-time</w:t>
+      </w:r>
+      <w:r>
+        <w:rPr>
+          <w:color w:val="000000" w:themeColor="text1"/>
+        </w:rPr>
+        <w:t xml:space="preserve">. Sensor ini mampu mengukur beberapa parameter penting, antara lain tegangan, arus, daya, dan energi listrik, sehingga banyak digunakan dalam sistem monitoring energi berbasis </w:t>
+      </w:r>
+      <w:r>
+        <w:rPr>
+          <w:i/>
+          <w:iCs/>
+          <w:color w:val="000000" w:themeColor="text1"/>
+        </w:rPr>
+        <w:t>Internet of Things</w:t>
+      </w:r>
+      <w:r>
+        <w:rPr>
+          <w:color w:val="000000" w:themeColor="text1"/>
+        </w:rPr>
+        <w:t xml:space="preserve"> (IoT). Pada penelitian yang dilakukan oleh Hidayat dan Al-Faris (2025), PZEM-004T digunakan sebagai sensor utama untuk memantau konsumsi energi listrik secara langsung pada sistem berbasis </w:t>
+      </w:r>
+      <w:r>
+        <w:rPr>
+          <w:color w:val="000000" w:themeColor="text1"/>
+        </w:rPr>
+        <w:t>ESP8266</w:t>
+      </w:r>
+      <w:r>
+        <w:rPr>
+          <w:color w:val="000000" w:themeColor="text1"/>
+        </w:rPr>
+        <w:t xml:space="preserve">. </w:t>
+      </w:r>
+      <w:r>
+        <w:rPr>
+          <w:i/>
+          <w:iCs/>
+          <w:color w:val="000000" w:themeColor="text1"/>
+        </w:rPr>
+        <w:t xml:space="preserve">“The system allows real-time monitoring of electrical parameters such as voltage, current, power, and energy, with data displayed on digital devices like smartphones or computers.” (Hidayat &amp; Al-Faris, 2025: 1077) </w:t>
+      </w:r>
+    </w:p>
+    <w:p>
+      <w:pPr>
+        <w:pStyle w:val="NoSpacing"/>
+        <w:ind w:left="720"/>
+        <w:jc w:val="both"/>
+        <w:rPr>
+          <w:rFonts w:cs="Times New Roman"/>
+          <w:i/>
+          <w:iCs/>
+        </w:rPr>
+      </w:pPr>
+      <w:r>
+        <w:rPr>
+          <w:rFonts w:cs="Times New Roman"/>
+        </w:rPr>
+        <w:t xml:space="preserve">PZEM-004T dirancang agar mudah diintegrasikan dengan mikrokontroler seperti </w:t>
+      </w:r>
+      <w:r>
+        <w:rPr>
+          <w:rFonts w:cs="Times New Roman"/>
+        </w:rPr>
+        <w:t>ESP8266</w:t>
+      </w:r>
+      <w:r>
+        <w:rPr>
+          <w:rFonts w:cs="Times New Roman"/>
+        </w:rPr>
+        <w:t xml:space="preserve"> melalui komunikasi serial, sehingga data hasil pengukuran dapat langsung diproses dan dikirimkan ke </w:t>
+      </w:r>
+      <w:r>
+        <w:rPr>
+          <w:rFonts w:cs="Times New Roman"/>
+          <w:i/>
+          <w:iCs/>
+        </w:rPr>
+        <w:t>server</w:t>
+      </w:r>
+      <w:r>
+        <w:rPr>
+          <w:rFonts w:cs="Times New Roman"/>
+        </w:rPr>
+        <w:t xml:space="preserve"> atau aplikasi pemantauan berbasis web. Kemudahan integrasi ini menjadikan </w:t>
+      </w:r>
+      <w:r>
+        <w:rPr>
+          <w:rFonts w:cs="Times New Roman"/>
+        </w:rPr>
+        <w:lastRenderedPageBreak/>
+        <w:t xml:space="preserve">PZEM-004T sangat sesuai digunakan pada sistem monitoring konsumsi energi listrik pada bangunan maupun beban listrik tertentu (Ramadhani et al., 2024: 41). Hal tersebut diperkuat oleh Ramadhani et al. (2024) yang menyatakan bahwa: </w:t>
+      </w:r>
+      <w:r>
+        <w:rPr>
+          <w:rFonts w:cs="Times New Roman"/>
+          <w:i/>
+          <w:iCs/>
+        </w:rPr>
+        <w:t xml:space="preserve">“The PZEM-004T sensor reads the load and sends data to the NodeMCU </w:t>
+      </w:r>
+      <w:r>
+        <w:rPr>
+          <w:rFonts w:cs="Times New Roman"/>
+          <w:i/>
+          <w:iCs/>
+        </w:rPr>
+        <w:t>ESP8266</w:t>
+      </w:r>
+      <w:r>
+        <w:rPr>
+          <w:rFonts w:cs="Times New Roman"/>
+          <w:i/>
+          <w:iCs/>
+        </w:rPr>
+        <w:t xml:space="preserve">. The NodeMCU </w:t>
+      </w:r>
+      <w:r>
+        <w:rPr>
+          <w:rFonts w:cs="Times New Roman"/>
+          <w:i/>
+          <w:iCs/>
+        </w:rPr>
+        <w:t>ESP8266</w:t>
+      </w:r>
+      <w:r>
+        <w:rPr>
+          <w:rFonts w:cs="Times New Roman"/>
+          <w:i/>
+          <w:iCs/>
+        </w:rPr>
+        <w:t xml:space="preserve"> processes the data and sends it to the server via internet/wifi.” (Ramadhani et al., 2024: 41) </w:t>
+      </w:r>
+    </w:p>
+    <w:p>
+      <w:pPr>
+        <w:pStyle w:val="NoSpacing"/>
+        <w:ind w:left="720"/>
+        <w:jc w:val="both"/>
+        <w:rPr>
+          <w:rFonts w:cs="Times New Roman"/>
+        </w:rPr>
+      </w:pPr>
+    </w:p>
+    <w:p>
+      <w:pPr>
+        <w:spacing w:line="480" w:lineRule="auto"/>
+        <w:ind w:firstLine="720"/>
+        <w:jc w:val="both"/>
+        <w:rPr>
+          <w:color w:val="000000" w:themeColor="text1"/>
+        </w:rPr>
+      </w:pPr>
+      <w:r>
+        <w:rPr>
+          <w:color w:val="000000" w:themeColor="text1"/>
+        </w:rPr>
+        <w:t xml:space="preserve">Kemampuan pengukuran dan pengiriman data secara real-time tersebut memungkinkan sistem untuk merekam perubahan konsumsi energi listrik secara kontinu. Data yang diperoleh dapat digunakan untuk menganalisis pola penggunaan energi pada berbagai jenis beban listrik. Dalam konteks penelitian ini, pengukuran </w:t>
+      </w:r>
+      <w:r>
+        <w:rPr>
+          <w:i/>
+          <w:iCs/>
+          <w:color w:val="000000" w:themeColor="text1"/>
+        </w:rPr>
+        <w:t>real-time</w:t>
+      </w:r>
+      <w:r>
+        <w:rPr>
+          <w:color w:val="000000" w:themeColor="text1"/>
+        </w:rPr>
+        <w:t xml:space="preserve"> menjadi sangat penting untuk membedakan karakteristik konsumsi energi pada perangkat dengan pola kerja yang berbeda, seperti lampu sebagai beban resistif dan kipas angin sebagai beban induktif.</w:t>
+      </w:r>
+    </w:p>
+    <w:p>
+      <w:pPr>
+        <w:pStyle w:val="NoSpacing"/>
+        <w:ind w:left="720"/>
+        <w:jc w:val="both"/>
+        <w:rPr>
+          <w:rFonts w:cs="Times New Roman"/>
+          <w:i/>
+          <w:iCs/>
+        </w:rPr>
+      </w:pPr>
+      <w:r>
+        <w:rPr>
+          <w:rFonts w:cs="Times New Roman"/>
+        </w:rPr>
+        <w:t xml:space="preserve">Selain itu, sensor PZEM-004T memiliki tingkat akurasi yang cukup tinggi. Pada pengujian yang dilakukan dengan membandingkan hasil pengukuran PZEM-004T dengan alat ukur referensi, diperoleh tingkat kesalahan yang relatif kecil (Agil et al., 2025: 17). Hal ini dijelaskan dalam penelitian monitoring energi sebagai berikut: </w:t>
+      </w:r>
+      <w:r>
+        <w:rPr>
+          <w:rFonts w:cs="Times New Roman"/>
+          <w:i/>
+          <w:iCs/>
+        </w:rPr>
+        <w:t xml:space="preserve">“The system achieved an average error of 1.19% for the iron and 0% for both the fan and refrigerator, confirming strong measurement accuracy. However,” (Agil et al., 2025: 17) </w:t>
+      </w:r>
+    </w:p>
+    <w:p>
+      <w:pPr>
+        <w:pStyle w:val="NoSpacing"/>
+        <w:ind w:left="720"/>
+        <w:jc w:val="both"/>
+        <w:rPr>
+          <w:rFonts w:cs="Times New Roman"/>
+        </w:rPr>
+      </w:pPr>
+    </w:p>
+    <w:p>
+      <w:pPr>
+        <w:spacing w:line="480" w:lineRule="auto"/>
+        <w:ind w:firstLine="720"/>
+        <w:jc w:val="both"/>
+        <w:rPr>
+          <w:color w:val="000000" w:themeColor="text1"/>
+        </w:rPr>
+      </w:pPr>
+      <w:r>
+        <w:rPr>
+          <w:color w:val="000000" w:themeColor="text1"/>
+        </w:rPr>
+        <w:t xml:space="preserve">Pada penelitian ini, sensor PZEM-004T digunakan untuk mengukur konsumsi energi listrik pada lampu AC 5 Watt dan kipas angin AC 20 Watt di lingkungan </w:t>
+      </w:r>
+      <w:r>
+        <w:rPr>
+          <w:color w:val="000000" w:themeColor="text1"/>
+        </w:rPr>
+        <w:t>Musala</w:t>
+      </w:r>
+      <w:r>
+        <w:rPr>
+          <w:color w:val="000000" w:themeColor="text1"/>
+        </w:rPr>
+        <w:t xml:space="preserve">. Data hasil pengukuran dari sensor PZEM-004T dikirimkan ke mikrokontroler </w:t>
+      </w:r>
+      <w:r>
+        <w:rPr>
+          <w:color w:val="000000" w:themeColor="text1"/>
+        </w:rPr>
+        <w:t>ESP8266</w:t>
+      </w:r>
+      <w:r>
+        <w:rPr>
+          <w:color w:val="000000" w:themeColor="text1"/>
+        </w:rPr>
+        <w:t xml:space="preserve"> untuk selanjutnya disimpan dalam basis data dan ditampilkan melalui </w:t>
+      </w:r>
+      <w:r>
+        <w:rPr>
+          <w:i/>
+          <w:iCs/>
+          <w:color w:val="000000" w:themeColor="text1"/>
+        </w:rPr>
+        <w:t>website</w:t>
+      </w:r>
+      <w:r>
+        <w:rPr>
+          <w:color w:val="000000" w:themeColor="text1"/>
+        </w:rPr>
+        <w:t xml:space="preserve">. Dengan demikian, sensor PZEM-004T berperan sebagai komponen utama dalam memperoleh data konsumsi energi listrik yang akurat dan </w:t>
+      </w:r>
+      <w:r>
+        <w:rPr>
+          <w:i/>
+          <w:iCs/>
+          <w:color w:val="000000" w:themeColor="text1"/>
+        </w:rPr>
+        <w:t>real-time</w:t>
+      </w:r>
+      <w:r>
+        <w:rPr>
+          <w:color w:val="000000" w:themeColor="text1"/>
+        </w:rPr>
+        <w:t xml:space="preserve"> pada sistem monitoring berbasis </w:t>
+      </w:r>
+      <w:r>
+        <w:rPr>
+          <w:i/>
+          <w:iCs/>
+          <w:color w:val="000000" w:themeColor="text1"/>
+        </w:rPr>
+        <w:t>Internet of Things</w:t>
+      </w:r>
+      <w:r>
+        <w:rPr>
+          <w:color w:val="000000" w:themeColor="text1"/>
+        </w:rPr>
+        <w:t>.</w:t>
+      </w:r>
+    </w:p>
+    <w:p>
+      <w:pPr>
+        <w:pStyle w:val="Heading3"/>
+      </w:pPr>
+      <w:r>
+        <w:lastRenderedPageBreak/>
+        <w:t xml:space="preserve">2.1.5 </w:t>
+      </w:r>
+      <w:r>
+        <w:tab/>
+        <w:t xml:space="preserve">Relay </w:t>
+      </w:r>
+    </w:p>
+    <w:p>
+      <w:pPr>
+        <w:pStyle w:val="NoSpacing"/>
+        <w:ind w:left="720"/>
+        <w:jc w:val="both"/>
+        <w:rPr>
+          <w:rFonts w:cs="Times New Roman"/>
+          <w:i/>
+          <w:iCs/>
+        </w:rPr>
+      </w:pPr>
+      <w:r>
+        <w:rPr>
+          <w:rFonts w:cs="Times New Roman"/>
+        </w:rPr>
+        <w:t xml:space="preserve">Relay merupakan perangkat aktuator yang digunakan dalam sistem otomasi dan </w:t>
+      </w:r>
+      <w:r>
+        <w:rPr>
+          <w:rFonts w:cs="Times New Roman"/>
+          <w:i/>
+          <w:iCs/>
+        </w:rPr>
+        <w:t>Internet of Things</w:t>
+      </w:r>
+      <w:r>
+        <w:rPr>
+          <w:rFonts w:cs="Times New Roman"/>
+        </w:rPr>
+        <w:t xml:space="preserve"> (IoT) untuk mengendalikan perangkat listrik berdaya besar menggunakan sinyal kendali berdaya rendah dari mikrokontroler. Relay berfungsi sebagai penghubung antara rangkaian tegangan rendah dan beban listrik bertegangan tinggi, sehingga memungkinkan pengendalian perangkat listrik secara aman tanpa menghubungkan mikrokontroler secara langsung ke sumber listrik (Nireekshana et al., 2025: 5). Hal ini sejalan dengan penjelasan Nireekshana et al. (2025) yang menyatakan bahwa: </w:t>
+      </w:r>
+      <w:r>
+        <w:rPr>
+          <w:rFonts w:cs="Times New Roman"/>
+          <w:i/>
+          <w:iCs/>
+        </w:rPr>
+        <w:t xml:space="preserve">“A Relay Module is an electrically operated switch that allows a low-power control signal (like from an Arduino or other microcontroller) to control a high-power device, such as a bulb, fan, motor, or AC appliance.” (Nireekshana et al., 2025: 5) </w:t>
+      </w:r>
+    </w:p>
+    <w:p>
+      <w:pPr>
+        <w:pStyle w:val="NoSpacing"/>
+        <w:ind w:left="720"/>
+        <w:jc w:val="both"/>
+        <w:rPr>
+          <w:rFonts w:cs="Times New Roman"/>
+        </w:rPr>
+      </w:pPr>
+    </w:p>
+    <w:p>
+      <w:pPr>
+        <w:pStyle w:val="NoSpacing"/>
+        <w:ind w:left="720"/>
+        <w:jc w:val="both"/>
+        <w:rPr>
+          <w:rFonts w:cs="Times New Roman"/>
+        </w:rPr>
+      </w:pPr>
+      <w:r>
+        <w:rPr>
+          <w:rFonts w:cs="Times New Roman"/>
+        </w:rPr>
+        <w:t>Relay bekerja berdasarkan prinsip elektromagnetik, di mana sinyal digital dari mikrokontroler akan mengaktifkan kumparan relay sehingga menyebabkan perubahan posisi kontak saklar. Perubahan ini memungkinkan aliran listrik pada sisi beban berpindah dari kondisi terbuka (</w:t>
+      </w:r>
+      <w:r>
+        <w:rPr>
+          <w:rFonts w:cs="Times New Roman"/>
+          <w:i/>
+          <w:iCs/>
+        </w:rPr>
+        <w:t>normally open</w:t>
+      </w:r>
+      <w:r>
+        <w:rPr>
+          <w:rFonts w:cs="Times New Roman"/>
+        </w:rPr>
+        <w:t>) ke tertutup (</w:t>
+      </w:r>
+      <w:r>
+        <w:rPr>
+          <w:rFonts w:cs="Times New Roman"/>
+          <w:i/>
+          <w:iCs/>
+        </w:rPr>
+        <w:t>normally closed</w:t>
+      </w:r>
+      <w:r>
+        <w:rPr>
+          <w:rFonts w:cs="Times New Roman"/>
+        </w:rPr>
+        <w:t>), atau sebaliknya. Dengan mekanisme tersebut, relay dapat digunakan untuk menyalakan maupun mematikan perangkat listrik seperti lampu dan kipas angina (Nireekshana et al., 2025: 5).</w:t>
+      </w:r>
+    </w:p>
+    <w:p>
+      <w:pPr>
+        <w:pStyle w:val="NoSpacing"/>
+        <w:ind w:left="720"/>
+        <w:jc w:val="both"/>
+        <w:rPr>
+          <w:rFonts w:cs="Times New Roman"/>
+        </w:rPr>
+      </w:pPr>
+    </w:p>
+    <w:p>
+      <w:pPr>
+        <w:spacing w:line="480" w:lineRule="auto"/>
+        <w:ind w:firstLine="720"/>
+        <w:jc w:val="both"/>
+        <w:rPr>
+          <w:color w:val="000000" w:themeColor="text1"/>
+        </w:rPr>
+      </w:pPr>
+      <w:r>
+        <w:rPr>
+          <w:color w:val="000000" w:themeColor="text1"/>
+        </w:rPr>
+        <w:t xml:space="preserve">Dalam konteks sistem </w:t>
+      </w:r>
+      <w:r>
+        <w:rPr>
+          <w:i/>
+          <w:iCs/>
+          <w:color w:val="000000" w:themeColor="text1"/>
+        </w:rPr>
+        <w:t>Internet of Things</w:t>
+      </w:r>
+      <w:r>
+        <w:rPr>
+          <w:color w:val="000000" w:themeColor="text1"/>
+        </w:rPr>
+        <w:t xml:space="preserve">, relay berperan sebagai aktuator yang menjembatani proses pengambilan keputusan sistem dengan tindakan fisik terhadap lingkungan. Pada sistem otomasi berbasis IoT, relay memungkinkan perangkat digital mengendalikan peralatan listrik secara langsung dan real-time. Nireekshana et al. (2025) juga menegaskan peran relay sebagai penghubung antara sistem kendali dan beban listrik, yaitu: </w:t>
+      </w:r>
+      <w:r>
+        <w:rPr>
+          <w:i/>
+          <w:iCs/>
+          <w:color w:val="000000" w:themeColor="text1"/>
+        </w:rPr>
+        <w:t xml:space="preserve">“It acts as a bridge between low-voltage digital circuits and high-voltage electrical loads, making it an essential component in IoT-based smart home automation articles.” (Nireekshana et al., 2025: 5) </w:t>
+      </w:r>
+    </w:p>
+    <w:p>
+      <w:pPr>
+        <w:spacing w:line="480" w:lineRule="auto"/>
+        <w:ind w:firstLine="720"/>
+        <w:jc w:val="both"/>
+        <w:rPr>
+          <w:color w:val="000000" w:themeColor="text1"/>
+        </w:rPr>
+      </w:pPr>
+      <w:r>
+        <w:rPr>
+          <w:color w:val="000000" w:themeColor="text1"/>
+        </w:rPr>
+        <w:t xml:space="preserve">Relay </w:t>
+      </w:r>
+      <w:r>
+        <w:rPr>
+          <w:i/>
+          <w:iCs/>
+          <w:color w:val="000000" w:themeColor="text1"/>
+        </w:rPr>
+        <w:t>module</w:t>
+      </w:r>
+      <w:r>
+        <w:rPr>
+          <w:color w:val="000000" w:themeColor="text1"/>
+        </w:rPr>
+        <w:t xml:space="preserve"> 2 </w:t>
+      </w:r>
+      <w:r>
+        <w:rPr>
+          <w:i/>
+          <w:iCs/>
+          <w:color w:val="000000" w:themeColor="text1"/>
+        </w:rPr>
+        <w:t>channel</w:t>
+      </w:r>
+      <w:r>
+        <w:rPr>
+          <w:color w:val="000000" w:themeColor="text1"/>
+        </w:rPr>
+        <w:t xml:space="preserve"> memiliki dua kanal keluaran yang dapat dikendalikan secara independen. Setiap kanal memungkinkan pengendalian satu perangkat listrik, sehingga modul ini sangat sesuai digunakan pada sistem yang </w:t>
+      </w:r>
+      <w:r>
+        <w:rPr>
+          <w:color w:val="000000" w:themeColor="text1"/>
+        </w:rPr>
+        <w:lastRenderedPageBreak/>
+        <w:t>membutuhkan kontrol lebih dari satu beban secara bersamaan, seperti lampu dan kipas angin dalam satu ruangan.</w:t>
+      </w:r>
+    </w:p>
+    <w:p>
+      <w:pPr>
+        <w:spacing w:line="480" w:lineRule="auto"/>
+        <w:ind w:firstLine="720"/>
+        <w:jc w:val="both"/>
+        <w:rPr>
+          <w:i/>
+          <w:iCs/>
+          <w:color w:val="000000" w:themeColor="text1"/>
+        </w:rPr>
+      </w:pPr>
+      <w:r>
+        <w:rPr>
+          <w:color w:val="000000" w:themeColor="text1"/>
+        </w:rPr>
+        <w:t xml:space="preserve">Pada implementasi sistem berbasis </w:t>
+      </w:r>
+      <w:r>
+        <w:rPr>
+          <w:color w:val="000000" w:themeColor="text1"/>
+        </w:rPr>
+        <w:t>ESP8266</w:t>
+      </w:r>
+      <w:r>
+        <w:rPr>
+          <w:color w:val="000000" w:themeColor="text1"/>
+        </w:rPr>
+        <w:t xml:space="preserve">, relay sering digunakan untuk mengendalikan perangkat listrik secara otomatis melalui jaringan internet. Penggunaan relay </w:t>
+      </w:r>
+      <w:r>
+        <w:rPr>
+          <w:i/>
+          <w:iCs/>
+          <w:color w:val="000000" w:themeColor="text1"/>
+        </w:rPr>
+        <w:t>module</w:t>
+      </w:r>
+      <w:r>
+        <w:rPr>
+          <w:color w:val="000000" w:themeColor="text1"/>
+        </w:rPr>
+        <w:t xml:space="preserve"> pada sistem </w:t>
+      </w:r>
+      <w:r>
+        <w:rPr>
+          <w:i/>
+          <w:iCs/>
+          <w:color w:val="000000" w:themeColor="text1"/>
+        </w:rPr>
+        <w:t>monitoring</w:t>
+      </w:r>
+      <w:r>
+        <w:rPr>
+          <w:color w:val="000000" w:themeColor="text1"/>
+        </w:rPr>
+        <w:t xml:space="preserve"> energi memungkinkan integrasi antara proses pemantauan dan pengendalian. Selain menampilkan data konsumsi energi, sistem juga dapat dikembangkan untuk melakukan pengendalian perangkat listrik secara otomatis atau manual melalui </w:t>
+      </w:r>
+      <w:r>
+        <w:rPr>
+          <w:i/>
+          <w:iCs/>
+          <w:color w:val="000000" w:themeColor="text1"/>
+        </w:rPr>
+        <w:t>website</w:t>
+      </w:r>
+      <w:r>
+        <w:rPr>
+          <w:color w:val="000000" w:themeColor="text1"/>
+        </w:rPr>
+        <w:t>.</w:t>
+      </w:r>
+    </w:p>
+    <w:p>
+      <w:pPr>
+        <w:spacing w:line="480" w:lineRule="auto"/>
+        <w:ind w:firstLine="720"/>
+        <w:jc w:val="both"/>
+        <w:rPr>
+          <w:color w:val="000000" w:themeColor="text1"/>
+        </w:rPr>
+      </w:pPr>
+      <w:r>
+        <w:rPr>
+          <w:color w:val="000000" w:themeColor="text1"/>
+        </w:rPr>
+        <w:t xml:space="preserve">Pada penelitian ini, relay </w:t>
+      </w:r>
+      <w:r>
+        <w:rPr>
+          <w:i/>
+          <w:iCs/>
+          <w:color w:val="000000" w:themeColor="text1"/>
+        </w:rPr>
+        <w:t>module</w:t>
+      </w:r>
+      <w:r>
+        <w:rPr>
+          <w:color w:val="000000" w:themeColor="text1"/>
+        </w:rPr>
+        <w:t xml:space="preserve"> 2 </w:t>
+      </w:r>
+      <w:r>
+        <w:rPr>
+          <w:i/>
+          <w:iCs/>
+          <w:color w:val="000000" w:themeColor="text1"/>
+        </w:rPr>
+        <w:t>channel</w:t>
+      </w:r>
+      <w:r>
+        <w:rPr>
+          <w:color w:val="000000" w:themeColor="text1"/>
+        </w:rPr>
+        <w:t xml:space="preserve"> digunakan untuk mengendalikan lampu AC 5 Watt dan kipas angin AC 20 Watt. Relay menerima sinyal kendali dari </w:t>
+      </w:r>
+      <w:r>
+        <w:rPr>
+          <w:color w:val="000000" w:themeColor="text1"/>
+        </w:rPr>
+        <w:t>ESP8266</w:t>
+      </w:r>
+      <w:r>
+        <w:rPr>
+          <w:color w:val="000000" w:themeColor="text1"/>
+        </w:rPr>
+        <w:t xml:space="preserve"> berdasarkan logika sistem dan data sensor yang diperoleh. Dengan demikian, relay </w:t>
+      </w:r>
+      <w:r>
+        <w:rPr>
+          <w:i/>
+          <w:iCs/>
+          <w:color w:val="000000" w:themeColor="text1"/>
+        </w:rPr>
+        <w:t>module</w:t>
+      </w:r>
+      <w:r>
+        <w:rPr>
+          <w:color w:val="000000" w:themeColor="text1"/>
+        </w:rPr>
+        <w:t xml:space="preserve"> 2 </w:t>
+      </w:r>
+      <w:r>
+        <w:rPr>
+          <w:i/>
+          <w:iCs/>
+          <w:color w:val="000000" w:themeColor="text1"/>
+        </w:rPr>
+        <w:t>channel</w:t>
+      </w:r>
+      <w:r>
+        <w:rPr>
+          <w:color w:val="000000" w:themeColor="text1"/>
+        </w:rPr>
+        <w:t xml:space="preserve"> berperan penting sebagai penghubung antara sistem IoT berbasis tegangan rendah dan perangkat listrik bertegangan tinggi dalam sistem </w:t>
+      </w:r>
+      <w:r>
+        <w:rPr>
+          <w:i/>
+          <w:iCs/>
+          <w:color w:val="000000" w:themeColor="text1"/>
+        </w:rPr>
+        <w:t>monitoring</w:t>
+      </w:r>
+      <w:r>
+        <w:rPr>
+          <w:color w:val="000000" w:themeColor="text1"/>
+        </w:rPr>
+        <w:t xml:space="preserve"> konsumsi energi.</w:t>
+      </w:r>
+    </w:p>
+    <w:p>
+      <w:pPr>
+        <w:pStyle w:val="Heading3"/>
+      </w:pPr>
+      <w:r>
+        <w:t xml:space="preserve">2.1.6 </w:t>
+      </w:r>
+      <w:r>
+        <w:tab/>
+        <w:t xml:space="preserve">Lampu </w:t>
+      </w:r>
+    </w:p>
+    <w:p>
+      <w:pPr>
+        <w:spacing w:line="480" w:lineRule="auto"/>
+        <w:ind w:firstLine="720"/>
+        <w:jc w:val="both"/>
+        <w:rPr>
+          <w:color w:val="000000" w:themeColor="text1"/>
+        </w:rPr>
+      </w:pPr>
+      <w:r>
+        <w:rPr>
+          <w:color w:val="000000" w:themeColor="text1"/>
+        </w:rPr>
+        <w:t xml:space="preserve">Lampu merupakan perangkat penerangan listrik yang termasuk ke dalam kategori beban resistif, yaitu beban listrik yang mengubah energi listrik menjadi energi lain seperti cahaya dan panas tanpa melibatkan komponen induktif atau kapasitif yang signifikan. Beban resistif memiliki karakteristik utama berupa arus dan tegangan yang berada pada fase yang sama, sehingga konsumsi dayanya relatif stabil selama perangkat beroperasi (Hartono et al., 2023: 61). Hal tersebut dijelaskan oleh Hartono et al. (2023) dalam Jurnal Cyclotron bahwa: “Beban resistif </w:t>
+      </w:r>
+      <w:r>
+        <w:rPr>
+          <w:color w:val="000000" w:themeColor="text1"/>
+        </w:rPr>
+        <w:lastRenderedPageBreak/>
+        <w:t xml:space="preserve">(Z = R) merupakan beban resistor murni, dimana energi listrik diubah menjadi energi panas atau mekanik dan beban ini menyerap daya semu yang seluruhnya diubah menjadi daya aktif.” (Hartono et al., 2023: 61) </w:t>
+      </w:r>
+    </w:p>
+    <w:p>
+      <w:pPr>
+        <w:spacing w:line="480" w:lineRule="auto"/>
+        <w:ind w:firstLine="720"/>
+        <w:jc w:val="both"/>
+        <w:rPr>
+          <w:color w:val="000000" w:themeColor="text1"/>
+        </w:rPr>
+      </w:pPr>
+      <w:r>
+        <w:rPr>
+          <w:color w:val="000000" w:themeColor="text1"/>
+        </w:rPr>
+        <w:t>Lampu berdaya rendah seperti lampu AC 5 Watt banyak digunakan pada bangunan umum karena memiliki efisiensi energi yang tinggi serta konsumsi daya yang relatif kecil. Penggunaan lampu dengan daya rendah bertujuan untuk menekan konsumsi energi listrik tanpa mengurangi fungsi utama sebagai penerangan. Oleh karena itu, lampu sering dijadikan objek pengujian dalam penelitian monitoring konsumsi energi listrik (Wulandari &amp; Surantha, 2024: 3).</w:t>
+      </w:r>
+    </w:p>
+    <w:p>
+      <w:pPr>
+        <w:spacing w:line="480" w:lineRule="auto"/>
+        <w:ind w:firstLine="720"/>
+        <w:jc w:val="both"/>
+        <w:rPr>
+          <w:color w:val="000000" w:themeColor="text1"/>
+        </w:rPr>
+      </w:pPr>
+      <w:r>
+        <w:rPr>
+          <w:color w:val="000000" w:themeColor="text1"/>
+        </w:rPr>
+        <w:t xml:space="preserve">Dalam penelitian monitoring konsumsi energi berbasis Internet of Things, Wulandari dan Surantha (2024) menyebutkan bahwa lampu merupakan salah satu beban listrik yang umum dimonitor karena karakteristik konsumsi dayanya yang stabil dan mudah dianalisis: </w:t>
+      </w:r>
+      <w:r>
+        <w:rPr>
+          <w:i/>
+          <w:iCs/>
+          <w:color w:val="000000" w:themeColor="text1"/>
+        </w:rPr>
+        <w:t xml:space="preserve">“Electronic home appliances that will be monitored are air conditioner, water heater, washing machine, rice cooker, refrigerator, laptop, dispenser, iron, fan, and lamp.” (Wulandari &amp; Surantha, 2024: 3) </w:t>
+      </w:r>
+    </w:p>
+    <w:p>
+      <w:pPr>
+        <w:spacing w:line="480" w:lineRule="auto"/>
+        <w:ind w:firstLine="720"/>
+        <w:jc w:val="both"/>
+        <w:rPr>
+          <w:color w:val="000000" w:themeColor="text1"/>
+        </w:rPr>
+      </w:pPr>
+      <w:r>
+        <w:rPr>
+          <w:color w:val="000000" w:themeColor="text1"/>
+        </w:rPr>
+        <w:t>Karakteristik konsumsi daya yang stabil pada lampu AC memudahkan proses pengukuran energi listrik menggunakan sensor arus dan daya. Data daya dan energi yang diperoleh dari lampu dapat digunakan sebagai pembanding dalam analisis konsumsi energi dengan perangkat lain yang memiliki karakteristik beban berbeda, seperti kipas angin yang termasuk beban induktif (Hartono et al., 2023: 64).</w:t>
+      </w:r>
+    </w:p>
+    <w:p>
+      <w:pPr>
+        <w:spacing w:line="480" w:lineRule="auto"/>
+        <w:ind w:firstLine="720"/>
+        <w:jc w:val="both"/>
+        <w:rPr>
+          <w:color w:val="000000" w:themeColor="text1"/>
+        </w:rPr>
+      </w:pPr>
+      <w:r>
+        <w:rPr>
+          <w:color w:val="000000" w:themeColor="text1"/>
+        </w:rPr>
+        <w:lastRenderedPageBreak/>
+        <w:t xml:space="preserve">Pada pengujian sistem monitoring daya listrik berbasis IoT, Hartono et al. (2023) menggunakan lampu sebagai representasi beban resistif dan memperoleh hasil pengukuran yang konsisten, sebagaimana ditunjukkan pada pengujian beban resistif menggunakan lampu LED:“Hasil pengujian AMPD terhadap beban resistif yang disimulasikan oleh lampu LED memberikan angka prediksi secara real-time dengan penunjukkan angka prediksi yang mendekati dengan jumlah daya aktual pada prediksi kebutuhan energi dan mendekati jumlah biaya aktual pada prediksi biaya energi untuk beban resistif.” (Hartono et al., 2023: 64) </w:t>
+      </w:r>
+    </w:p>
+    <w:p>
+      <w:pPr>
+        <w:spacing w:line="480" w:lineRule="auto"/>
+        <w:ind w:firstLine="720"/>
+        <w:jc w:val="both"/>
+        <w:rPr>
+          <w:color w:val="000000" w:themeColor="text1"/>
+        </w:rPr>
+      </w:pPr>
+      <w:r>
+        <w:rPr>
+          <w:color w:val="000000" w:themeColor="text1"/>
+        </w:rPr>
+        <w:t xml:space="preserve">Dalam konteks sistem Internet of Things, lampu juga dapat diintegrasikan dengan perangkat kendali seperti relay untuk memungkinkan pengoperasian dan pemantauan secara otomatis. Integrasi lampu dengan sistem IoT memungkinkan pengumpulan data konsumsi energi secara </w:t>
+      </w:r>
+      <w:r>
+        <w:rPr>
+          <w:i/>
+          <w:iCs/>
+          <w:color w:val="000000" w:themeColor="text1"/>
+        </w:rPr>
+        <w:t>real-time</w:t>
+      </w:r>
+      <w:r>
+        <w:rPr>
+          <w:color w:val="000000" w:themeColor="text1"/>
+        </w:rPr>
+        <w:t xml:space="preserve"> dan penyajian informasi melalui </w:t>
+      </w:r>
+      <w:r>
+        <w:rPr>
+          <w:i/>
+          <w:iCs/>
+          <w:color w:val="000000" w:themeColor="text1"/>
+        </w:rPr>
+        <w:t>website</w:t>
+      </w:r>
+      <w:r>
+        <w:rPr>
+          <w:color w:val="000000" w:themeColor="text1"/>
+        </w:rPr>
+        <w:t>, sehingga mendukung evaluasi efisiensi penggunaan energi listrik pada bangunan.</w:t>
+      </w:r>
+    </w:p>
+    <w:p>
+      <w:pPr>
+        <w:spacing w:line="480" w:lineRule="auto"/>
+        <w:ind w:firstLine="720"/>
+        <w:jc w:val="both"/>
+        <w:rPr>
+          <w:color w:val="000000" w:themeColor="text1"/>
+        </w:rPr>
+      </w:pPr>
+      <w:r>
+        <w:rPr>
+          <w:color w:val="000000" w:themeColor="text1"/>
+        </w:rPr>
+        <w:t xml:space="preserve">Pada penelitian ini, lampu AC 5 Watt digunakan sebagai salah satu objek beban listrik yang dimonitor menggunakan sensor PZEM-004T. Data konsumsi energi dari lampu tersebut dikirimkan oleh </w:t>
+      </w:r>
+      <w:r>
+        <w:rPr>
+          <w:color w:val="000000" w:themeColor="text1"/>
+        </w:rPr>
+        <w:t>ESP8266</w:t>
+      </w:r>
+      <w:r>
+        <w:rPr>
+          <w:color w:val="000000" w:themeColor="text1"/>
+        </w:rPr>
+        <w:t xml:space="preserve"> ke </w:t>
+      </w:r>
+      <w:r>
+        <w:rPr>
+          <w:i/>
+          <w:iCs/>
+          <w:color w:val="000000" w:themeColor="text1"/>
+        </w:rPr>
+        <w:t>server</w:t>
+      </w:r>
+      <w:r>
+        <w:rPr>
+          <w:color w:val="000000" w:themeColor="text1"/>
+        </w:rPr>
+        <w:t xml:space="preserve"> untuk disimpan dan ditampilkan melalui sistem berbasis </w:t>
+      </w:r>
+      <w:r>
+        <w:rPr>
+          <w:i/>
+          <w:iCs/>
+          <w:color w:val="000000" w:themeColor="text1"/>
+        </w:rPr>
+        <w:t>web</w:t>
+      </w:r>
+      <w:r>
+        <w:rPr>
+          <w:color w:val="000000" w:themeColor="text1"/>
+        </w:rPr>
+        <w:t xml:space="preserve">. Dengan demikian, penggunaan lampu AC 5 Watt mendukung analisis konsumsi energi listrik secara akurat dan terukur dalam sistem </w:t>
+      </w:r>
+      <w:r>
+        <w:rPr>
+          <w:i/>
+          <w:iCs/>
+          <w:color w:val="000000" w:themeColor="text1"/>
+        </w:rPr>
+        <w:t>monitoring</w:t>
+      </w:r>
+      <w:r>
+        <w:rPr>
+          <w:color w:val="000000" w:themeColor="text1"/>
+        </w:rPr>
+        <w:t xml:space="preserve"> berbasis </w:t>
+      </w:r>
+      <w:r>
+        <w:rPr>
+          <w:i/>
+          <w:iCs/>
+          <w:color w:val="000000" w:themeColor="text1"/>
+        </w:rPr>
+        <w:t>Internet of Things</w:t>
+      </w:r>
+      <w:r>
+        <w:rPr>
+          <w:color w:val="000000" w:themeColor="text1"/>
+        </w:rPr>
+        <w:t>.</w:t>
+      </w:r>
+    </w:p>
+    <w:p>
+      <w:pPr>
+        <w:pStyle w:val="Heading3"/>
+      </w:pPr>
+      <w:r>
+        <w:lastRenderedPageBreak/>
+        <w:t xml:space="preserve">2.1.7 </w:t>
+      </w:r>
+      <w:r>
+        <w:tab/>
+        <w:t xml:space="preserve">Kipas Angin </w:t>
+      </w:r>
+    </w:p>
+    <w:p>
+      <w:pPr>
+        <w:pStyle w:val="NoSpacing"/>
+        <w:ind w:left="720"/>
+        <w:jc w:val="both"/>
+        <w:rPr>
+          <w:rFonts w:cs="Times New Roman"/>
+          <w:color w:val="000000" w:themeColor="text1"/>
+        </w:rPr>
+      </w:pPr>
+      <w:r>
+        <w:rPr>
+          <w:rFonts w:cs="Times New Roman"/>
+          <w:color w:val="000000" w:themeColor="text1"/>
+        </w:rPr>
+        <w:t>Karakteristik konsumsi daya pada kipas angin menunjukkan sifat beban induktif, di mana konsumsi arus dan daya tidak bersifat konstan selama perangkat beroperasi. Hal ini disebabkan oleh adanya motor listrik pada kipas angin yang bekerja secara elektromagnetik, sehingga nilai daya dapat berubah sesuai dengan kondisi kerja motor. Kondisi ini menjadikan kipas angin memiliki karakteristik konsumsi energi yang berbeda dibandingkan dengan beban resistif (Setiati et al., 2023: 56).</w:t>
+      </w:r>
+    </w:p>
+    <w:p>
+      <w:pPr>
+        <w:pStyle w:val="NoSpacing"/>
+        <w:ind w:left="567"/>
+        <w:jc w:val="both"/>
+        <w:rPr>
+          <w:rFonts w:cs="Times New Roman"/>
+          <w:color w:val="000000" w:themeColor="text1"/>
+        </w:rPr>
+      </w:pPr>
+    </w:p>
+    <w:p>
+      <w:pPr>
+        <w:spacing w:line="480" w:lineRule="auto"/>
+        <w:ind w:firstLine="720"/>
+        <w:jc w:val="both"/>
+        <w:rPr>
+          <w:color w:val="000000" w:themeColor="text1"/>
+        </w:rPr>
+      </w:pPr>
+      <w:r>
+        <w:rPr>
+          <w:color w:val="000000" w:themeColor="text1"/>
+        </w:rPr>
+        <w:t>Hal tersebut sejalan dengan penelitian Setiati et al. yang menyatakan bahwa kipas angin merupakan perangkat berbasis motor listrik yang bekerja secara terus-menerus dan dapat menimbulkan panas berlebih apabila tidak dikendalikan dengan baik, yang menunjukkan adanya karakteristik kerja beban induktif pada perangkat tersebut:</w:t>
+      </w:r>
+    </w:p>
+    <w:p>
+      <w:pPr>
+        <w:ind w:left="720"/>
+        <w:jc w:val="both"/>
+        <w:rPr>
+          <w:color w:val="000000" w:themeColor="text1"/>
+        </w:rPr>
+      </w:pPr>
+      <w:r>
+        <w:rPr>
+          <w:color w:val="000000" w:themeColor="text1"/>
+        </w:rPr>
+        <w:t>“Kipas angin adalah perangkat elektronik konvensional yang sering dipergunakan sebagai pengatur sirkulasi udara pada saat cuaca panas. Konsumsi energi listrik yang rendah, harga yang terjangkau, tidak memerlukan instalasi khusus dan mudah dipindahkan (</w:t>
+      </w:r>
+      <w:r>
+        <w:rPr>
+          <w:i/>
+          <w:iCs/>
+          <w:color w:val="000000" w:themeColor="text1"/>
+        </w:rPr>
+        <w:t>portable</w:t>
+      </w:r>
+      <w:r>
+        <w:rPr>
+          <w:color w:val="000000" w:themeColor="text1"/>
+        </w:rPr>
+        <w:t>) menjadi alasan utama alat ini untuk dipertahankan penggunaanya. Permasalahan yang sering muncul adalah kebakaran karena kipas angin terus menyala ketika sudah tidak diperlukan.” (Setiati et al., 2023: 56)</w:t>
+      </w:r>
+    </w:p>
+    <w:p>
+      <w:pPr>
+        <w:spacing w:line="480" w:lineRule="auto"/>
+        <w:ind w:firstLine="720"/>
+        <w:jc w:val="both"/>
+        <w:rPr>
+          <w:color w:val="000000" w:themeColor="text1"/>
+        </w:rPr>
+      </w:pPr>
+      <w:r>
+        <w:rPr>
+          <w:color w:val="000000" w:themeColor="text1"/>
+        </w:rPr>
+        <w:t xml:space="preserve">Kipas angin banyak digunakan pada bangunan umum, termasuk </w:t>
+      </w:r>
+      <w:r>
+        <w:rPr>
+          <w:color w:val="000000" w:themeColor="text1"/>
+        </w:rPr>
+        <w:t>Musala</w:t>
+      </w:r>
+      <w:r>
+        <w:rPr>
+          <w:color w:val="000000" w:themeColor="text1"/>
+        </w:rPr>
+        <w:t>, sebagai perangkat sirkulasi udara untuk meningkatkan kenyamanan pengguna ruangan. Penggunaan kipas angin dengan daya relatif kecil, seperti 20 Watt, bertujuan untuk menjaga efisiensi energi sekaligus memenuhi kebutuhan pendinginan ruangan (Agil et al., 2025: 14).</w:t>
+      </w:r>
+    </w:p>
+    <w:p>
+      <w:pPr>
+        <w:spacing w:line="480" w:lineRule="auto"/>
+        <w:ind w:firstLine="720"/>
+        <w:jc w:val="both"/>
+        <w:rPr>
+          <w:color w:val="000000" w:themeColor="text1"/>
+        </w:rPr>
+      </w:pPr>
+      <w:r>
+        <w:rPr>
+          <w:color w:val="000000" w:themeColor="text1"/>
+        </w:rPr>
+        <w:t xml:space="preserve">Dalam penelitian monitoring energi listrik berbasis IoT, dijelaskan bahwa beban induktif memiliki pola konsumsi daya yang tidak konstan. Hal ini dinyatakan sebagai berikut: </w:t>
+      </w:r>
+      <w:r>
+        <w:rPr>
+          <w:i/>
+          <w:iCs/>
+          <w:color w:val="000000" w:themeColor="text1"/>
+        </w:rPr>
+        <w:t xml:space="preserve">“Unlike resistive or stable inductive loads, the refrigerator’s motor </w:t>
+      </w:r>
+      <w:r>
+        <w:rPr>
+          <w:i/>
+          <w:iCs/>
+          <w:color w:val="000000" w:themeColor="text1"/>
+        </w:rPr>
+        <w:lastRenderedPageBreak/>
+        <w:t xml:space="preserve">introduces transient variations that the PZEM-004T sensor captures with some lag compared to the reference wattmeter.” (Agil et al., 2025: 14) </w:t>
+      </w:r>
+    </w:p>
+    <w:p>
+      <w:pPr>
+        <w:spacing w:line="480" w:lineRule="auto"/>
+        <w:ind w:firstLine="720"/>
+        <w:jc w:val="both"/>
+        <w:rPr>
+          <w:color w:val="000000" w:themeColor="text1"/>
+        </w:rPr>
+      </w:pPr>
+      <w:r>
+        <w:rPr>
+          <w:color w:val="000000" w:themeColor="text1"/>
+        </w:rPr>
+        <w:t>Karakteristik beban induktif pada kipas angin juga menyebabkan nilai faktor daya (</w:t>
+      </w:r>
+      <w:r>
+        <w:rPr>
+          <w:i/>
+          <w:iCs/>
+          <w:color w:val="000000" w:themeColor="text1"/>
+        </w:rPr>
+        <w:t>power factor</w:t>
+      </w:r>
+      <w:r>
+        <w:rPr>
+          <w:color w:val="000000" w:themeColor="text1"/>
+        </w:rPr>
+        <w:t>) menjadi lebih rendah dibandingkan beban resistif. Faktor daya yang rendah menunjukkan adanya daya reaktif yang cukup besar, sehingga mempengaruhi efisiensi penggunaan energi listrik. Oleh karena itu, analisis konsumsi energi pada kipas angin tidak hanya memperhatikan daya aktif, tetapi juga parameter faktor daya (Agustiarmi et al., 2025: 1411).</w:t>
+      </w:r>
+    </w:p>
+    <w:p>
+      <w:pPr>
+        <w:spacing w:line="480" w:lineRule="auto"/>
+        <w:ind w:firstLine="720"/>
+        <w:jc w:val="both"/>
+        <w:rPr>
+          <w:color w:val="000000" w:themeColor="text1"/>
+        </w:rPr>
+      </w:pPr>
+      <w:r>
+        <w:rPr>
+          <w:color w:val="000000" w:themeColor="text1"/>
+        </w:rPr>
+        <w:t xml:space="preserve">Dalam penelitian monitoring energi listrik berbasis IoT yang dilakukan oleh Agustiarmi et al. (2025) disebutkan bahwa beban induktif seperti kipas angin memiliki nilai faktor daya yang relatif rendah sebelum dilakukan perbaikan: </w:t>
+      </w:r>
+      <w:r>
+        <w:rPr>
+          <w:i/>
+          <w:iCs/>
+          <w:color w:val="000000" w:themeColor="text1"/>
+        </w:rPr>
+        <w:t xml:space="preserve">“In the fan load, the power factor value increases from 0.58 to 0.93 after power factor improvement.” (Agustiarmi et al., 2025: 1411) </w:t>
+      </w:r>
+    </w:p>
+    <w:p>
+      <w:pPr>
+        <w:spacing w:line="480" w:lineRule="auto"/>
+        <w:ind w:firstLine="720"/>
+        <w:jc w:val="both"/>
+        <w:rPr>
+          <w:color w:val="000000" w:themeColor="text1"/>
+        </w:rPr>
+      </w:pPr>
+      <w:r>
+        <w:rPr>
+          <w:color w:val="000000" w:themeColor="text1"/>
+        </w:rPr>
+        <w:t xml:space="preserve">Kondisi tersebut menunjukkan bahwa kipas angin memiliki daya reaktif yang signifikan sehingga membutuhkan pemantauan parameter listrik secara menyeluruh. Oleh karena itu, pengukuran konsumsi energi pada kipas angin memerlukan sensor yang mampu melakukan pembacaan secara </w:t>
+      </w:r>
+      <w:r>
+        <w:rPr>
+          <w:i/>
+          <w:iCs/>
+          <w:color w:val="000000" w:themeColor="text1"/>
+        </w:rPr>
+        <w:t>real-time</w:t>
+      </w:r>
+      <w:r>
+        <w:rPr>
+          <w:color w:val="000000" w:themeColor="text1"/>
+        </w:rPr>
+        <w:t xml:space="preserve"> dan akurat, khususnya untuk parameter arus, daya, dan faktor daya (Agustiarmi et al., 2025: 1407).</w:t>
+      </w:r>
+    </w:p>
+    <w:p>
+      <w:pPr>
+        <w:spacing w:line="480" w:lineRule="auto"/>
+        <w:ind w:firstLine="720"/>
+        <w:jc w:val="both"/>
+        <w:rPr>
+          <w:color w:val="000000" w:themeColor="text1"/>
+        </w:rPr>
+      </w:pPr>
+      <w:r>
+        <w:rPr>
+          <w:color w:val="000000" w:themeColor="text1"/>
+        </w:rPr>
+        <w:t xml:space="preserve">Agustiarmi et al. (2025) juga menegaskan bahwa sistem monitoring energi berbasis IoT dengan sensor PZEM-004T mampu melakukan pengukuran parameter listrik secara </w:t>
+      </w:r>
+      <w:r>
+        <w:rPr>
+          <w:i/>
+          <w:iCs/>
+          <w:color w:val="000000" w:themeColor="text1"/>
+        </w:rPr>
+        <w:t>real-time</w:t>
+      </w:r>
+      <w:r>
+        <w:rPr>
+          <w:color w:val="000000" w:themeColor="text1"/>
+        </w:rPr>
+        <w:t xml:space="preserve">, termasuk faktor daya, sehingga sesuai untuk analisis beban </w:t>
+      </w:r>
+      <w:r>
+        <w:rPr>
+          <w:color w:val="000000" w:themeColor="text1"/>
+        </w:rPr>
+        <w:lastRenderedPageBreak/>
+        <w:t xml:space="preserve">induktif: </w:t>
+      </w:r>
+      <w:r>
+        <w:rPr>
+          <w:i/>
+          <w:iCs/>
+          <w:color w:val="000000" w:themeColor="text1"/>
+        </w:rPr>
+        <w:t xml:space="preserve">“This prototype uses a PZEM-004T sensor to measure electrical parameters, including Voltage, Current, Power, Frequency, Energy, and Power Factor.” (Agustiarmi et al., 2025: 1407) </w:t>
+      </w:r>
+    </w:p>
+    <w:p>
+      <w:pPr>
+        <w:spacing w:line="480" w:lineRule="auto"/>
+        <w:ind w:firstLine="720"/>
+        <w:jc w:val="both"/>
+        <w:rPr>
+          <w:color w:val="000000" w:themeColor="text1"/>
+        </w:rPr>
+      </w:pPr>
+      <w:r>
+        <w:rPr>
+          <w:color w:val="000000" w:themeColor="text1"/>
+        </w:rPr>
+        <w:t xml:space="preserve">Pada sistem </w:t>
+      </w:r>
+      <w:r>
+        <w:rPr>
+          <w:i/>
+          <w:iCs/>
+          <w:color w:val="000000" w:themeColor="text1"/>
+        </w:rPr>
+        <w:t>monitoring</w:t>
+      </w:r>
+      <w:r>
+        <w:rPr>
+          <w:color w:val="000000" w:themeColor="text1"/>
+        </w:rPr>
+        <w:t xml:space="preserve"> konsumsi energi yang dirancang, kipas angin AC 20 Watt digunakan sebagai objek pengujian beban induktif. Data konsumsi energi yang diperoleh dari kipas angin dibandingkan dengan data dari lampu AC 5 Watt yang merupakan beban resistif, sehingga dapat dianalisis perbedaan karakteristik konsumsi energi antara beban induktif dan beban resistif. Dengan pendekatan ini, sistem </w:t>
+      </w:r>
+      <w:r>
+        <w:rPr>
+          <w:i/>
+          <w:iCs/>
+          <w:color w:val="000000" w:themeColor="text1"/>
+        </w:rPr>
+        <w:t>monitoring</w:t>
+      </w:r>
+      <w:r>
+        <w:rPr>
+          <w:color w:val="000000" w:themeColor="text1"/>
+        </w:rPr>
+        <w:t xml:space="preserve"> mampu memberikan gambaran yang lebih komprehensif mengenai pola penggunaan energi listrik pada perangkat dengan karakteristik beban yang berbeda.</w:t>
+      </w:r>
+    </w:p>
+    <w:p>
+      <w:pPr>
+        <w:spacing w:line="480" w:lineRule="auto"/>
+        <w:ind w:firstLine="720"/>
+        <w:jc w:val="both"/>
+        <w:rPr>
+          <w:color w:val="000000" w:themeColor="text1"/>
+        </w:rPr>
+      </w:pPr>
+      <w:r>
+        <w:rPr>
+          <w:color w:val="000000" w:themeColor="text1"/>
+        </w:rPr>
+        <w:t xml:space="preserve">Dalam penelitian ini, kipas angin AC 20 Watt dimonitor menggunakan sensor PZEM-004T yang terhubung ke </w:t>
+      </w:r>
+      <w:r>
+        <w:rPr>
+          <w:color w:val="000000" w:themeColor="text1"/>
+        </w:rPr>
+        <w:t>ESP8266</w:t>
+      </w:r>
+      <w:r>
+        <w:rPr>
+          <w:color w:val="000000" w:themeColor="text1"/>
+        </w:rPr>
+        <w:t xml:space="preserve">. Data tegangan, arus, daya, energi, dan faktor daya dikirimkan ke </w:t>
+      </w:r>
+      <w:r>
+        <w:rPr>
+          <w:i/>
+          <w:iCs/>
+          <w:color w:val="000000" w:themeColor="text1"/>
+        </w:rPr>
+        <w:t>server</w:t>
+      </w:r>
+      <w:r>
+        <w:rPr>
+          <w:color w:val="000000" w:themeColor="text1"/>
+        </w:rPr>
+        <w:t xml:space="preserve"> untuk disimpan dan ditampilkan melalui </w:t>
+      </w:r>
+      <w:r>
+        <w:rPr>
+          <w:i/>
+          <w:iCs/>
+          <w:color w:val="000000" w:themeColor="text1"/>
+        </w:rPr>
+        <w:t>website</w:t>
+      </w:r>
+      <w:r>
+        <w:rPr>
+          <w:color w:val="000000" w:themeColor="text1"/>
+        </w:rPr>
+        <w:t xml:space="preserve">. Dengan demikian, penggunaan kipas angin AC 20 Watt mendukung analisis konsumsi energi listrik secara lebih komprehensif dalam sistem monitoring berbasis </w:t>
+      </w:r>
+      <w:r>
+        <w:rPr>
+          <w:i/>
+          <w:iCs/>
+          <w:color w:val="000000" w:themeColor="text1"/>
+        </w:rPr>
+        <w:t>Internet of Things</w:t>
+      </w:r>
+      <w:r>
+        <w:rPr>
+          <w:color w:val="000000" w:themeColor="text1"/>
+        </w:rPr>
+        <w:t>.</w:t>
+      </w:r>
+    </w:p>
+    <w:p>
+      <w:pPr>
+        <w:pStyle w:val="Heading3"/>
+      </w:pPr>
+      <w:r>
+        <w:t xml:space="preserve">2.1.8 </w:t>
+      </w:r>
+      <w:r>
+        <w:tab/>
+        <w:t xml:space="preserve">Adaptor Power Supply </w:t>
+      </w:r>
+    </w:p>
+    <w:p>
+      <w:pPr>
+        <w:spacing w:line="480" w:lineRule="auto"/>
+        <w:ind w:firstLine="720"/>
+        <w:jc w:val="both"/>
+        <w:rPr>
+          <w:color w:val="000000" w:themeColor="text1"/>
+        </w:rPr>
+      </w:pPr>
+      <w:r>
+        <w:rPr>
+          <w:i/>
+          <w:iCs/>
+          <w:color w:val="000000" w:themeColor="text1"/>
+        </w:rPr>
+        <w:t>Adaptor power supply</w:t>
+      </w:r>
+      <w:r>
+        <w:rPr>
+          <w:color w:val="000000" w:themeColor="text1"/>
+        </w:rPr>
+        <w:t xml:space="preserve"> merupakan perangkat catu daya yang berfungsi untuk menyuplai tegangan searah (DC) ke seluruh komponen sistem, khususnya mikrokontroler dan modul pendukung. Dalam sistem berbasis </w:t>
+      </w:r>
+      <w:r>
+        <w:rPr>
+          <w:i/>
+          <w:iCs/>
+          <w:color w:val="000000" w:themeColor="text1"/>
+        </w:rPr>
+        <w:t>Internet of Things</w:t>
+      </w:r>
+      <w:r>
+        <w:rPr>
+          <w:color w:val="000000" w:themeColor="text1"/>
+        </w:rPr>
+        <w:t xml:space="preserve"> (IoT), keberadaan catu daya yang stabil menjadi faktor penting karena seluruh </w:t>
+      </w:r>
+      <w:r>
+        <w:rPr>
+          <w:color w:val="000000" w:themeColor="text1"/>
+        </w:rPr>
+        <w:lastRenderedPageBreak/>
+        <w:t>proses pengolahan data, komunikasi jaringan, serta pengendalian perangkat sangat bergantung pada kontinuitas dan kestabilan suplai daya (Tristiantoro et al., 2025: 67).</w:t>
+      </w:r>
+    </w:p>
+    <w:p>
+      <w:pPr>
+        <w:spacing w:line="480" w:lineRule="auto"/>
+        <w:ind w:firstLine="720"/>
+        <w:jc w:val="both"/>
+        <w:rPr>
+          <w:color w:val="000000" w:themeColor="text1"/>
+        </w:rPr>
+      </w:pPr>
+      <w:r>
+        <w:rPr>
+          <w:color w:val="000000" w:themeColor="text1"/>
+        </w:rPr>
+        <w:t xml:space="preserve">Pada sistem berbasis mikrokontroler </w:t>
+      </w:r>
+      <w:r>
+        <w:rPr>
+          <w:color w:val="000000" w:themeColor="text1"/>
+        </w:rPr>
+        <w:t>ESP8266</w:t>
+      </w:r>
+      <w:r>
+        <w:rPr>
+          <w:color w:val="000000" w:themeColor="text1"/>
+        </w:rPr>
+        <w:t xml:space="preserve">, </w:t>
+      </w:r>
+      <w:r>
+        <w:rPr>
+          <w:i/>
+          <w:iCs/>
+          <w:color w:val="000000" w:themeColor="text1"/>
+        </w:rPr>
+        <w:t>adaptor power supply</w:t>
+      </w:r>
+      <w:r>
+        <w:rPr>
+          <w:color w:val="000000" w:themeColor="text1"/>
+        </w:rPr>
+        <w:t xml:space="preserve"> digunakan untuk menyediakan tegangan DC 5 volt yang digunakan oleh mikrokontroler, sensor, dan modul relay. Hal ini ditegaskan dalam penelitian Tristiantoro et al. (2025) yang menyatakan bahwa: </w:t>
+      </w:r>
+      <w:r>
+        <w:rPr>
+          <w:i/>
+          <w:iCs/>
+          <w:color w:val="000000" w:themeColor="text1"/>
+        </w:rPr>
+        <w:t xml:space="preserve">“Power Supply Unit provides stable 5 V DC regulated power for the </w:t>
+      </w:r>
+      <w:r>
+        <w:rPr>
+          <w:i/>
+          <w:iCs/>
+          <w:color w:val="000000" w:themeColor="text1"/>
+        </w:rPr>
+        <w:t>ESP8266</w:t>
+      </w:r>
+      <w:r>
+        <w:rPr>
+          <w:i/>
+          <w:iCs/>
+          <w:color w:val="000000" w:themeColor="text1"/>
+        </w:rPr>
+        <w:t>, sensor, and relays.” (Tristiantoro et al., 2025: 67)</w:t>
+      </w:r>
+    </w:p>
+    <w:p>
+      <w:pPr>
+        <w:spacing w:line="480" w:lineRule="auto"/>
+        <w:ind w:firstLine="720"/>
+        <w:jc w:val="both"/>
+        <w:rPr>
+          <w:color w:val="000000" w:themeColor="text1"/>
+        </w:rPr>
+      </w:pPr>
+      <w:r>
+        <w:rPr>
+          <w:color w:val="000000" w:themeColor="text1"/>
+        </w:rPr>
+        <w:t xml:space="preserve">Kutipan tersebut menunjukkan bahwa </w:t>
+      </w:r>
+      <w:r>
+        <w:rPr>
+          <w:i/>
+          <w:iCs/>
+          <w:color w:val="000000" w:themeColor="text1"/>
+        </w:rPr>
+        <w:t>power supply</w:t>
+      </w:r>
+      <w:r>
+        <w:rPr>
+          <w:color w:val="000000" w:themeColor="text1"/>
+        </w:rPr>
+        <w:t xml:space="preserve"> tidak hanya berfungsi sebagai sumber daya, tetapi juga sebagai penunjang kestabilan sistem secara keseluruhan. Tegangan yang tidak stabil dapat menyebabkan gangguan pada kinerja mikrokontroler, kesalahan pembacaan sensor, serta kegagalan aktuator dalam mengendalikan beban listrik.</w:t>
+      </w:r>
+    </w:p>
+    <w:p>
+      <w:pPr>
+        <w:spacing w:line="480" w:lineRule="auto"/>
+        <w:ind w:firstLine="720"/>
+        <w:jc w:val="both"/>
+        <w:rPr>
+          <w:color w:val="000000" w:themeColor="text1"/>
+        </w:rPr>
+      </w:pPr>
+      <w:r>
+        <w:rPr>
+          <w:color w:val="000000" w:themeColor="text1"/>
+        </w:rPr>
+        <w:t xml:space="preserve">Adaptor dengan kapasitas arus yang memadai, seperti 5V 3A, dipilih untuk memastikan seluruh komponen sistem dapat beroperasi secara bersamaan tanpa mengalami kekurangan daya. Pada sistem IoT, mikrokontroler </w:t>
+      </w:r>
+      <w:r>
+        <w:rPr>
+          <w:color w:val="000000" w:themeColor="text1"/>
+        </w:rPr>
+        <w:t>ESP8266</w:t>
+      </w:r>
+      <w:r>
+        <w:rPr>
+          <w:color w:val="000000" w:themeColor="text1"/>
+        </w:rPr>
+        <w:t xml:space="preserve"> tidak hanya berfungsi sebagai pengolah data, tetapi juga sebagai perangkat komunikasi yang terhubung ke jaringan Wi-Fi, sehingga membutuhkan suplai daya yang stabil dan kontinu selama sistem beroperasi (Tristiantoro et al., 2025: 66-67).</w:t>
+      </w:r>
+    </w:p>
+    <w:p>
+      <w:pPr>
+        <w:spacing w:line="480" w:lineRule="auto"/>
+        <w:ind w:firstLine="720"/>
+        <w:jc w:val="both"/>
+        <w:rPr>
+          <w:color w:val="000000" w:themeColor="text1"/>
+        </w:rPr>
+      </w:pPr>
+      <w:r>
+        <w:rPr>
+          <w:color w:val="000000" w:themeColor="text1"/>
+        </w:rPr>
+        <w:t xml:space="preserve">Dalam implementasi sistem otomasi berbasis </w:t>
+      </w:r>
+      <w:r>
+        <w:rPr>
+          <w:color w:val="000000" w:themeColor="text1"/>
+        </w:rPr>
+        <w:t>ESP8266</w:t>
+      </w:r>
+      <w:r>
+        <w:rPr>
+          <w:color w:val="000000" w:themeColor="text1"/>
+        </w:rPr>
+        <w:t xml:space="preserve">, Tristiantoro et al. menjelaskan bahwa seluruh komponen sistem, termasuk sensor dan relay, </w:t>
+      </w:r>
+      <w:r>
+        <w:rPr>
+          <w:color w:val="000000" w:themeColor="text1"/>
+        </w:rPr>
+        <w:lastRenderedPageBreak/>
+        <w:t xml:space="preserve">memperoleh suplai daya dari satu unit </w:t>
+      </w:r>
+      <w:r>
+        <w:rPr>
+          <w:i/>
+          <w:iCs/>
+          <w:color w:val="000000" w:themeColor="text1"/>
+        </w:rPr>
+        <w:t>power supply</w:t>
+      </w:r>
+      <w:r>
+        <w:rPr>
+          <w:color w:val="000000" w:themeColor="text1"/>
+        </w:rPr>
+        <w:t xml:space="preserve"> yang sama untuk menjaga keandalan sistem: </w:t>
+      </w:r>
+      <w:r>
+        <w:rPr>
+          <w:i/>
+          <w:iCs/>
+          <w:color w:val="000000" w:themeColor="text1"/>
+        </w:rPr>
+        <w:t xml:space="preserve">“The hardware design integrates </w:t>
+      </w:r>
+      <w:r>
+        <w:rPr>
+          <w:i/>
+          <w:iCs/>
+          <w:color w:val="000000" w:themeColor="text1"/>
+        </w:rPr>
+        <w:t>ESP8266</w:t>
+      </w:r>
+      <w:r>
+        <w:rPr>
+          <w:i/>
+          <w:iCs/>
+          <w:color w:val="000000" w:themeColor="text1"/>
+        </w:rPr>
+        <w:t xml:space="preserve">, PIR sensor, relay modules, and load devices powered by a regulated power supply to ensure reliable operation.” (Tristiantoro et al., 2025: 66-67) </w:t>
+      </w:r>
+    </w:p>
+    <w:p>
+      <w:pPr>
+        <w:spacing w:line="480" w:lineRule="auto"/>
+        <w:ind w:firstLine="720"/>
+        <w:jc w:val="both"/>
+        <w:rPr>
+          <w:i/>
+          <w:iCs/>
+          <w:color w:val="000000" w:themeColor="text1"/>
+        </w:rPr>
+      </w:pPr>
+      <w:r>
+        <w:rPr>
+          <w:i/>
+          <w:iCs/>
+          <w:color w:val="000000" w:themeColor="text1"/>
+        </w:rPr>
+        <w:t>Power supply</w:t>
+      </w:r>
+      <w:r>
+        <w:rPr>
+          <w:color w:val="000000" w:themeColor="text1"/>
+        </w:rPr>
+        <w:t xml:space="preserve"> yang tidak stabil dapat menyebabkan gangguan pada proses komunikasi jaringan dan pengendalian perangkat, sehingga berpotensi mengganggu proses </w:t>
+      </w:r>
+      <w:r>
+        <w:rPr>
+          <w:i/>
+          <w:iCs/>
+          <w:color w:val="000000" w:themeColor="text1"/>
+        </w:rPr>
+        <w:t>monitoring</w:t>
+      </w:r>
+      <w:r>
+        <w:rPr>
+          <w:color w:val="000000" w:themeColor="text1"/>
+        </w:rPr>
+        <w:t xml:space="preserve"> dan otomatisasi sistem. Oleh karena itu, pemilihan </w:t>
+      </w:r>
+      <w:r>
+        <w:rPr>
+          <w:i/>
+          <w:iCs/>
+          <w:color w:val="000000" w:themeColor="text1"/>
+        </w:rPr>
+        <w:t>adaptor power supply</w:t>
+      </w:r>
+      <w:r>
+        <w:rPr>
+          <w:color w:val="000000" w:themeColor="text1"/>
+        </w:rPr>
+        <w:t xml:space="preserve"> dengan tegangan dan arus yang sesuai menjadi salah satu aspek penting dalam perancangan sistem monitoring energi listrik berbasis </w:t>
+      </w:r>
+      <w:r>
+        <w:rPr>
+          <w:i/>
+          <w:iCs/>
+          <w:color w:val="000000" w:themeColor="text1"/>
+        </w:rPr>
+        <w:t>Internet of Things.</w:t>
+      </w:r>
+    </w:p>
+    <w:p>
+      <w:pPr>
+        <w:spacing w:line="480" w:lineRule="auto"/>
+        <w:ind w:firstLine="720"/>
+        <w:jc w:val="both"/>
+        <w:rPr>
+          <w:color w:val="000000" w:themeColor="text1"/>
+        </w:rPr>
+      </w:pPr>
+      <w:r>
+        <w:rPr>
+          <w:color w:val="000000" w:themeColor="text1"/>
+        </w:rPr>
+        <w:t xml:space="preserve">Pada penelitian ini, </w:t>
+      </w:r>
+      <w:r>
+        <w:rPr>
+          <w:i/>
+          <w:iCs/>
+          <w:color w:val="000000" w:themeColor="text1"/>
+        </w:rPr>
+        <w:t>adaptor power supply</w:t>
+      </w:r>
+      <w:r>
+        <w:rPr>
+          <w:color w:val="000000" w:themeColor="text1"/>
+        </w:rPr>
+        <w:t xml:space="preserve"> 5V 3A digunakan untuk menyuplai daya ke </w:t>
+      </w:r>
+      <w:r>
+        <w:rPr>
+          <w:color w:val="000000" w:themeColor="text1"/>
+        </w:rPr>
+        <w:t>ESP8266</w:t>
+      </w:r>
+      <w:r>
+        <w:rPr>
+          <w:color w:val="000000" w:themeColor="text1"/>
+        </w:rPr>
+        <w:t>, sensor PIR, sensor PZEM-004T, serta modul relay. Dengan penggunaan adaptor yang memiliki kapasitas arus mencukupi, sistem monitoring konsumsi energi dapat beroperasi secara stabil dan andal dalam jangka waktu yang panjang.</w:t>
+      </w:r>
+    </w:p>
+    <w:p>
+      <w:pPr>
+        <w:pStyle w:val="Heading3"/>
+      </w:pPr>
+      <w:r>
+        <w:t xml:space="preserve">2.1.9 </w:t>
+      </w:r>
+      <w:r>
+        <w:tab/>
+        <w:t>Kabel Penghubung (Jumper dan Kabel AC)</w:t>
+      </w:r>
+    </w:p>
+    <w:p>
+      <w:pPr>
+        <w:pStyle w:val="NoSpacing"/>
+        <w:ind w:left="720"/>
+        <w:jc w:val="both"/>
+        <w:rPr>
+          <w:rFonts w:cs="Times New Roman"/>
+          <w:color w:val="000000" w:themeColor="text1"/>
+        </w:rPr>
+      </w:pPr>
+      <w:r>
+        <w:rPr>
+          <w:rFonts w:cs="Times New Roman"/>
+          <w:color w:val="000000" w:themeColor="text1"/>
+        </w:rPr>
+        <w:t>Dalam perancangan sistem berbasis Internet of Things (IoT), kabel penghubung merupakan komponen penting yang berfungsi sebagai media penghantar daya dan sinyal antarperangkat. Pada sistem monitoring konsumsi energi listrik, kabel penghubung digunakan untuk menghubungkan mikrokontroler dengan sensor serta modul pendukung sehingga seluruh komponen dapat bekerja secara terintegrasi (Nuranda Alerafi, 2024: 36).</w:t>
+      </w:r>
+    </w:p>
+    <w:p>
+      <w:pPr>
+        <w:pStyle w:val="NoSpacing"/>
+        <w:ind w:left="567"/>
+        <w:jc w:val="both"/>
+        <w:rPr>
+          <w:rFonts w:cs="Times New Roman"/>
+          <w:color w:val="000000" w:themeColor="text1"/>
+        </w:rPr>
+      </w:pPr>
+    </w:p>
+    <w:p>
+      <w:pPr>
+        <w:spacing w:line="480" w:lineRule="auto"/>
+        <w:ind w:firstLine="720"/>
+        <w:jc w:val="both"/>
+        <w:rPr>
+          <w:color w:val="000000" w:themeColor="text1"/>
+        </w:rPr>
+      </w:pPr>
+      <w:r>
+        <w:rPr>
+          <w:color w:val="000000" w:themeColor="text1"/>
+        </w:rPr>
+        <w:t xml:space="preserve">Penggunaan kabel jumper sangat umum pada tahap perancangan dan pengembangan sistem IoT karena memudahkan proses pengkabelan antar </w:t>
+      </w:r>
+      <w:r>
+        <w:rPr>
+          <w:color w:val="000000" w:themeColor="text1"/>
+        </w:rPr>
+        <w:lastRenderedPageBreak/>
+        <w:t xml:space="preserve">komponen elektronik tanpa memerlukan penyolderan. Kabel jumper digunakan untuk menghubungkan mikrokontroler dengan sensor dan modul lain, sehingga mendukung fleksibilitas dan kemudahan dalam pengujian sistem. Hal ini dijelaskan oleh Nuranda Alerafi (2024) yang menyatakan bahwa: “Kabel Jumper merupakan kabel elektrik yang berfungsi untuk menghubungkan antar komponen yang ada di breadboard atau papan arduino tanpa harus menggunakan solder. Umumnya memang kabel Jumper sudah dilengkapi dengan pin yang terdapat pada setiap ujungnya.” (Nuranda Alerafi, 2024: 36) </w:t>
+      </w:r>
+    </w:p>
+    <w:p>
+      <w:pPr>
+        <w:spacing w:line="480" w:lineRule="auto"/>
+        <w:ind w:firstLine="720"/>
+        <w:jc w:val="both"/>
+        <w:rPr>
+          <w:color w:val="000000" w:themeColor="text1"/>
+        </w:rPr>
+      </w:pPr>
+      <w:r>
+        <w:rPr>
+          <w:color w:val="000000" w:themeColor="text1"/>
+        </w:rPr>
+        <w:t xml:space="preserve">Kestabilan koneksi dan kualitas kabel jumper sangat mempengaruhi keandalan sistem, terutama dalam proses pengiriman sinyal data dan suplai tegangan rendah (DC). Koneksi yang tidak stabil dapat menyebabkan gangguan pembacaan sensor dan menurunkan performa sistem </w:t>
+      </w:r>
+      <w:r>
+        <w:rPr>
+          <w:i/>
+          <w:iCs/>
+          <w:color w:val="000000" w:themeColor="text1"/>
+        </w:rPr>
+        <w:t xml:space="preserve">monitoring </w:t>
+      </w:r>
+      <w:r>
+        <w:rPr>
+          <w:color w:val="000000" w:themeColor="text1"/>
+        </w:rPr>
+        <w:t>(Lawal &amp; Rafsanjani, 2022: 252).</w:t>
+      </w:r>
+    </w:p>
+    <w:p>
+      <w:pPr>
+        <w:spacing w:line="480" w:lineRule="auto"/>
+        <w:ind w:firstLine="720"/>
+        <w:jc w:val="both"/>
+        <w:rPr>
+          <w:color w:val="000000" w:themeColor="text1"/>
+        </w:rPr>
+      </w:pPr>
+      <w:r>
+        <w:rPr>
+          <w:color w:val="000000" w:themeColor="text1"/>
+        </w:rPr>
+        <w:t xml:space="preserve">Dalam sistem IoT, konektivitas antarperangkat pada lapisan fisik menjadi faktor utama yang menentukan keberhasilan proses akuisisi data. Lawal dan Rafsanjani menjelaskan bahwa lapisan fisik IoT terdiri dari sensor, aktuator, dan perangkat keras yang saling terhubung untuk berinteraksi dengan lingkungan fisik, sebagaimana dinyatakan bahwa: </w:t>
+      </w:r>
+      <w:r>
+        <w:rPr>
+          <w:i/>
+          <w:iCs/>
+          <w:color w:val="000000" w:themeColor="text1"/>
+        </w:rPr>
+        <w:t xml:space="preserve">“The physical layer consists of sensors, actuators, processors, and other physical devices intelligently connected to communicate with the environment.” (Lawal &amp; Rafsanjani, 2022: 252) </w:t>
+      </w:r>
+    </w:p>
+    <w:p>
+      <w:pPr>
+        <w:spacing w:line="480" w:lineRule="auto"/>
+        <w:ind w:firstLine="720"/>
+        <w:jc w:val="both"/>
+        <w:rPr>
+          <w:color w:val="000000" w:themeColor="text1"/>
+        </w:rPr>
+      </w:pPr>
+      <w:r>
+        <w:rPr>
+          <w:color w:val="000000" w:themeColor="text1"/>
+        </w:rPr>
+        <w:t xml:space="preserve">Sementara itu, kabel AC digunakan untuk menyalurkan tegangan listrik arus bolak-balik (AC) dari sumber listrik ke beban seperti lampu dan kipas angin. </w:t>
+      </w:r>
+      <w:r>
+        <w:rPr>
+          <w:color w:val="000000" w:themeColor="text1"/>
+        </w:rPr>
+        <w:lastRenderedPageBreak/>
+        <w:t>Penggunaan kabel AC dengan spesifikasi yang sesuai standar keselamatan listrik sangat penting untuk memastikan penghantaran arus listrik yang aman serta meminimalkan risiko korsleting dan gangguan sistem.</w:t>
+      </w:r>
+    </w:p>
+    <w:p>
+      <w:pPr>
+        <w:spacing w:line="480" w:lineRule="auto"/>
+        <w:ind w:firstLine="720"/>
+        <w:jc w:val="both"/>
+        <w:rPr>
+          <w:color w:val="000000" w:themeColor="text1"/>
+        </w:rPr>
+      </w:pPr>
+      <w:r>
+        <w:rPr>
+          <w:color w:val="000000" w:themeColor="text1"/>
+        </w:rPr>
+        <w:t>Pada sistem monitoring energi listrik, pemisahan jalur kabel tegangan rendah (DC) dan tegangan tinggi (AC) menjadi aspek penting dalam menjaga keselamatan dan menghindari interferensi sinyal. Dengan penggunaan kabel penghubung yang tepat, sistem IoT dapat beroperasi secara stabil, aman, dan andal, khususnya ketika mikrokontroler dihubungkan dengan perangkat listrik bertegangan tinggi melalui modul relay.</w:t>
+      </w:r>
+    </w:p>
+    <w:p>
+      <w:pPr>
+        <w:spacing w:line="480" w:lineRule="auto"/>
+        <w:ind w:firstLine="720"/>
+        <w:jc w:val="both"/>
+        <w:rPr>
+          <w:color w:val="000000" w:themeColor="text1"/>
+        </w:rPr>
+      </w:pPr>
+      <w:r>
+        <w:rPr>
+          <w:color w:val="000000" w:themeColor="text1"/>
+        </w:rPr>
+        <w:t xml:space="preserve">Pada penelitian ini, kabel jumper digunakan untuk menghubungkan </w:t>
+      </w:r>
+      <w:r>
+        <w:rPr>
+          <w:color w:val="000000" w:themeColor="text1"/>
+        </w:rPr>
+        <w:t>ESP8266</w:t>
+      </w:r>
+      <w:r>
+        <w:rPr>
+          <w:color w:val="000000" w:themeColor="text1"/>
+        </w:rPr>
+        <w:t xml:space="preserve"> dengan sensor PIR dan sensor PZEM-004T, sedangkan kabel AC digunakan untuk menghubungkan sumber listrik dengan lampu dan kipas angin melalui modul relay. Dengan penggunaan kabel penghubung yang sesuai, sistem monitoring konsumsi energi dapat beroperasi secara stabil, aman, dan andal dalam lingkungan </w:t>
+      </w:r>
+      <w:r>
+        <w:rPr>
+          <w:color w:val="000000" w:themeColor="text1"/>
+        </w:rPr>
+        <w:t>Musala</w:t>
+      </w:r>
+      <w:r>
+        <w:rPr>
+          <w:color w:val="000000" w:themeColor="text1"/>
+        </w:rPr>
+        <w:t>.</w:t>
+      </w:r>
+    </w:p>
+    <w:p>
+      <w:pPr>
+        <w:pStyle w:val="Heading3"/>
+      </w:pPr>
+      <w:r>
+        <w:t xml:space="preserve">2.1.10 </w:t>
+      </w:r>
+      <w:r>
+        <w:tab/>
+        <w:t>Agile Development Model</w:t>
+      </w:r>
+    </w:p>
+    <w:p>
+      <w:pPr>
+        <w:spacing w:line="480" w:lineRule="auto"/>
+        <w:ind w:firstLine="720"/>
+        <w:jc w:val="both"/>
+        <w:rPr>
+          <w:color w:val="000000" w:themeColor="text1"/>
+        </w:rPr>
+      </w:pPr>
+      <w:r>
+        <w:rPr>
+          <w:i/>
+          <w:iCs/>
+          <w:color w:val="000000" w:themeColor="text1"/>
+        </w:rPr>
+        <w:t>Agile Development Model</w:t>
+      </w:r>
+      <w:r>
+        <w:rPr>
+          <w:color w:val="000000" w:themeColor="text1"/>
+        </w:rPr>
+        <w:t xml:space="preserve"> merupakan metode pengembangan perangkat lunak yang menekankan pada proses iteratif, inkremental, dan fleksibel terhadap perubahan kebutuhan pengguna. Model Agile membagi proses pengembangan sistem ke dalam siklus-siklus pendek yang disebut iterasi atau </w:t>
+      </w:r>
+      <w:r>
+        <w:rPr>
+          <w:i/>
+          <w:iCs/>
+          <w:color w:val="000000" w:themeColor="text1"/>
+        </w:rPr>
+        <w:t>sprint</w:t>
+      </w:r>
+      <w:r>
+        <w:rPr>
+          <w:color w:val="000000" w:themeColor="text1"/>
+        </w:rPr>
+        <w:t>, sehingga setiap bagian sistem dapat dikembangkan, diuji, dan dievaluasi secara bertahap.</w:t>
+      </w:r>
+    </w:p>
+    <w:p>
+      <w:pPr>
+        <w:spacing w:line="480" w:lineRule="auto"/>
+        <w:ind w:firstLine="720"/>
+        <w:jc w:val="both"/>
+        <w:rPr>
+          <w:color w:val="000000" w:themeColor="text1"/>
+        </w:rPr>
+      </w:pPr>
+      <w:r>
+        <w:rPr>
+          <w:color w:val="000000" w:themeColor="text1"/>
+        </w:rPr>
+        <w:lastRenderedPageBreak/>
+        <w:t xml:space="preserve">Pendekatan Agile sangat sesuai digunakan dalam pengembangan sistem berbasis </w:t>
+      </w:r>
+      <w:r>
+        <w:rPr>
+          <w:i/>
+          <w:iCs/>
+          <w:color w:val="000000" w:themeColor="text1"/>
+        </w:rPr>
+        <w:t>Internet of Things</w:t>
+      </w:r>
+      <w:r>
+        <w:rPr>
+          <w:color w:val="000000" w:themeColor="text1"/>
+        </w:rPr>
+        <w:t xml:space="preserve"> (IoT) dan aplikasi web karena kebutuhan sistem sering mengalami perubahan selama proses pengembangan. Dengan Agile, pengembang dapat menyesuaikan rancangan sistem berdasarkan hasil evaluasi pada setiap iterasi tanpa harus menunggu sistem selesai secara keseluruhan (Anifa et al., 2024: 85).</w:t>
+      </w:r>
+    </w:p>
+    <w:p>
+      <w:pPr>
+        <w:spacing w:line="480" w:lineRule="auto"/>
+        <w:ind w:firstLine="720"/>
+        <w:jc w:val="both"/>
+        <w:rPr>
+          <w:color w:val="000000" w:themeColor="text1"/>
+        </w:rPr>
+      </w:pPr>
+      <w:r>
+        <w:rPr>
+          <w:color w:val="000000" w:themeColor="text1"/>
+        </w:rPr>
+        <w:t xml:space="preserve">Menurut hasil </w:t>
+      </w:r>
+      <w:r>
+        <w:rPr>
+          <w:i/>
+          <w:iCs/>
+          <w:color w:val="000000" w:themeColor="text1"/>
+        </w:rPr>
+        <w:t>systematic literature review</w:t>
+      </w:r>
+      <w:r>
+        <w:rPr>
+          <w:color w:val="000000" w:themeColor="text1"/>
+        </w:rPr>
+        <w:t xml:space="preserve"> yang dilakukan oleh Anifa et al., (2024) Agile didefinisikan sebagai metode yang berfokus pada pengembangan bertahap dan berulang:</w:t>
+      </w:r>
+      <w:r>
+        <w:rPr>
+          <w:i/>
+          <w:iCs/>
+          <w:color w:val="000000" w:themeColor="text1"/>
+        </w:rPr>
+        <w:t xml:space="preserve">“The agile approach and its implementations across industries like software development, marketing, supply chain, product development, etc.” (Anifa et al., 2024: 85) </w:t>
+      </w:r>
+    </w:p>
+    <w:p>
+      <w:pPr>
+        <w:spacing w:line="480" w:lineRule="auto"/>
+        <w:ind w:firstLine="720"/>
+        <w:jc w:val="both"/>
+        <w:rPr>
+          <w:color w:val="000000" w:themeColor="text1"/>
+        </w:rPr>
+      </w:pPr>
+      <w:r>
+        <w:rPr>
+          <w:color w:val="000000" w:themeColor="text1"/>
+        </w:rPr>
+        <w:t xml:space="preserve">Ciri utama dari </w:t>
+      </w:r>
+      <w:r>
+        <w:rPr>
+          <w:i/>
+          <w:iCs/>
+          <w:color w:val="000000" w:themeColor="text1"/>
+        </w:rPr>
+        <w:t>Agile Development Model</w:t>
+      </w:r>
+      <w:r>
+        <w:rPr>
+          <w:color w:val="000000" w:themeColor="text1"/>
+        </w:rPr>
+        <w:t xml:space="preserve"> adalah komunikasi yang intensif, kolaborasi tim, serta kemampuan untuk merespons perubahan secara cepat. Setiap iterasi menghasilkan bagian sistem yang dapat diuji dan dievaluasi, sehingga kesalahan dapat terdeteksi lebih awal dan diperbaiki pada tahap berikutnya (Anifa et al., 2024: 86).</w:t>
+      </w:r>
+    </w:p>
+    <w:p>
+      <w:pPr>
+        <w:spacing w:line="480" w:lineRule="auto"/>
+        <w:ind w:firstLine="720"/>
+        <w:jc w:val="both"/>
+        <w:rPr>
+          <w:color w:val="000000" w:themeColor="text1"/>
+        </w:rPr>
+      </w:pPr>
+      <w:r>
+        <w:rPr>
+          <w:color w:val="000000" w:themeColor="text1"/>
+        </w:rPr>
+        <w:t xml:space="preserve">Dalam kajian literatur terbaru mengenai Agile, Anifa et al. (2024) menyatakan bahwa Agile sangat efektif digunakan pada proyek pengembangan sistem yang kompleks dan dinamis: </w:t>
+      </w:r>
+      <w:r>
+        <w:rPr>
+          <w:i/>
+          <w:iCs/>
+          <w:color w:val="000000" w:themeColor="text1"/>
+        </w:rPr>
+        <w:t xml:space="preserve">“In agile, flexibility would define the ability of the organiza- tion, department, project, team members and the tasks and activities in change management and adapt to the volatile of the market environment” (Anifa et al., 2024: 86) </w:t>
+      </w:r>
+    </w:p>
+    <w:p>
+      <w:pPr>
+        <w:spacing w:line="480" w:lineRule="auto"/>
+        <w:ind w:firstLine="720"/>
+        <w:jc w:val="both"/>
+        <w:rPr>
+          <w:color w:val="000000" w:themeColor="text1"/>
+        </w:rPr>
+      </w:pPr>
+      <w:r>
+        <w:rPr>
+          <w:color w:val="000000" w:themeColor="text1"/>
+        </w:rPr>
+        <w:lastRenderedPageBreak/>
+        <w:t xml:space="preserve">Penggunaan Agile juga memberikan keuntungan dalam pengembangan sistem IoT berbasis web karena melibatkan integrasi antara perangkat keras, perangkat lunak, dan antarmuka pengguna. Dengan Agile, pengembangan </w:t>
+      </w:r>
+      <w:r>
+        <w:rPr>
+          <w:i/>
+          <w:iCs/>
+          <w:color w:val="000000" w:themeColor="text1"/>
+        </w:rPr>
+        <w:t>backend, frontend,</w:t>
+      </w:r>
+      <w:r>
+        <w:rPr>
+          <w:color w:val="000000" w:themeColor="text1"/>
+        </w:rPr>
+        <w:t xml:space="preserve"> dan integrasi perangkat IoT dapat dilakukan secara paralel dan dievaluasi secara berkala.</w:t>
+      </w:r>
+    </w:p>
+    <w:p>
+      <w:pPr>
+        <w:spacing w:line="480" w:lineRule="auto"/>
+        <w:ind w:firstLine="720"/>
+        <w:jc w:val="both"/>
+        <w:rPr>
+          <w:color w:val="000000" w:themeColor="text1"/>
+        </w:rPr>
+      </w:pPr>
+      <w:r>
+        <w:rPr>
+          <w:color w:val="000000" w:themeColor="text1"/>
+        </w:rPr>
+        <w:t xml:space="preserve">Pada penelitian ini, </w:t>
+      </w:r>
+      <w:r>
+        <w:rPr>
+          <w:i/>
+          <w:iCs/>
+          <w:color w:val="000000" w:themeColor="text1"/>
+        </w:rPr>
+        <w:t>Agile Development Model</w:t>
+      </w:r>
+      <w:r>
+        <w:rPr>
+          <w:color w:val="000000" w:themeColor="text1"/>
+        </w:rPr>
+        <w:t xml:space="preserve"> digunakan sebagai metode pengembangan sistem </w:t>
+      </w:r>
+      <w:r>
+        <w:rPr>
+          <w:i/>
+          <w:iCs/>
+          <w:color w:val="000000" w:themeColor="text1"/>
+        </w:rPr>
+        <w:t>monitoring</w:t>
+      </w:r>
+      <w:r>
+        <w:rPr>
+          <w:color w:val="000000" w:themeColor="text1"/>
+        </w:rPr>
+        <w:t xml:space="preserve"> konsumsi energi listrik. Model ini memungkinkan pengembangan sistem dilakukan secara bertahap, mulai dari perancangan perangkat keras, pengembangan perangkat lunak, hingga pembuatan </w:t>
+      </w:r>
+      <w:r>
+        <w:rPr>
+          <w:i/>
+          <w:iCs/>
+          <w:color w:val="000000" w:themeColor="text1"/>
+        </w:rPr>
+        <w:t>website monitoring</w:t>
+      </w:r>
+      <w:r>
+        <w:rPr>
+          <w:color w:val="000000" w:themeColor="text1"/>
+        </w:rPr>
+        <w:t>. Dengan pendekatan Agile, sistem dapat disesuaikan dengan kebutuhan pengguna dan kondisi lapangan secara lebih fleksibel dan efisien.</w:t>
+      </w:r>
+    </w:p>
+    <w:p>
+      <w:pPr>
+        <w:pStyle w:val="Heading3"/>
+      </w:pPr>
+      <w:r>
+        <w:t xml:space="preserve">2.1.11 </w:t>
+      </w:r>
+      <w:r>
+        <w:tab/>
+      </w:r>
+      <w:r>
+        <w:rPr>
+          <w:i/>
+          <w:iCs/>
+        </w:rPr>
+        <w:t>Website</w:t>
+      </w:r>
+    </w:p>
+    <w:p>
+      <w:pPr>
+        <w:spacing w:line="480" w:lineRule="auto"/>
+        <w:ind w:firstLine="720"/>
+        <w:jc w:val="both"/>
+        <w:rPr>
+          <w:color w:val="000000" w:themeColor="text1"/>
+        </w:rPr>
+      </w:pPr>
+      <w:r>
+        <w:rPr>
+          <w:i/>
+          <w:iCs/>
+          <w:color w:val="000000" w:themeColor="text1"/>
+        </w:rPr>
+        <w:t>Website</w:t>
+      </w:r>
+      <w:r>
+        <w:rPr>
+          <w:color w:val="000000" w:themeColor="text1"/>
+        </w:rPr>
+        <w:t xml:space="preserve"> merupakan media berbasis internet yang digunakan untuk menyajikan informasi secara visual dan interaktif kepada pengguna. Dalam sistem </w:t>
+      </w:r>
+      <w:r>
+        <w:rPr>
+          <w:i/>
+          <w:iCs/>
+          <w:color w:val="000000" w:themeColor="text1"/>
+        </w:rPr>
+        <w:t>Internet of Things</w:t>
+      </w:r>
+      <w:r>
+        <w:rPr>
+          <w:color w:val="000000" w:themeColor="text1"/>
+        </w:rPr>
+        <w:t xml:space="preserve"> (IoT), website berperan sebagai lapisan aplikasi (</w:t>
+      </w:r>
+      <w:r>
+        <w:rPr>
+          <w:i/>
+          <w:iCs/>
+          <w:color w:val="000000" w:themeColor="text1"/>
+        </w:rPr>
+        <w:t>application layer</w:t>
+      </w:r>
+      <w:r>
+        <w:rPr>
+          <w:color w:val="000000" w:themeColor="text1"/>
+        </w:rPr>
+        <w:t>) yang berfungsi menampilkan data hasil pengukuran sensor serta menjadi penghubung antara sistem dan pengguna (Fajri et al., 2025: 25). Hal ini dijelaskan dalam penelitian Fajri et al. (2025) yang menyatakan bahwa pada arsitektur IoT, data yang telah diproses akan ditampilkan melalui dashboard berbasis web secara real-time:</w:t>
+      </w:r>
+    </w:p>
+    <w:p>
+      <w:pPr>
+        <w:spacing w:line="480" w:lineRule="auto"/>
+        <w:ind w:left="720"/>
+        <w:jc w:val="both"/>
+        <w:rPr>
+          <w:i/>
+          <w:iCs/>
+          <w:color w:val="000000" w:themeColor="text1"/>
+        </w:rPr>
+      </w:pPr>
+      <w:r>
+        <w:rPr>
+          <w:i/>
+          <w:iCs/>
+          <w:color w:val="000000" w:themeColor="text1"/>
+        </w:rPr>
+        <w:t xml:space="preserve">“Processed data is displayed via a web-based dashboard in real-time, enabling fast, data-based decision making.” (Fajri et al., 2025: 25) </w:t>
+      </w:r>
+    </w:p>
+    <w:p>
+      <w:pPr>
+        <w:spacing w:line="480" w:lineRule="auto"/>
+        <w:ind w:firstLine="720"/>
+        <w:jc w:val="both"/>
+        <w:rPr>
+          <w:color w:val="000000" w:themeColor="text1"/>
+        </w:rPr>
+      </w:pPr>
+      <w:r>
+        <w:rPr>
+          <w:i/>
+          <w:iCs/>
+          <w:color w:val="000000" w:themeColor="text1"/>
+        </w:rPr>
+        <w:lastRenderedPageBreak/>
+        <w:t>Website</w:t>
+      </w:r>
+      <w:r>
+        <w:rPr>
+          <w:color w:val="000000" w:themeColor="text1"/>
+        </w:rPr>
+        <w:t xml:space="preserve"> dalam sistem IoT umumnya terhubung dengan </w:t>
+      </w:r>
+      <w:r>
+        <w:rPr>
+          <w:i/>
+          <w:iCs/>
+          <w:color w:val="000000" w:themeColor="text1"/>
+        </w:rPr>
+        <w:t>backend server</w:t>
+      </w:r>
+      <w:r>
+        <w:rPr>
+          <w:color w:val="000000" w:themeColor="text1"/>
+        </w:rPr>
+        <w:t xml:space="preserve"> yang berfungsi menerima data dari perangkat IoT, menyimpan data ke dalam basis data, serta menyajikannya kembali dalam bentuk visualisasi yang mudah dipahami (Samanta et al., 2025: 1436). Dengan adanya </w:t>
+      </w:r>
+      <w:r>
+        <w:rPr>
+          <w:i/>
+          <w:iCs/>
+          <w:color w:val="000000" w:themeColor="text1"/>
+        </w:rPr>
+        <w:t>website</w:t>
+      </w:r>
+      <w:r>
+        <w:rPr>
+          <w:color w:val="000000" w:themeColor="text1"/>
+        </w:rPr>
+        <w:t>, pengguna dapat melakukan pemantauan sistem tanpa harus berada di lokasi perangkat. Peran website sebagai antarmuka utama juga ditegaskan oleh Samanta et al. (2025) dalam penelitian sistem monitoring energi listrik berbasis IoT, yang menyatakan bahwa:</w:t>
+      </w:r>
+    </w:p>
+    <w:p>
+      <w:pPr>
+        <w:spacing w:line="480" w:lineRule="auto"/>
+        <w:ind w:left="720"/>
+        <w:jc w:val="both"/>
+        <w:rPr>
+          <w:color w:val="000000" w:themeColor="text1"/>
+        </w:rPr>
+      </w:pPr>
+      <w:r>
+        <w:rPr>
+          <w:color w:val="000000" w:themeColor="text1"/>
+        </w:rPr>
+        <w:t xml:space="preserve">“Sistem </w:t>
+      </w:r>
+      <w:r>
+        <w:rPr>
+          <w:i/>
+          <w:iCs/>
+          <w:color w:val="000000" w:themeColor="text1"/>
+        </w:rPr>
+        <w:t>Monitoring</w:t>
+      </w:r>
+      <w:r>
+        <w:rPr>
+          <w:color w:val="000000" w:themeColor="text1"/>
+        </w:rPr>
+        <w:t xml:space="preserve"> Energi Listrik Rumah Berbasis IoT dan </w:t>
+      </w:r>
+      <w:r>
+        <w:rPr>
+          <w:i/>
+          <w:iCs/>
+          <w:color w:val="000000" w:themeColor="text1"/>
+        </w:rPr>
+        <w:t>Web</w:t>
+      </w:r>
+      <w:r>
+        <w:rPr>
+          <w:color w:val="000000" w:themeColor="text1"/>
+        </w:rPr>
+        <w:t xml:space="preserve"> ini merupakan sistem yang mengandalkan </w:t>
+      </w:r>
+      <w:r>
+        <w:rPr>
+          <w:i/>
+          <w:iCs/>
+          <w:color w:val="000000" w:themeColor="text1"/>
+        </w:rPr>
+        <w:t>web server</w:t>
+      </w:r>
+      <w:r>
+        <w:rPr>
+          <w:color w:val="000000" w:themeColor="text1"/>
+        </w:rPr>
+        <w:t xml:space="preserve"> sebagai pusat kendali dan penghubung utama antara tiga komponen: perangkat IoT, web server, dan </w:t>
+      </w:r>
+      <w:r>
+        <w:rPr>
+          <w:i/>
+          <w:iCs/>
+          <w:color w:val="000000" w:themeColor="text1"/>
+        </w:rPr>
+        <w:t>web browser</w:t>
+      </w:r>
+      <w:r>
+        <w:rPr>
+          <w:color w:val="000000" w:themeColor="text1"/>
+        </w:rPr>
+        <w:t xml:space="preserve">.” (Samanta et al., 2025: 1436) </w:t>
+      </w:r>
+    </w:p>
+    <w:p>
+      <w:pPr>
+        <w:spacing w:line="480" w:lineRule="auto"/>
+        <w:ind w:firstLine="720"/>
+        <w:jc w:val="both"/>
+        <w:rPr>
+          <w:color w:val="000000" w:themeColor="text1"/>
+        </w:rPr>
+      </w:pPr>
+      <w:r>
+        <w:rPr>
+          <w:color w:val="000000" w:themeColor="text1"/>
+        </w:rPr>
+        <w:t xml:space="preserve">Dalam sistem monitoring energi listrik, </w:t>
+      </w:r>
+      <w:r>
+        <w:rPr>
+          <w:i/>
+          <w:iCs/>
+          <w:color w:val="000000" w:themeColor="text1"/>
+        </w:rPr>
+        <w:t>website</w:t>
+      </w:r>
+      <w:r>
+        <w:rPr>
+          <w:color w:val="000000" w:themeColor="text1"/>
+        </w:rPr>
+        <w:t xml:space="preserve"> berfungsi sebagai media visualisasi data konsumsi energi secara </w:t>
+      </w:r>
+      <w:r>
+        <w:rPr>
+          <w:i/>
+          <w:iCs/>
+          <w:color w:val="000000" w:themeColor="text1"/>
+        </w:rPr>
+        <w:t>real-time</w:t>
+      </w:r>
+      <w:r>
+        <w:rPr>
+          <w:color w:val="000000" w:themeColor="text1"/>
+        </w:rPr>
+        <w:t xml:space="preserve">. Data yang ditampilkan dapat berupa informasi tegangan, arus, daya, energi listrik, serta status perangkat. Informasi tersebut membantu pengguna dalam memahami pola penggunaan energi dan mendukung proses evaluasi efisiensi energi (Fajri et al., 2025: 26). Fungsi </w:t>
+      </w:r>
+      <w:r>
+        <w:rPr>
+          <w:i/>
+          <w:iCs/>
+          <w:color w:val="000000" w:themeColor="text1"/>
+        </w:rPr>
+        <w:t>website</w:t>
+      </w:r>
+      <w:r>
+        <w:rPr>
+          <w:color w:val="000000" w:themeColor="text1"/>
+        </w:rPr>
+        <w:t xml:space="preserve"> sebagai media monitoring </w:t>
+      </w:r>
+      <w:r>
+        <w:rPr>
+          <w:i/>
+          <w:iCs/>
+          <w:color w:val="000000" w:themeColor="text1"/>
+        </w:rPr>
+        <w:t>real-time</w:t>
+      </w:r>
+      <w:r>
+        <w:rPr>
+          <w:color w:val="000000" w:themeColor="text1"/>
+        </w:rPr>
+        <w:t xml:space="preserve"> dijelaskan lebih lanjut oleh Fajri et al. (2025) yang menyatakan bahwa dashboard web digunakan sebagai pusat pemantauan berbagai data sensor:</w:t>
+      </w:r>
+    </w:p>
+    <w:p>
+      <w:pPr>
+        <w:spacing w:line="480" w:lineRule="auto"/>
+        <w:ind w:left="720"/>
+        <w:jc w:val="both"/>
+        <w:rPr>
+          <w:i/>
+          <w:iCs/>
+          <w:color w:val="000000" w:themeColor="text1"/>
+        </w:rPr>
+      </w:pPr>
+      <w:r>
+        <w:rPr>
+          <w:i/>
+          <w:iCs/>
+          <w:color w:val="000000" w:themeColor="text1"/>
+        </w:rPr>
+        <w:t xml:space="preserve">“The IoT system mainly relies on a real-time dashboard, which acts as a central hub for monitoring data from several sectors.” (Fajri et al., 2025: 26) </w:t>
+      </w:r>
+    </w:p>
+    <w:p>
+      <w:pPr>
+        <w:spacing w:line="480" w:lineRule="auto"/>
+        <w:ind w:firstLine="720"/>
+        <w:jc w:val="both"/>
+        <w:rPr>
+          <w:color w:val="000000" w:themeColor="text1"/>
+        </w:rPr>
+      </w:pPr>
+      <w:r>
+        <w:rPr>
+          <w:color w:val="000000" w:themeColor="text1"/>
+        </w:rPr>
+        <w:lastRenderedPageBreak/>
+        <w:t xml:space="preserve">Selain sebagai media visualisasi, </w:t>
+      </w:r>
+      <w:r>
+        <w:rPr>
+          <w:i/>
+          <w:iCs/>
+          <w:color w:val="000000" w:themeColor="text1"/>
+        </w:rPr>
+        <w:t>website</w:t>
+      </w:r>
+      <w:r>
+        <w:rPr>
+          <w:color w:val="000000" w:themeColor="text1"/>
+        </w:rPr>
+        <w:t xml:space="preserve"> juga dapat dikembangkan untuk mendukung fitur pengendalian perangkat listrik secara jarak jauh. Pengguna dapat menyalakan atau mematikan perangkat seperti lampu dan kipas angin melalui antarmuka </w:t>
+      </w:r>
+      <w:r>
+        <w:rPr>
+          <w:i/>
+          <w:iCs/>
+          <w:color w:val="000000" w:themeColor="text1"/>
+        </w:rPr>
+        <w:t>web</w:t>
+      </w:r>
+      <w:r>
+        <w:rPr>
+          <w:color w:val="000000" w:themeColor="text1"/>
+        </w:rPr>
+        <w:t xml:space="preserve">, sehingga fungsi monitoring dan kontrol dapat terintegrasi dalam satu </w:t>
+      </w:r>
+      <w:r>
+        <w:rPr>
+          <w:i/>
+          <w:iCs/>
+          <w:color w:val="000000" w:themeColor="text1"/>
+        </w:rPr>
+        <w:t>platform</w:t>
+      </w:r>
+      <w:r>
+        <w:rPr>
+          <w:color w:val="000000" w:themeColor="text1"/>
+        </w:rPr>
+        <w:t xml:space="preserve"> (Samanta et al., 2025: 1436). Hal ini sejalan dengan pernyataan Samanta et al. (2025) yang menyebutkan bahwa:</w:t>
+      </w:r>
+    </w:p>
+    <w:p>
+      <w:pPr>
+        <w:spacing w:line="480" w:lineRule="auto"/>
+        <w:ind w:left="720"/>
+        <w:jc w:val="both"/>
+        <w:rPr>
+          <w:color w:val="000000" w:themeColor="text1"/>
+        </w:rPr>
+      </w:pPr>
+      <w:r>
+        <w:rPr>
+          <w:color w:val="000000" w:themeColor="text1"/>
+        </w:rPr>
+        <w:t xml:space="preserve">“Web browser digunakan sebagai antarmuka bagi pengguna untuk memantau kondisi dan mengendalikan perangkat IoT melalui interaksi dengan web server.” (Samanta et al., 2025: 1436) </w:t>
+      </w:r>
+    </w:p>
+    <w:p>
+      <w:pPr>
+        <w:spacing w:line="480" w:lineRule="auto"/>
+        <w:ind w:firstLine="720"/>
+        <w:jc w:val="both"/>
+        <w:rPr>
+          <w:color w:val="000000" w:themeColor="text1"/>
+        </w:rPr>
+      </w:pPr>
+      <w:r>
+        <w:rPr>
+          <w:color w:val="000000" w:themeColor="text1"/>
+        </w:rPr>
+        <w:t xml:space="preserve">Berdasarkan uraian tersebut, </w:t>
+      </w:r>
+      <w:r>
+        <w:rPr>
+          <w:i/>
+          <w:iCs/>
+          <w:color w:val="000000" w:themeColor="text1"/>
+        </w:rPr>
+        <w:t>website</w:t>
+      </w:r>
+      <w:r>
+        <w:rPr>
+          <w:color w:val="000000" w:themeColor="text1"/>
+        </w:rPr>
+        <w:t xml:space="preserve"> memiliki peran penting dalam sistem monitoring energi listrik berbasis </w:t>
+      </w:r>
+      <w:r>
+        <w:rPr>
+          <w:i/>
+          <w:iCs/>
+          <w:color w:val="000000" w:themeColor="text1"/>
+        </w:rPr>
+        <w:t>Internet of Things</w:t>
+      </w:r>
+      <w:r>
+        <w:rPr>
+          <w:color w:val="000000" w:themeColor="text1"/>
+        </w:rPr>
+        <w:t xml:space="preserve"> sebagai lapisan aplikasi yang menyajikan data sensor secara </w:t>
+      </w:r>
+      <w:r>
+        <w:rPr>
+          <w:i/>
+          <w:iCs/>
+          <w:color w:val="000000" w:themeColor="text1"/>
+        </w:rPr>
+        <w:t>real-time</w:t>
+      </w:r>
+      <w:r>
+        <w:rPr>
+          <w:color w:val="000000" w:themeColor="text1"/>
+        </w:rPr>
+        <w:t>, mendukung pengambilan keputusan, serta memungkinkan integrasi antara fungsi pemantauan dan pengendalian perangkat listrik.</w:t>
+      </w:r>
+    </w:p>
+    <w:p>
+      <w:pPr>
+        <w:spacing w:line="480" w:lineRule="auto"/>
+        <w:ind w:firstLine="720"/>
+        <w:jc w:val="both"/>
+        <w:rPr>
+          <w:color w:val="000000" w:themeColor="text1"/>
+        </w:rPr>
+      </w:pPr>
+      <w:r>
+        <w:rPr>
+          <w:color w:val="000000" w:themeColor="text1"/>
+        </w:rPr>
+        <w:t xml:space="preserve">Pada penelitian ini, website digunakan untuk menampilkan data </w:t>
+      </w:r>
+      <w:r>
+        <w:rPr>
+          <w:i/>
+          <w:iCs/>
+          <w:color w:val="000000" w:themeColor="text1"/>
+        </w:rPr>
+        <w:t>monitoring</w:t>
+      </w:r>
+      <w:r>
+        <w:rPr>
+          <w:color w:val="000000" w:themeColor="text1"/>
+        </w:rPr>
+        <w:t xml:space="preserve"> konsumsi energi lampu dan kipas angin pada bangunan </w:t>
+      </w:r>
+      <w:r>
+        <w:rPr>
+          <w:color w:val="000000" w:themeColor="text1"/>
+        </w:rPr>
+        <w:t>Musala</w:t>
+      </w:r>
+      <w:r>
+        <w:rPr>
+          <w:color w:val="000000" w:themeColor="text1"/>
+        </w:rPr>
+        <w:t xml:space="preserve">. </w:t>
+      </w:r>
+      <w:r>
+        <w:rPr>
+          <w:i/>
+          <w:iCs/>
+          <w:color w:val="000000" w:themeColor="text1"/>
+        </w:rPr>
+        <w:t>Website</w:t>
+      </w:r>
+      <w:r>
+        <w:rPr>
+          <w:color w:val="000000" w:themeColor="text1"/>
+        </w:rPr>
+        <w:t xml:space="preserve"> menerima data dari </w:t>
+      </w:r>
+      <w:r>
+        <w:rPr>
+          <w:i/>
+          <w:iCs/>
+          <w:color w:val="000000" w:themeColor="text1"/>
+        </w:rPr>
+        <w:t>backend server</w:t>
+      </w:r>
+      <w:r>
+        <w:rPr>
+          <w:color w:val="000000" w:themeColor="text1"/>
+        </w:rPr>
+        <w:t xml:space="preserve"> yang terhubung dengan </w:t>
+      </w:r>
+      <w:r>
+        <w:rPr>
+          <w:color w:val="000000" w:themeColor="text1"/>
+        </w:rPr>
+        <w:t>ESP8266</w:t>
+      </w:r>
+      <w:r>
+        <w:rPr>
+          <w:color w:val="000000" w:themeColor="text1"/>
+        </w:rPr>
+        <w:t xml:space="preserve"> dan sensor PZEM-004T, kemudian menyajikan data tersebut dalam bentuk informasi yang mudah dipahami oleh pengguna. Dengan demikian, </w:t>
+      </w:r>
+      <w:r>
+        <w:rPr>
+          <w:i/>
+          <w:iCs/>
+          <w:color w:val="000000" w:themeColor="text1"/>
+        </w:rPr>
+        <w:t>website</w:t>
+      </w:r>
+      <w:r>
+        <w:rPr>
+          <w:color w:val="000000" w:themeColor="text1"/>
+        </w:rPr>
+        <w:t xml:space="preserve"> berperan penting sebagai media pemantauan dan pengelolaan energi listrik berbasis </w:t>
+      </w:r>
+      <w:r>
+        <w:rPr>
+          <w:i/>
+          <w:iCs/>
+          <w:color w:val="000000" w:themeColor="text1"/>
+        </w:rPr>
+        <w:t>Internet of Things</w:t>
+      </w:r>
+      <w:r>
+        <w:rPr>
+          <w:color w:val="000000" w:themeColor="text1"/>
+        </w:rPr>
+        <w:t>.</w:t>
+      </w:r>
+    </w:p>
+    <w:p>
+      <w:pPr>
+        <w:pStyle w:val="Heading3"/>
+      </w:pPr>
+      <w:r>
+        <w:lastRenderedPageBreak/>
+        <w:t xml:space="preserve">2.1.12 </w:t>
+      </w:r>
+      <w:r>
+        <w:tab/>
+      </w:r>
+      <w:r>
+        <w:t>PostgreSQL</w:t>
+      </w:r>
+    </w:p>
+    <w:p>
+      <w:pPr>
+        <w:spacing w:line="480" w:lineRule="auto"/>
+        <w:ind w:firstLine="720"/>
+        <w:jc w:val="both"/>
+      </w:pPr>
+      <w:r>
+        <w:t>PostgreSQL merupakan salah satu sistem manajemen basis data relasional berorientasi objek (Object Relational Database Management System/ORDBMS) yang bersifat open source dan banyak digunakan dalam pengembangan sistem informasi. PostgreSQL dikenal memiliki kestabilan, fleksibilitas, serta dukungan fitur yang lengkap untuk pengelolaan data berskala besar. Hafsah et al. (2025) menyatakan bahwa PostgreSQL merupakan basis data yang mendukung berbagai fitur canggih serta kompatibel dengan berbagai platform sistem operasi, sehingga sesuai digunakan pada aplikasi modern berbasis data dan Internet of Things (IoT).</w:t>
+      </w:r>
+    </w:p>
+    <w:p>
+      <w:pPr>
+        <w:spacing w:line="480" w:lineRule="auto"/>
+        <w:jc w:val="both"/>
+      </w:pPr>
+      <w:r>
+        <w:t>Dalam sistem monitoring berbasis IoT, PostgreSQL digunakan untuk menyimpan data hasil pembacaan sensor secara terstruktur dan real-time. Basis data ini mampu menangani data dalam jumlah besar serta mendukung pengolahan query yang kompleks untuk kebutuhan monitoring dan analisis data. Hafsah et al. (2025) menjelaskan bahwa:</w:t>
+      </w:r>
+    </w:p>
+    <w:p>
+      <w:pPr>
+        <w:spacing w:line="480" w:lineRule="auto"/>
+        <w:ind w:firstLine="720"/>
+        <w:jc w:val="both"/>
+      </w:pPr>
+      <w:r>
+        <w:t>“PostgreSQL merupakan salah satu sistem manajemen basis data relasional berorientasi objek yang dikenal karena kestabilan, fleksibilitas, dan dukungannya terhadap berbagai fitur canggih.” (Hafsah et al., 2025: 187)</w:t>
+      </w:r>
+    </w:p>
+    <w:p>
+      <w:pPr>
+        <w:spacing w:line="480" w:lineRule="auto"/>
+        <w:jc w:val="both"/>
+      </w:pPr>
+      <w:r>
+        <w:t xml:space="preserve">Selain memiliki performa yang baik, PostgreSQL juga mendukung pengaturan keamanan data melalui mekanisme kontrol akses pengguna dan enkripsi data. Fitur tersebut memungkinkan sistem menjaga kerahasiaan dan integritas data yang tersimpan pada database. Dalam penelitian Hafsah et al. (2025) dijelaskan bahwa </w:t>
+      </w:r>
+      <w:r>
+        <w:lastRenderedPageBreak/>
+        <w:t>keamanan database menjadi aspek penting untuk melindungi sistem dari berbagai ancaman, sebagaimana dinyatakan bahwa:</w:t>
+      </w:r>
+    </w:p>
+    <w:p>
+      <w:pPr>
+        <w:spacing w:line="480" w:lineRule="auto"/>
+        <w:ind w:firstLine="720"/>
+        <w:jc w:val="both"/>
+      </w:pPr>
+      <w:r>
+        <w:t>“Keamanan database merupakan serangkaian langkah dan kebijakan yang dirancang untuk melindungi sistem basis data dari berbagai ancaman.” (Hafsah et al., 2025: 185)</w:t>
+      </w:r>
+    </w:p>
+    <w:p>
+      <w:pPr>
+        <w:spacing w:line="480" w:lineRule="auto"/>
+        <w:ind w:firstLine="720"/>
+        <w:jc w:val="both"/>
+      </w:pPr>
+      <w:r>
+        <w:t>PostgreSQL juga mendukung mekanisme Role-Based Access Control (RBAC) yang memungkinkan pengaturan hak akses pengguna berdasarkan peran tertentu dalam sistem. Dengan RBAC, pengelolaan hak akses menjadi lebih aman dan terstruktur sehingga meminimalkan penyalahgunaan akses terhadap data sistem. Hafsah et al. (2025) menjelaskan bahwa:</w:t>
+      </w:r>
+    </w:p>
+    <w:p>
+      <w:pPr>
+        <w:spacing w:line="480" w:lineRule="auto"/>
+        <w:ind w:firstLine="720"/>
+        <w:jc w:val="both"/>
+      </w:pPr>
+      <w:r>
+        <w:t>“Role-Based Access Control (RBAC) merupakan salah satu pendekatan dalam sistem manajemen kontrol akses yang mendasarkan hak akses pengguna pada peran atau jabatan yang dimilikinya dalam suatu organisasi.” (Hafsah et al., 2025: 185)</w:t>
+      </w:r>
+    </w:p>
+    <w:p>
+      <w:pPr>
+        <w:spacing w:line="480" w:lineRule="auto"/>
+        <w:ind w:firstLine="720"/>
+        <w:jc w:val="both"/>
+      </w:pPr>
+      <w:r>
+        <w:t>Dengan karakteristik tersebut, PostgreSQL sangat sesuai digunakan sebagai basis data backend pada sistem monitoring energi berbasis website dan Internet of Things (IoT). Pada penelitian ini, PostgreSQL digunakan untuk menyimpan data monitoring konsumsi energi listrik yang diperoleh dari sensor PZEM-004T, data status perangkat, serta riwayat kontrol perangkat. Penggunaan PostgreSQL memungkinkan proses penyimpanan, pengolahan, dan pengambilan data dilakukan secara efisien, stabil, dan aman untuk mendukung monitoring energi secara real-time.</w:t>
+      </w:r>
+    </w:p>
+    <w:p>
+      <w:pPr>
+        <w:pStyle w:val="Heading3"/>
+      </w:pPr>
+      <w:r>
+        <w:lastRenderedPageBreak/>
+        <w:t xml:space="preserve">2.1.13 </w:t>
+      </w:r>
+      <w:r>
+        <w:tab/>
+        <w:t>Vue.js</w:t>
+      </w:r>
+    </w:p>
+    <w:p>
+      <w:pPr>
+        <w:spacing w:line="480" w:lineRule="auto"/>
+        <w:ind w:firstLine="720"/>
+        <w:jc w:val="both"/>
+        <w:rPr>
+          <w:color w:val="000000" w:themeColor="text1"/>
+        </w:rPr>
+      </w:pPr>
+      <w:r>
+        <w:rPr>
+          <w:color w:val="000000" w:themeColor="text1"/>
+        </w:rPr>
+        <w:t xml:space="preserve">Vue.js merupakan </w:t>
+      </w:r>
+      <w:r>
+        <w:rPr>
+          <w:i/>
+          <w:iCs/>
+          <w:color w:val="000000" w:themeColor="text1"/>
+        </w:rPr>
+        <w:t>framework</w:t>
+      </w:r>
+      <w:r>
+        <w:rPr>
+          <w:color w:val="000000" w:themeColor="text1"/>
+        </w:rPr>
+        <w:t xml:space="preserve"> JavaScript yang digunakan untuk membangun antarmuka pengguna (</w:t>
+      </w:r>
+      <w:r>
+        <w:rPr>
+          <w:i/>
+          <w:iCs/>
+          <w:color w:val="000000" w:themeColor="text1"/>
+        </w:rPr>
+        <w:t>user interface</w:t>
+      </w:r>
+      <w:r>
+        <w:rPr>
+          <w:color w:val="000000" w:themeColor="text1"/>
+        </w:rPr>
+        <w:t xml:space="preserve">) berbasis web yang bersifat reaktif dan modular. Vue.js dirancang untuk mempermudah pengembangan aplikasi </w:t>
+      </w:r>
+      <w:r>
+        <w:rPr>
+          <w:i/>
+          <w:iCs/>
+          <w:color w:val="000000" w:themeColor="text1"/>
+        </w:rPr>
+        <w:t>web</w:t>
+      </w:r>
+      <w:r>
+        <w:rPr>
+          <w:color w:val="000000" w:themeColor="text1"/>
+        </w:rPr>
+        <w:t xml:space="preserve"> dengan menyediakan konsep </w:t>
+      </w:r>
+      <w:r>
+        <w:rPr>
+          <w:i/>
+          <w:iCs/>
+          <w:color w:val="000000" w:themeColor="text1"/>
+        </w:rPr>
+        <w:t>reactive rendering</w:t>
+      </w:r>
+      <w:r>
+        <w:rPr>
+          <w:color w:val="000000" w:themeColor="text1"/>
+        </w:rPr>
+        <w:t xml:space="preserve"> dan arsitektur berbasis komponen, sehingga tampilan aplikasi dapat diperbarui secara otomatis ketika terjadi perubahan data (Aryasta &amp; Cahyono, 2021: 2). Hal ini sejalan dengan penelitian Aryasta dan Cahyono (2021) yang menyatakan bahwa:</w:t>
+      </w:r>
+    </w:p>
+    <w:p>
+      <w:pPr>
+        <w:spacing w:line="480" w:lineRule="auto"/>
+        <w:ind w:left="720"/>
+        <w:jc w:val="both"/>
+        <w:rPr>
+          <w:color w:val="000000" w:themeColor="text1"/>
+        </w:rPr>
+      </w:pPr>
+      <w:r>
+        <w:rPr>
+          <w:color w:val="000000" w:themeColor="text1"/>
+        </w:rPr>
+        <w:t>“Vue.js merupakan sebuah kerangka kerja JavaScript progresif berbasis o</w:t>
+      </w:r>
+      <w:r>
+        <w:rPr>
+          <w:i/>
+          <w:iCs/>
+          <w:color w:val="000000" w:themeColor="text1"/>
+        </w:rPr>
+        <w:t>pen source</w:t>
+      </w:r>
+      <w:r>
+        <w:rPr>
+          <w:color w:val="000000" w:themeColor="text1"/>
+        </w:rPr>
+        <w:t xml:space="preserve"> untuk membangun tampilan </w:t>
+      </w:r>
+      <w:r>
+        <w:rPr>
+          <w:i/>
+          <w:iCs/>
+          <w:color w:val="000000" w:themeColor="text1"/>
+        </w:rPr>
+        <w:t>user interface</w:t>
+      </w:r>
+      <w:r>
+        <w:rPr>
+          <w:color w:val="000000" w:themeColor="text1"/>
+        </w:rPr>
+        <w:t xml:space="preserve"> pada aplikasi berbasis </w:t>
+      </w:r>
+      <w:r>
+        <w:rPr>
+          <w:i/>
+          <w:iCs/>
+          <w:color w:val="000000" w:themeColor="text1"/>
+        </w:rPr>
+        <w:t>website</w:t>
+      </w:r>
+      <w:r>
+        <w:rPr>
+          <w:color w:val="000000" w:themeColor="text1"/>
+        </w:rPr>
+        <w:t xml:space="preserve">.” (Aryasta &amp; Cahyono, 2021: 2) </w:t>
+      </w:r>
+    </w:p>
+    <w:p>
+      <w:pPr>
+        <w:spacing w:line="480" w:lineRule="auto"/>
+        <w:ind w:firstLine="720"/>
+        <w:jc w:val="both"/>
+        <w:rPr>
+          <w:color w:val="000000" w:themeColor="text1"/>
+        </w:rPr>
+      </w:pPr>
+      <w:r>
+        <w:rPr>
+          <w:color w:val="000000" w:themeColor="text1"/>
+        </w:rPr>
+        <w:t xml:space="preserve">Dalam pengembangan aplikasi </w:t>
+      </w:r>
+      <w:r>
+        <w:rPr>
+          <w:i/>
+          <w:iCs/>
+          <w:color w:val="000000" w:themeColor="text1"/>
+        </w:rPr>
+        <w:t>web modern</w:t>
+      </w:r>
+      <w:r>
+        <w:rPr>
+          <w:color w:val="000000" w:themeColor="text1"/>
+        </w:rPr>
+        <w:t xml:space="preserve">, Vue.js banyak digunakan untuk membangun </w:t>
+      </w:r>
+      <w:r>
+        <w:rPr>
+          <w:i/>
+          <w:iCs/>
+          <w:color w:val="000000" w:themeColor="text1"/>
+        </w:rPr>
+        <w:t>Single Page Application</w:t>
+      </w:r>
+      <w:r>
+        <w:rPr>
+          <w:color w:val="000000" w:themeColor="text1"/>
+        </w:rPr>
+        <w:t xml:space="preserve"> (SPA). Konsep SPA memungkinkan seluruh konten aplikasi ditampilkan dalam satu halaman, sehingga perpindahan antar halaman tidak memerlukan proses pemuatan ulang (</w:t>
+      </w:r>
+      <w:r>
+        <w:rPr>
+          <w:i/>
+          <w:iCs/>
+          <w:color w:val="000000" w:themeColor="text1"/>
+        </w:rPr>
+        <w:t>reload</w:t>
+      </w:r>
+      <w:r>
+        <w:rPr>
+          <w:color w:val="000000" w:themeColor="text1"/>
+        </w:rPr>
+        <w:t xml:space="preserve">) secara keseluruhan (Krismanto &amp; Prihanto, 2024: 219). Hal ini berdampak pada peningkatan performa dan responsivitas aplikasi </w:t>
+      </w:r>
+      <w:r>
+        <w:rPr>
+          <w:i/>
+          <w:iCs/>
+          <w:color w:val="000000" w:themeColor="text1"/>
+        </w:rPr>
+        <w:t>web</w:t>
+      </w:r>
+      <w:r>
+        <w:rPr>
+          <w:color w:val="000000" w:themeColor="text1"/>
+        </w:rPr>
+        <w:t>. Jerry Yan Krismanto (2024) menjelaskan bahwa:</w:t>
+      </w:r>
+    </w:p>
+    <w:p>
+      <w:pPr>
+        <w:spacing w:line="480" w:lineRule="auto"/>
+        <w:ind w:left="720"/>
+        <w:jc w:val="both"/>
+        <w:rPr>
+          <w:color w:val="000000" w:themeColor="text1"/>
+        </w:rPr>
+      </w:pPr>
+      <w:r>
+        <w:rPr>
+          <w:i/>
+          <w:iCs/>
+          <w:color w:val="000000" w:themeColor="text1"/>
+        </w:rPr>
+        <w:t xml:space="preserve">“Single Page Application </w:t>
+      </w:r>
+      <w:r>
+        <w:rPr>
+          <w:color w:val="000000" w:themeColor="text1"/>
+        </w:rPr>
+        <w:t>adalah salah satu hasil perkembangan teknologi website yang memungkinkan seluruh konten</w:t>
+      </w:r>
+      <w:r>
+        <w:rPr>
+          <w:i/>
+          <w:iCs/>
+          <w:color w:val="000000" w:themeColor="text1"/>
+        </w:rPr>
+        <w:t xml:space="preserve"> website </w:t>
+      </w:r>
+      <w:r>
+        <w:rPr>
+          <w:color w:val="000000" w:themeColor="text1"/>
+        </w:rPr>
+        <w:t xml:space="preserve">ditampilkan dalam satu halaman.” (Krismanto &amp; Prihanto, 2024: 219) </w:t>
+      </w:r>
+    </w:p>
+    <w:p>
+      <w:pPr>
+        <w:spacing w:line="480" w:lineRule="auto"/>
+        <w:ind w:firstLine="720"/>
+        <w:jc w:val="both"/>
+        <w:rPr>
+          <w:color w:val="000000" w:themeColor="text1"/>
+        </w:rPr>
+      </w:pPr>
+      <w:r>
+        <w:rPr>
+          <w:color w:val="000000" w:themeColor="text1"/>
+        </w:rPr>
+        <w:lastRenderedPageBreak/>
+        <w:t xml:space="preserve">Vue.js bekerja dengan konsep </w:t>
+      </w:r>
+      <w:r>
+        <w:rPr>
+          <w:i/>
+          <w:iCs/>
+          <w:color w:val="000000" w:themeColor="text1"/>
+        </w:rPr>
+        <w:t>reactive data binding</w:t>
+      </w:r>
+      <w:r>
+        <w:rPr>
+          <w:color w:val="000000" w:themeColor="text1"/>
+        </w:rPr>
+        <w:t xml:space="preserve">, di mana setiap perubahan data yang diterima dari </w:t>
+      </w:r>
+      <w:r>
+        <w:rPr>
+          <w:i/>
+          <w:iCs/>
+          <w:color w:val="000000" w:themeColor="text1"/>
+        </w:rPr>
+        <w:t>server</w:t>
+      </w:r>
+      <w:r>
+        <w:rPr>
+          <w:color w:val="000000" w:themeColor="text1"/>
+        </w:rPr>
+        <w:t xml:space="preserve"> akan secara otomatis memperbarui tampilan antarmuka pengguna tanpa memuat ulang halaman </w:t>
+      </w:r>
+      <w:r>
+        <w:rPr>
+          <w:i/>
+          <w:iCs/>
+          <w:color w:val="000000" w:themeColor="text1"/>
+        </w:rPr>
+        <w:t>web</w:t>
+      </w:r>
+      <w:r>
+        <w:rPr>
+          <w:color w:val="000000" w:themeColor="text1"/>
+        </w:rPr>
+        <w:t xml:space="preserve">. Mekanisme ini sangat sesuai diterapkan pada sistem </w:t>
+      </w:r>
+      <w:r>
+        <w:rPr>
+          <w:i/>
+          <w:iCs/>
+          <w:color w:val="000000" w:themeColor="text1"/>
+        </w:rPr>
+        <w:t>monitoring</w:t>
+      </w:r>
+      <w:r>
+        <w:rPr>
+          <w:color w:val="000000" w:themeColor="text1"/>
+        </w:rPr>
+        <w:t xml:space="preserve"> yang membutuhkan pembaruan data secara terus-menerus dan </w:t>
+      </w:r>
+      <w:r>
+        <w:rPr>
+          <w:i/>
+          <w:iCs/>
+          <w:color w:val="000000" w:themeColor="text1"/>
+        </w:rPr>
+        <w:t xml:space="preserve">real-time </w:t>
+      </w:r>
+      <w:r>
+        <w:rPr>
+          <w:color w:val="000000" w:themeColor="text1"/>
+        </w:rPr>
+        <w:t>(Krismanto &amp; Prihanto, 2024: 225). Sebagaimana dijelaskan dalam penelitian Jerry Yan Krismanto (2024):</w:t>
+      </w:r>
+    </w:p>
+    <w:p>
+      <w:pPr>
+        <w:spacing w:line="480" w:lineRule="auto"/>
+        <w:ind w:left="720"/>
+        <w:jc w:val="both"/>
+        <w:rPr>
+          <w:color w:val="000000" w:themeColor="text1"/>
+        </w:rPr>
+      </w:pPr>
+      <w:r>
+        <w:rPr>
+          <w:i/>
+          <w:iCs/>
+          <w:color w:val="000000" w:themeColor="text1"/>
+        </w:rPr>
+        <w:t>“</w:t>
+      </w:r>
+      <w:r>
+        <w:rPr>
+          <w:color w:val="000000" w:themeColor="text1"/>
+        </w:rPr>
+        <w:t xml:space="preserve">Komponen Vue.js bersifat reaktif, maka segala perubahan data dapat dilacak dan tampilan akan berubah sesuai perubahan data.” (Krismanto &amp; Prihanto, 2024: 225) </w:t>
+      </w:r>
+    </w:p>
+    <w:p>
+      <w:pPr>
+        <w:spacing w:line="480" w:lineRule="auto"/>
+        <w:ind w:firstLine="720"/>
+        <w:jc w:val="both"/>
+        <w:rPr>
+          <w:color w:val="000000" w:themeColor="text1"/>
+        </w:rPr>
+      </w:pPr>
+      <w:r>
+        <w:rPr>
+          <w:color w:val="000000" w:themeColor="text1"/>
+        </w:rPr>
+        <w:t xml:space="preserve">Selain itu, Vue.js menerapkan arsitektur berbasis komponen, di mana setiap bagian antarmuka dapat dikembangkan sebagai komponen terpisah. Pendekatan ini memudahkan proses pengembangan, pemeliharaan, serta pengembangan lanjutan sistem </w:t>
+      </w:r>
+      <w:r>
+        <w:rPr>
+          <w:i/>
+          <w:iCs/>
+          <w:color w:val="000000" w:themeColor="text1"/>
+        </w:rPr>
+        <w:t>web</w:t>
+      </w:r>
+      <w:r>
+        <w:rPr>
+          <w:color w:val="000000" w:themeColor="text1"/>
+        </w:rPr>
+        <w:t xml:space="preserve"> (Sakti et al., 2024: 1731-1732). Hal tersebut didukung oleh penelitian Sakti et al. (2024) yang menyatakan bahwa:</w:t>
+      </w:r>
+    </w:p>
+    <w:p>
+      <w:pPr>
+        <w:spacing w:line="480" w:lineRule="auto"/>
+        <w:ind w:left="720"/>
+        <w:jc w:val="both"/>
+        <w:rPr>
+          <w:color w:val="000000" w:themeColor="text1"/>
+        </w:rPr>
+      </w:pPr>
+      <w:r>
+        <w:rPr>
+          <w:color w:val="000000" w:themeColor="text1"/>
+        </w:rPr>
+        <w:t xml:space="preserve">“Vue.js dapat dengan mudah diintegrasikan dengan proyek-proyek yang sudah ada, dan memiliki fitur-fitur seperti </w:t>
+      </w:r>
+      <w:r>
+        <w:rPr>
+          <w:i/>
+          <w:iCs/>
+          <w:color w:val="000000" w:themeColor="text1"/>
+        </w:rPr>
+        <w:t>directive, component,</w:t>
+      </w:r>
+      <w:r>
+        <w:rPr>
+          <w:color w:val="000000" w:themeColor="text1"/>
+        </w:rPr>
+        <w:t xml:space="preserve"> dan </w:t>
+      </w:r>
+      <w:r>
+        <w:rPr>
+          <w:i/>
+          <w:iCs/>
+          <w:color w:val="000000" w:themeColor="text1"/>
+        </w:rPr>
+        <w:t xml:space="preserve">template syntax </w:t>
+      </w:r>
+      <w:r>
+        <w:rPr>
+          <w:color w:val="000000" w:themeColor="text1"/>
+        </w:rPr>
+        <w:t xml:space="preserve">yang memudahkan pengembang untuk membangun aplikasi </w:t>
+      </w:r>
+      <w:r>
+        <w:rPr>
+          <w:i/>
+          <w:iCs/>
+          <w:color w:val="000000" w:themeColor="text1"/>
+        </w:rPr>
+        <w:t>web</w:t>
+      </w:r>
+      <w:r>
+        <w:rPr>
+          <w:color w:val="000000" w:themeColor="text1"/>
+        </w:rPr>
+        <w:t xml:space="preserve"> dengan lebih cepat dan efisien.” (Sakti et al., 2024: 1731-1732) </w:t>
+      </w:r>
+    </w:p>
+    <w:p>
+      <w:pPr>
+        <w:spacing w:line="480" w:lineRule="auto"/>
+        <w:ind w:firstLine="720"/>
+        <w:jc w:val="both"/>
+        <w:rPr>
+          <w:color w:val="000000" w:themeColor="text1"/>
+        </w:rPr>
+      </w:pPr>
+      <w:r>
+        <w:rPr>
+          <w:color w:val="000000" w:themeColor="text1"/>
+        </w:rPr>
+        <w:t xml:space="preserve">Dalam sistem berbasis </w:t>
+      </w:r>
+      <w:r>
+        <w:rPr>
+          <w:i/>
+          <w:iCs/>
+          <w:color w:val="000000" w:themeColor="text1"/>
+        </w:rPr>
+        <w:t>Internet of Things</w:t>
+      </w:r>
+      <w:r>
+        <w:rPr>
+          <w:color w:val="000000" w:themeColor="text1"/>
+        </w:rPr>
+        <w:t xml:space="preserve"> (IoT), Vue.js berperan sebagai </w:t>
+      </w:r>
+      <w:r>
+        <w:rPr>
+          <w:i/>
+          <w:iCs/>
+          <w:color w:val="000000" w:themeColor="text1"/>
+        </w:rPr>
+        <w:t>framework frontend</w:t>
+      </w:r>
+      <w:r>
+        <w:rPr>
+          <w:color w:val="000000" w:themeColor="text1"/>
+        </w:rPr>
+        <w:t xml:space="preserve"> yang menampilkan data hasil pengukuran sensor yang diperoleh dari </w:t>
+      </w:r>
+      <w:r>
+        <w:rPr>
+          <w:i/>
+          <w:iCs/>
+          <w:color w:val="000000" w:themeColor="text1"/>
+        </w:rPr>
+        <w:t>backend server</w:t>
+      </w:r>
+      <w:r>
+        <w:rPr>
+          <w:color w:val="000000" w:themeColor="text1"/>
+        </w:rPr>
+        <w:t xml:space="preserve"> melalui REST API. Data tersebut kemudian disajikan </w:t>
+      </w:r>
+      <w:r>
+        <w:rPr>
+          <w:color w:val="000000" w:themeColor="text1"/>
+        </w:rPr>
+        <w:lastRenderedPageBreak/>
+        <w:t xml:space="preserve">dalam bentuk grafik, tabel, dan indikator visual sehingga memudahkan pengguna dalam melakukan pemantauan sistem secara </w:t>
+      </w:r>
+      <w:r>
+        <w:rPr>
+          <w:i/>
+          <w:iCs/>
+          <w:color w:val="000000" w:themeColor="text1"/>
+        </w:rPr>
+        <w:t>real-time</w:t>
+      </w:r>
+      <w:r>
+        <w:rPr>
+          <w:color w:val="000000" w:themeColor="text1"/>
+        </w:rPr>
+        <w:t>.</w:t>
+      </w:r>
+    </w:p>
+    <w:p>
+      <w:pPr>
+        <w:spacing w:line="480" w:lineRule="auto"/>
+        <w:ind w:firstLine="720"/>
+        <w:jc w:val="both"/>
+        <w:rPr>
+          <w:color w:val="000000" w:themeColor="text1"/>
+        </w:rPr>
+      </w:pPr>
+      <w:r>
+        <w:rPr>
+          <w:color w:val="000000" w:themeColor="text1"/>
+        </w:rPr>
+        <w:t xml:space="preserve">Berdasarkan uraian tersebut, Vue.js pada penelitian ini digunakan sebagai teknologi </w:t>
+      </w:r>
+      <w:r>
+        <w:rPr>
+          <w:i/>
+          <w:iCs/>
+          <w:color w:val="000000" w:themeColor="text1"/>
+        </w:rPr>
+        <w:t>frontend</w:t>
+      </w:r>
+      <w:r>
+        <w:rPr>
+          <w:color w:val="000000" w:themeColor="text1"/>
+        </w:rPr>
+        <w:t xml:space="preserve"> untuk membangun antarmuka </w:t>
+      </w:r>
+      <w:r>
+        <w:rPr>
+          <w:i/>
+          <w:iCs/>
+          <w:color w:val="000000" w:themeColor="text1"/>
+        </w:rPr>
+        <w:t>website monitoring</w:t>
+      </w:r>
+      <w:r>
+        <w:rPr>
+          <w:color w:val="000000" w:themeColor="text1"/>
+        </w:rPr>
+        <w:t xml:space="preserve"> konsumsi energi listrik. Penggunaan Vue.js diharapkan mampu menghasilkan tampilan yang responsif, interaktif, dan mudah dikembangkan sesuai kebutuhan sistem </w:t>
+      </w:r>
+      <w:r>
+        <w:rPr>
+          <w:i/>
+          <w:iCs/>
+          <w:color w:val="000000" w:themeColor="text1"/>
+        </w:rPr>
+        <w:t>monitoring</w:t>
+      </w:r>
+      <w:r>
+        <w:rPr>
+          <w:color w:val="000000" w:themeColor="text1"/>
+        </w:rPr>
+        <w:t xml:space="preserve"> berbasis </w:t>
+      </w:r>
+      <w:r>
+        <w:rPr>
+          <w:i/>
+          <w:iCs/>
+          <w:color w:val="000000" w:themeColor="text1"/>
+        </w:rPr>
+        <w:t>Internet of Things</w:t>
+      </w:r>
+      <w:r>
+        <w:rPr>
+          <w:color w:val="000000" w:themeColor="text1"/>
+        </w:rPr>
+        <w:t>.</w:t>
+      </w:r>
+    </w:p>
+    <w:p>
+      <w:pPr>
+        <w:spacing w:line="480" w:lineRule="auto"/>
+        <w:ind w:firstLine="720"/>
+        <w:jc w:val="both"/>
+        <w:rPr>
+          <w:color w:val="000000" w:themeColor="text1"/>
+        </w:rPr>
+      </w:pPr>
+      <w:r>
+        <w:rPr>
+          <w:color w:val="000000" w:themeColor="text1"/>
+        </w:rPr>
+        <w:t xml:space="preserve">Dalam konteks sistem monitoring energi berbasis </w:t>
+      </w:r>
+      <w:r>
+        <w:rPr>
+          <w:i/>
+          <w:iCs/>
+          <w:color w:val="000000" w:themeColor="text1"/>
+        </w:rPr>
+        <w:t>Internet of Things</w:t>
+      </w:r>
+      <w:r>
+        <w:rPr>
+          <w:color w:val="000000" w:themeColor="text1"/>
+        </w:rPr>
+        <w:t xml:space="preserve">, Vue.js berfungsi sebagai antarmuka pengguna yang menampilkan informasi konsumsi energi listrik lampu dan kipas angin secara </w:t>
+      </w:r>
+      <w:r>
+        <w:rPr>
+          <w:i/>
+          <w:iCs/>
+          <w:color w:val="000000" w:themeColor="text1"/>
+        </w:rPr>
+        <w:t>real-time</w:t>
+      </w:r>
+      <w:r>
+        <w:rPr>
+          <w:color w:val="000000" w:themeColor="text1"/>
+        </w:rPr>
+        <w:t>. Dengan tampilan yang interaktif dan responsif, Vue.js membantu pengguna memahami pola penggunaan energi dan mendukung proses pengambilan keputusan terkait efisiensi energi.</w:t>
+      </w:r>
+    </w:p>
+    <w:p>
+      <w:pPr>
+        <w:pStyle w:val="Heading3"/>
+      </w:pPr>
+      <w:r>
+        <w:t xml:space="preserve">2.1.14 </w:t>
+      </w:r>
+      <w:r>
+        <w:tab/>
+        <w:t>Java Spring Boot</w:t>
+      </w:r>
+    </w:p>
+    <w:p>
+      <w:pPr>
+        <w:spacing w:line="480" w:lineRule="auto"/>
+        <w:ind w:firstLine="720"/>
+        <w:jc w:val="both"/>
+        <w:rPr>
+          <w:color w:val="000000" w:themeColor="text1"/>
+        </w:rPr>
+      </w:pPr>
+      <w:r>
+        <w:rPr>
+          <w:color w:val="000000" w:themeColor="text1"/>
+        </w:rPr>
+        <w:t xml:space="preserve">Java Spring Boot merupakan </w:t>
+      </w:r>
+      <w:r>
+        <w:rPr>
+          <w:i/>
+          <w:iCs/>
+          <w:color w:val="000000" w:themeColor="text1"/>
+        </w:rPr>
+        <w:t>framework</w:t>
+      </w:r>
+      <w:r>
+        <w:rPr>
+          <w:color w:val="000000" w:themeColor="text1"/>
+        </w:rPr>
+        <w:t xml:space="preserve"> berbasis Java yang digunakan untuk membangun aplikasi </w:t>
+      </w:r>
+      <w:r>
+        <w:rPr>
+          <w:i/>
+          <w:iCs/>
+          <w:color w:val="000000" w:themeColor="text1"/>
+        </w:rPr>
+        <w:t>backend</w:t>
+      </w:r>
+      <w:r>
+        <w:rPr>
+          <w:color w:val="000000" w:themeColor="text1"/>
+        </w:rPr>
+        <w:t xml:space="preserve"> secara cepat, terstruktur, dan mudah dikembangkan. Spring Boot dirancang untuk menyederhanakan proses pengembangan aplikasi berbasis Spring dengan menyediakan konfigurasi otomatis (</w:t>
+      </w:r>
+      <w:r>
+        <w:rPr>
+          <w:i/>
+          <w:iCs/>
+          <w:color w:val="000000" w:themeColor="text1"/>
+        </w:rPr>
+        <w:t>auto-configuration</w:t>
+      </w:r>
+      <w:r>
+        <w:rPr>
+          <w:color w:val="000000" w:themeColor="text1"/>
+        </w:rPr>
+        <w:t>), sehingga pengembang tidak perlu melakukan pengaturan yang kompleks.</w:t>
+      </w:r>
+    </w:p>
+    <w:p>
+      <w:pPr>
+        <w:spacing w:line="480" w:lineRule="auto"/>
+        <w:ind w:firstLine="720"/>
+        <w:jc w:val="both"/>
+        <w:rPr>
+          <w:color w:val="000000" w:themeColor="text1"/>
+        </w:rPr>
+      </w:pPr>
+      <w:r>
+        <w:rPr>
+          <w:color w:val="000000" w:themeColor="text1"/>
+        </w:rPr>
+        <w:t xml:space="preserve">Dalam sistem berbasis </w:t>
+      </w:r>
+      <w:r>
+        <w:rPr>
+          <w:i/>
+          <w:iCs/>
+          <w:color w:val="000000" w:themeColor="text1"/>
+        </w:rPr>
+        <w:t>Internet of Things</w:t>
+      </w:r>
+      <w:r>
+        <w:rPr>
+          <w:color w:val="000000" w:themeColor="text1"/>
+        </w:rPr>
+        <w:t xml:space="preserve"> (IoT), Spring Boot sering digunakan sebagai </w:t>
+      </w:r>
+      <w:r>
+        <w:rPr>
+          <w:i/>
+          <w:iCs/>
+          <w:color w:val="000000" w:themeColor="text1"/>
+        </w:rPr>
+        <w:t>backend server</w:t>
+      </w:r>
+      <w:r>
+        <w:rPr>
+          <w:color w:val="000000" w:themeColor="text1"/>
+        </w:rPr>
+        <w:t xml:space="preserve"> yang berfungsi untuk menerima data dari perangkat IoT, mengelola proses bisnis, serta menyediakan layanan </w:t>
+      </w:r>
+      <w:r>
+        <w:rPr>
+          <w:i/>
+          <w:iCs/>
+          <w:color w:val="000000" w:themeColor="text1"/>
+        </w:rPr>
+        <w:t xml:space="preserve">Application </w:t>
+      </w:r>
+      <w:r>
+        <w:rPr>
+          <w:i/>
+          <w:iCs/>
+          <w:color w:val="000000" w:themeColor="text1"/>
+        </w:rPr>
+        <w:lastRenderedPageBreak/>
+        <w:t>Programming Interface</w:t>
+      </w:r>
+      <w:r>
+        <w:rPr>
+          <w:color w:val="000000" w:themeColor="text1"/>
+        </w:rPr>
+        <w:t xml:space="preserve"> (API) yang dapat diakses oleh </w:t>
+      </w:r>
+      <w:r>
+        <w:rPr>
+          <w:i/>
+          <w:iCs/>
+          <w:color w:val="000000" w:themeColor="text1"/>
+        </w:rPr>
+        <w:t>frontend website</w:t>
+      </w:r>
+      <w:r>
+        <w:rPr>
+          <w:color w:val="000000" w:themeColor="text1"/>
+        </w:rPr>
+        <w:t xml:space="preserve">. Spring Boot sangat sesuai digunakan pada sistem </w:t>
+      </w:r>
+      <w:r>
+        <w:rPr>
+          <w:i/>
+          <w:iCs/>
+          <w:color w:val="000000" w:themeColor="text1"/>
+        </w:rPr>
+        <w:t>monitoring</w:t>
+      </w:r>
+      <w:r>
+        <w:rPr>
+          <w:color w:val="000000" w:themeColor="text1"/>
+        </w:rPr>
+        <w:t xml:space="preserve"> karena mampu menangani komunikasi data secara </w:t>
+      </w:r>
+      <w:r>
+        <w:rPr>
+          <w:i/>
+          <w:iCs/>
+          <w:color w:val="000000" w:themeColor="text1"/>
+        </w:rPr>
+        <w:t>real-time</w:t>
+      </w:r>
+      <w:r>
+        <w:rPr>
+          <w:color w:val="000000" w:themeColor="text1"/>
+        </w:rPr>
+        <w:t xml:space="preserve"> dan terintegrasi dengan basis data (Veena R. S., 2024: 3).</w:t>
+      </w:r>
+    </w:p>
+    <w:p>
+      <w:pPr>
+        <w:spacing w:line="480" w:lineRule="auto"/>
+        <w:ind w:firstLine="720"/>
+        <w:jc w:val="both"/>
+        <w:rPr>
+          <w:color w:val="000000" w:themeColor="text1"/>
+        </w:rPr>
+      </w:pPr>
+      <w:r>
+        <w:rPr>
+          <w:color w:val="000000" w:themeColor="text1"/>
+        </w:rPr>
+        <w:t>Menurut Veena R. S., (2024) Spring Boot memiliki keunggulan dalam penyederhanaan pengembangan aplikasi backend, sebagaimana dinyatakan bahwa:</w:t>
+      </w:r>
+    </w:p>
+    <w:p>
+      <w:pPr>
+        <w:spacing w:line="480" w:lineRule="auto"/>
+        <w:ind w:left="720"/>
+        <w:jc w:val="both"/>
+        <w:rPr>
+          <w:i/>
+          <w:iCs/>
+          <w:color w:val="000000" w:themeColor="text1"/>
+        </w:rPr>
+      </w:pPr>
+      <w:r>
+        <w:rPr>
+          <w:i/>
+          <w:iCs/>
+          <w:color w:val="000000" w:themeColor="text1"/>
+        </w:rPr>
+        <w:t xml:space="preserve">“Spring Boot simplifies the development and deployment of production-grade applications with minimal setup” (Veena R. S., 2024: 3) </w:t>
+      </w:r>
+    </w:p>
+    <w:p>
+      <w:pPr>
+        <w:spacing w:line="480" w:lineRule="auto"/>
+        <w:ind w:firstLine="720"/>
+        <w:jc w:val="both"/>
+        <w:rPr>
+          <w:color w:val="000000" w:themeColor="text1"/>
+        </w:rPr>
+      </w:pPr>
+      <w:r>
+        <w:rPr>
+          <w:color w:val="000000" w:themeColor="text1"/>
+        </w:rPr>
+        <w:t xml:space="preserve">Spring Boot mendukung arsitektur RESTful API, sehingga memungkinkan perangkat IoT seperti </w:t>
+      </w:r>
+      <w:r>
+        <w:rPr>
+          <w:color w:val="000000" w:themeColor="text1"/>
+        </w:rPr>
+        <w:t>ESP8266</w:t>
+      </w:r>
+      <w:r>
+        <w:rPr>
+          <w:color w:val="000000" w:themeColor="text1"/>
+        </w:rPr>
+        <w:t xml:space="preserve"> untuk mengirimkan data sensor ke </w:t>
+      </w:r>
+      <w:r>
+        <w:rPr>
+          <w:i/>
+          <w:iCs/>
+          <w:color w:val="000000" w:themeColor="text1"/>
+        </w:rPr>
+        <w:t>server</w:t>
+      </w:r>
+      <w:r>
+        <w:rPr>
+          <w:color w:val="000000" w:themeColor="text1"/>
+        </w:rPr>
+        <w:t xml:space="preserve"> menggunakan protokol HTTP. Data yang diterima oleh server kemudian dapat disimpan ke dalam basis data dan diakses kembali oleh aplikasi </w:t>
+      </w:r>
+      <w:r>
+        <w:rPr>
+          <w:i/>
+          <w:iCs/>
+          <w:color w:val="000000" w:themeColor="text1"/>
+        </w:rPr>
+        <w:t>frontend</w:t>
+      </w:r>
+      <w:r>
+        <w:rPr>
+          <w:color w:val="000000" w:themeColor="text1"/>
+        </w:rPr>
+        <w:t>.</w:t>
+      </w:r>
+    </w:p>
+    <w:p>
+      <w:pPr>
+        <w:spacing w:line="480" w:lineRule="auto"/>
+        <w:ind w:firstLine="720"/>
+        <w:jc w:val="both"/>
+        <w:rPr>
+          <w:color w:val="000000" w:themeColor="text1"/>
+        </w:rPr>
+      </w:pPr>
+      <w:r>
+        <w:rPr>
+          <w:color w:val="000000" w:themeColor="text1"/>
+        </w:rPr>
+        <w:t xml:space="preserve">Dalam penelitian integrasi IoT dan Spring Boot dijelaskan bahwa Spring Boot berperan sebagai penghubung antara perangkat IoT dan sistem aplikasi berbasis </w:t>
+      </w:r>
+      <w:r>
+        <w:rPr>
+          <w:i/>
+          <w:iCs/>
+          <w:color w:val="000000" w:themeColor="text1"/>
+        </w:rPr>
+        <w:t>web</w:t>
+      </w:r>
+      <w:r>
+        <w:rPr>
+          <w:color w:val="000000" w:themeColor="text1"/>
+        </w:rPr>
+        <w:t>:</w:t>
+      </w:r>
+    </w:p>
+    <w:p>
+      <w:pPr>
+        <w:spacing w:line="480" w:lineRule="auto"/>
+        <w:ind w:left="720"/>
+        <w:jc w:val="both"/>
+        <w:rPr>
+          <w:i/>
+          <w:iCs/>
+          <w:color w:val="000000" w:themeColor="text1"/>
+        </w:rPr>
+      </w:pPr>
+      <w:r>
+        <w:rPr>
+          <w:i/>
+          <w:iCs/>
+          <w:color w:val="000000" w:themeColor="text1"/>
+        </w:rPr>
+        <w:t xml:space="preserve">“The combination of IoT’s sensor data collection and Spring Boot’s robust backend architecture creates a dynamic ecosystem capable of accommodating diverse healthcare devices and efficiently handling the growing volume of health-related data. As” (Veena R. S., 2024: 7) </w:t>
+      </w:r>
+    </w:p>
+    <w:p>
+      <w:pPr>
+        <w:spacing w:line="480" w:lineRule="auto"/>
+        <w:ind w:firstLine="720"/>
+        <w:jc w:val="both"/>
+        <w:rPr>
+          <w:color w:val="000000" w:themeColor="text1"/>
+        </w:rPr>
+      </w:pPr>
+      <w:r>
+        <w:rPr>
+          <w:color w:val="000000" w:themeColor="text1"/>
+        </w:rPr>
+        <w:t xml:space="preserve">Keunggulan lain dari Spring Boot adalah kemampuannya untuk terintegrasi dengan berbagai jenis basis data, termasuk database NoSQL seperti </w:t>
+      </w:r>
+      <w:r>
+        <w:rPr>
+          <w:color w:val="000000" w:themeColor="text1"/>
+        </w:rPr>
+        <w:t>PostgreSQL</w:t>
+      </w:r>
+      <w:r>
+        <w:rPr>
+          <w:color w:val="000000" w:themeColor="text1"/>
+        </w:rPr>
+        <w:t xml:space="preserve">DB. Integrasi ini memungkinkan penyimpanan data monitoring energi </w:t>
+      </w:r>
+      <w:r>
+        <w:rPr>
+          <w:color w:val="000000" w:themeColor="text1"/>
+        </w:rPr>
+        <w:lastRenderedPageBreak/>
+        <w:t>secara fleksibel dan efisien. Selain itu, Spring Boot juga mendukung pengembangan sistem yang bersifat modular sehingga mudah dikembangkan dan dipelihara.</w:t>
+      </w:r>
+    </w:p>
+    <w:p>
+      <w:pPr>
+        <w:spacing w:line="480" w:lineRule="auto"/>
+        <w:ind w:firstLine="720"/>
+        <w:jc w:val="both"/>
+        <w:rPr>
+          <w:color w:val="000000" w:themeColor="text1"/>
+        </w:rPr>
+      </w:pPr>
+      <w:r>
+        <w:rPr>
+          <w:color w:val="000000" w:themeColor="text1"/>
+        </w:rPr>
+        <w:t xml:space="preserve">Dalam konteks sistem </w:t>
+      </w:r>
+      <w:r>
+        <w:rPr>
+          <w:i/>
+          <w:iCs/>
+          <w:color w:val="000000" w:themeColor="text1"/>
+        </w:rPr>
+        <w:t>monitoring</w:t>
+      </w:r>
+      <w:r>
+        <w:rPr>
+          <w:color w:val="000000" w:themeColor="text1"/>
+        </w:rPr>
+        <w:t xml:space="preserve"> konsumsi energi listrik, Spring Boot berfungsi sebagai </w:t>
+      </w:r>
+      <w:r>
+        <w:rPr>
+          <w:i/>
+          <w:iCs/>
+          <w:color w:val="000000" w:themeColor="text1"/>
+        </w:rPr>
+        <w:t>backend</w:t>
+      </w:r>
+      <w:r>
+        <w:rPr>
+          <w:color w:val="000000" w:themeColor="text1"/>
+        </w:rPr>
+        <w:t xml:space="preserve"> yang mengelola data hasil pengukuran dari sensor PZEM-004T. Data tersebut diproses dan disimpan dalam basis data, kemudian disediakan kepada </w:t>
+      </w:r>
+      <w:r>
+        <w:rPr>
+          <w:i/>
+          <w:iCs/>
+          <w:color w:val="000000" w:themeColor="text1"/>
+        </w:rPr>
+        <w:t>website</w:t>
+      </w:r>
+      <w:r>
+        <w:rPr>
+          <w:color w:val="000000" w:themeColor="text1"/>
+        </w:rPr>
+        <w:t xml:space="preserve"> melalui REST API untuk ditampilkan kepada pengguna. Dengan demikian, Java Spring Boot berperan penting dalam menjamin komunikasi data yang andal, terstruktur, dan terintegrasi dalam sistem monitoring energi berbasis </w:t>
+      </w:r>
+      <w:r>
+        <w:rPr>
+          <w:i/>
+          <w:iCs/>
+          <w:color w:val="000000" w:themeColor="text1"/>
+        </w:rPr>
+        <w:t>Internet of Things</w:t>
       </w:r>
       <w:r>
         <w:rPr>

</xml_diff>

<commit_message>
front still on prog
</commit_message>
<xml_diff>
--- a/docx.docx
+++ b/docx.docx
@@ -2,6 +2,1785 @@
 <file path=word/document.xml><?xml version="1.0" encoding="utf-8"?>
 <w:document xmlns:wpc="http://schemas.microsoft.com/office/word/2010/wordprocessingCanvas" xmlns:cx="http://schemas.microsoft.com/office/drawing/2014/chartex" xmlns:cx1="http://schemas.microsoft.com/office/drawing/2015/9/8/chartex" xmlns:cx2="http://schemas.microsoft.com/office/drawing/2015/10/21/chartex" xmlns:cx3="http://schemas.microsoft.com/office/drawing/2016/5/9/chartex" xmlns:cx4="http://schemas.microsoft.com/office/drawing/2016/5/10/chartex" xmlns:cx5="http://schemas.microsoft.com/office/drawing/2016/5/11/chartex" xmlns:cx6="http://schemas.microsoft.com/office/drawing/2016/5/12/chartex" xmlns:cx7="http://schemas.microsoft.com/office/drawing/2016/5/13/chartex" xmlns:cx8="http://schemas.microsoft.com/office/drawing/2016/5/14/chartex" xmlns:mc="http://schemas.openxmlformats.org/markup-compatibility/2006" xmlns:aink="http://schemas.microsoft.com/office/drawing/2016/ink" xmlns:am3d="http://schemas.microsoft.com/office/drawing/2017/model3d" xmlns:o="urn:schemas-microsoft-com:office:office" xmlns:oel="http://schemas.microsoft.com/office/2019/extlst" xmlns:r="http://schemas.openxmlformats.org/officeDocument/2006/relationships" xmlns:m="http://schemas.openxmlformats.org/officeDocument/2006/math" xmlns:v="urn:schemas-microsoft-com:vml" xmlns:wp14="http://schemas.microsoft.com/office/word/2010/wordprocessingDrawing" xmlns:wp="http://schemas.openxmlformats.org/drawingml/2006/wordprocessingDrawing" xmlns:w10="urn:schemas-microsoft-com:office:word" xmlns:w="http://schemas.openxmlformats.org/wordprocessingml/2006/main" xmlns:w14="http://schemas.microsoft.com/office/word/2010/wordml" xmlns:w15="http://schemas.microsoft.com/office/word/2012/wordml" xmlns:w16cex="http://schemas.microsoft.com/office/word/2018/wordml/cex" xmlns:w16cid="http://schemas.microsoft.com/office/word/2016/wordml/cid" xmlns:w16="http://schemas.microsoft.com/office/word/2018/wordml" xmlns:w16du="http://schemas.microsoft.com/office/word/2023/wordml/word16du" xmlns:w16sdtdh="http://schemas.microsoft.com/office/word/2020/wordml/sdtdatahash" xmlns:w16sdtfl="http://schemas.microsoft.com/office/word/2024/wordml/sdtformatlock" xmlns:w16se="http://schemas.microsoft.com/office/word/2015/wordml/symex" xmlns:wpg="http://schemas.microsoft.com/office/word/2010/wordprocessingGroup" xmlns:wpi="http://schemas.microsoft.com/office/word/2010/wordprocessingInk" xmlns:wne="http://schemas.microsoft.com/office/word/2006/wordml" xmlns:wps="http://schemas.microsoft.com/office/word/2010/wordprocessingShape" mc:Ignorable="w14 w15 w16se w16cid w16 w16cex w16sdtdh w16sdtfl w16du wp14">
   <w:body>
+    <w:p>
+      <w:pPr>
+        <w:pStyle w:val="Heading1"/>
+        <w:numPr>
+          <w:ilvl w:val="0"/>
+          <w:numId w:val="0"/>
+        </w:numPr>
+        <w:spacing w:before="0" w:after="0" w:line="360" w:lineRule="auto"/>
+      </w:pPr>
+      <w:r>
+        <w:t>PERANCANGAN SISTEM MONITORING KONSUMSI</w:t>
+      </w:r>
+    </w:p>
+    <w:p>
+      <w:pPr>
+        <w:pStyle w:val="Heading1"/>
+        <w:numPr>
+          <w:ilvl w:val="0"/>
+          <w:numId w:val="0"/>
+        </w:numPr>
+        <w:spacing w:before="0" w:after="0" w:line="360" w:lineRule="auto"/>
+      </w:pPr>
+      <w:r>
+        <w:t>ENERGI LAMPU DAN KIPAS ANGIN PADA MUSALA</w:t>
+      </w:r>
+    </w:p>
+    <w:p>
+      <w:pPr>
+        <w:pStyle w:val="Heading1"/>
+        <w:numPr>
+          <w:ilvl w:val="0"/>
+          <w:numId w:val="0"/>
+        </w:numPr>
+        <w:spacing w:before="0" w:after="0" w:line="360" w:lineRule="auto"/>
+      </w:pPr>
+      <w:r>
+        <w:rPr>
+          <w:lang w:val="id-ID"/>
+        </w:rPr>
+        <w:t>AL BARKAH</w:t>
+      </w:r>
+      <w:r>
+        <w:t xml:space="preserve"> BERBASISINTERNET OF THINGS</w:t>
+      </w:r>
+    </w:p>
+    <w:p>
+      <w:pPr>
+        <w:jc w:val="center"/>
+        <w:rPr>
+          <w:b/>
+          <w:bCs/>
+          <w:color w:val="000000" w:themeColor="text1"/>
+          <w:sz w:val="28"/>
+          <w:szCs w:val="28"/>
+        </w:rPr>
+      </w:pPr>
+    </w:p>
+    <w:p>
+      <w:pPr>
+        <w:jc w:val="center"/>
+        <w:rPr>
+          <w:b/>
+          <w:bCs/>
+          <w:color w:val="000000" w:themeColor="text1"/>
+          <w:sz w:val="28"/>
+          <w:szCs w:val="28"/>
+        </w:rPr>
+      </w:pPr>
+    </w:p>
+    <w:p>
+      <w:pPr>
+        <w:ind w:left="318"/>
+        <w:jc w:val="center"/>
+      </w:pPr>
+      <w:r>
+        <w:rPr>
+          <w:noProof/>
+        </w:rPr>
+        <w:drawing>
+          <wp:inline distT="0" distB="0" distL="0" distR="0" wp14:anchorId="47E0017C" wp14:editId="000A2BA8">
+            <wp:extent cx="2284592" cy="698400"/>
+            <wp:effectExtent l="0" t="0" r="1905" b="0"/>
+            <wp:docPr id="32347" name="Picture 32347" descr="A logo with green and yellow text&#10;&#10;AI-generated content may be incorrect."/>
+            <wp:cNvGraphicFramePr/>
+            <a:graphic xmlns:a="http://schemas.openxmlformats.org/drawingml/2006/main">
+              <a:graphicData uri="http://schemas.openxmlformats.org/drawingml/2006/picture">
+                <pic:pic xmlns:pic="http://schemas.openxmlformats.org/drawingml/2006/picture">
+                  <pic:nvPicPr>
+                    <pic:cNvPr id="32347" name="Picture 32347" descr="A logo with green and yellow text&#10;&#10;AI-generated content may be incorrect."/>
+                    <pic:cNvPicPr/>
+                  </pic:nvPicPr>
+                  <pic:blipFill>
+                    <a:blip r:embed="rId7"/>
+                    <a:stretch>
+                      <a:fillRect/>
+                    </a:stretch>
+                  </pic:blipFill>
+                  <pic:spPr>
+                    <a:xfrm>
+                      <a:off x="0" y="0"/>
+                      <a:ext cx="2284592" cy="698400"/>
+                    </a:xfrm>
+                    <a:prstGeom prst="rect">
+                      <a:avLst/>
+                    </a:prstGeom>
+                  </pic:spPr>
+                </pic:pic>
+              </a:graphicData>
+            </a:graphic>
+          </wp:inline>
+        </w:drawing>
+      </w:r>
+    </w:p>
+    <w:p>
+      <w:pPr>
+        <w:ind w:right="2572"/>
+        <w:jc w:val="center"/>
+      </w:pPr>
+    </w:p>
+    <w:p>
+      <w:pPr>
+        <w:spacing w:after="157" w:line="216" w:lineRule="auto"/>
+        <w:ind w:right="9301"/>
+        <w:jc w:val="center"/>
+        <w:rPr>
+          <w:sz w:val="20"/>
+        </w:rPr>
+      </w:pPr>
+    </w:p>
+    <w:p>
+      <w:pPr>
+        <w:spacing w:after="157" w:line="216" w:lineRule="auto"/>
+        <w:ind w:right="9301"/>
+        <w:jc w:val="center"/>
+      </w:pPr>
+    </w:p>
+    <w:p>
+      <w:pPr>
+        <w:spacing w:line="360" w:lineRule="auto"/>
+        <w:ind w:left="270"/>
+        <w:jc w:val="center"/>
+        <w:rPr>
+          <w:bCs/>
+          <w:sz w:val="36"/>
+          <w:szCs w:val="36"/>
+        </w:rPr>
+      </w:pPr>
+      <w:r>
+        <w:rPr>
+          <w:bCs/>
+          <w:sz w:val="36"/>
+          <w:szCs w:val="36"/>
+        </w:rPr>
+        <w:t>SKRIPSI</w:t>
+      </w:r>
+    </w:p>
+    <w:p>
+      <w:pPr>
+        <w:ind w:left="79"/>
+        <w:jc w:val="center"/>
+      </w:pPr>
+      <w:r>
+        <w:t>Diajukan untuk memenuhi salah satu syarat kelulusan Program Sarjana (S1)</w:t>
+      </w:r>
+    </w:p>
+    <w:p>
+      <w:pPr>
+        <w:spacing w:after="68" w:line="216" w:lineRule="auto"/>
+        <w:ind w:right="9301"/>
+        <w:jc w:val="center"/>
+      </w:pPr>
+    </w:p>
+    <w:p>
+      <w:pPr>
+        <w:jc w:val="center"/>
+      </w:pPr>
+    </w:p>
+    <w:p>
+      <w:pPr>
+        <w:spacing w:line="360" w:lineRule="auto"/>
+      </w:pPr>
+    </w:p>
+    <w:p>
+      <w:pPr>
+        <w:spacing w:after="0" w:line="360" w:lineRule="auto"/>
+        <w:jc w:val="center"/>
+        <w:rPr>
+          <w:sz w:val="28"/>
+          <w:szCs w:val="28"/>
+        </w:rPr>
+      </w:pPr>
+      <w:r>
+        <w:rPr>
+          <w:sz w:val="28"/>
+          <w:szCs w:val="28"/>
+        </w:rPr>
+        <w:t>M.RIZKI MAULANA</w:t>
+      </w:r>
+    </w:p>
+    <w:p>
+      <w:pPr>
+        <w:spacing w:after="0" w:line="360" w:lineRule="auto"/>
+        <w:jc w:val="center"/>
+        <w:rPr>
+          <w:sz w:val="28"/>
+          <w:szCs w:val="28"/>
+        </w:rPr>
+      </w:pPr>
+      <w:r>
+        <w:rPr>
+          <w:sz w:val="28"/>
+          <w:szCs w:val="28"/>
+        </w:rPr>
+        <w:t>202131006</w:t>
+      </w:r>
+      <w:r>
+        <w:rPr>
+          <w:sz w:val="28"/>
+          <w:szCs w:val="28"/>
+        </w:rPr>
+        <w:t>6</w:t>
+      </w:r>
+    </w:p>
+    <w:p>
+      <w:pPr>
+        <w:spacing w:line="360" w:lineRule="auto"/>
+        <w:ind w:left="276" w:right="3" w:hanging="10"/>
+        <w:jc w:val="center"/>
+        <w:rPr>
+          <w:b/>
+          <w:sz w:val="28"/>
+          <w:szCs w:val="28"/>
+        </w:rPr>
+      </w:pPr>
+    </w:p>
+    <w:p>
+      <w:pPr>
+        <w:spacing w:line="360" w:lineRule="auto"/>
+        <w:ind w:left="276" w:right="3" w:hanging="10"/>
+        <w:jc w:val="center"/>
+        <w:rPr>
+          <w:b/>
+          <w:sz w:val="28"/>
+          <w:szCs w:val="28"/>
+        </w:rPr>
+      </w:pPr>
+    </w:p>
+    <w:p>
+      <w:pPr>
+        <w:spacing w:after="0" w:line="360" w:lineRule="auto"/>
+        <w:ind w:left="79"/>
+        <w:jc w:val="center"/>
+      </w:pPr>
+      <w:r>
+        <w:t>PROGRAM STUDI TEKNIK INFORMATIKA</w:t>
+      </w:r>
+    </w:p>
+    <w:p>
+      <w:pPr>
+        <w:spacing w:after="0" w:line="360" w:lineRule="auto"/>
+        <w:ind w:left="79"/>
+        <w:jc w:val="center"/>
+      </w:pPr>
+      <w:r>
+        <w:t>FAKULTAS INFORMATIKA DAN DESAIN</w:t>
+      </w:r>
+    </w:p>
+    <w:p>
+      <w:pPr>
+        <w:spacing w:after="0" w:line="360" w:lineRule="auto"/>
+        <w:ind w:left="79"/>
+        <w:jc w:val="center"/>
+      </w:pPr>
+      <w:r>
+        <w:t>UNIVERSITAS BINA INSANI</w:t>
+      </w:r>
+    </w:p>
+    <w:p>
+      <w:pPr>
+        <w:spacing w:after="0" w:line="360" w:lineRule="auto"/>
+        <w:ind w:left="79"/>
+        <w:jc w:val="center"/>
+      </w:pPr>
+      <w:r>
+        <w:t>BEKASI</w:t>
+      </w:r>
+    </w:p>
+    <w:p>
+      <w:pPr>
+        <w:spacing w:after="0" w:line="360" w:lineRule="auto"/>
+        <w:ind w:left="79"/>
+        <w:jc w:val="center"/>
+      </w:pPr>
+      <w:r>
+        <w:t>2025</w:t>
+      </w:r>
+    </w:p>
+    <w:p/>
+    <w:p>
+      <w:pPr>
+        <w:pStyle w:val="Heading1"/>
+        <w:numPr>
+          <w:ilvl w:val="0"/>
+          <w:numId w:val="0"/>
+        </w:numPr>
+        <w:rPr>
+          <w:rFonts w:eastAsia="Times New Roman"/>
+        </w:rPr>
+      </w:pPr>
+      <w:r>
+        <w:rPr>
+          <w:rFonts w:eastAsia="Times New Roman"/>
+        </w:rPr>
+        <w:lastRenderedPageBreak/>
+        <w:t>LEMBAR PERSEMBAHAN</w:t>
+      </w:r>
+    </w:p>
+    <w:p>
+      <w:pPr>
+        <w:pStyle w:val="p1"/>
+        <w:spacing w:line="360" w:lineRule="auto"/>
+        <w:jc w:val="center"/>
+        <w:rPr>
+          <w:rStyle w:val="s1"/>
+        </w:rPr>
+      </w:pPr>
+      <w:r>
+        <w:rPr>
+          <w:i/>
+          <w:iCs/>
+        </w:rPr>
+        <w:t>“It’s far better to under promise and over deliver than vice versa.”</w:t>
+      </w:r>
+      <w:r>
+        <w:br/>
+      </w:r>
+      <w:r>
+        <w:rPr>
+          <w:rStyle w:val="s1"/>
+        </w:rPr>
+        <w:t>(</w:t>
+      </w:r>
+      <w:r>
+        <w:rPr>
+          <w:rStyle w:val="s1"/>
+        </w:rPr>
+        <w:t>Richard Branson</w:t>
+      </w:r>
+      <w:r>
+        <w:rPr>
+          <w:rStyle w:val="s1"/>
+        </w:rPr>
+        <w:t>)</w:t>
+      </w:r>
+    </w:p>
+    <w:p>
+      <w:pPr>
+        <w:spacing w:after="0" w:line="360" w:lineRule="auto"/>
+        <w:ind w:firstLine="720"/>
+        <w:jc w:val="both"/>
+        <w:rPr>
+          <w:rFonts w:eastAsia="Times New Roman" w:cs="Times New Roman"/>
+          <w:color w:val="000000"/>
+          <w:kern w:val="0"/>
+          <w14:ligatures w14:val="none"/>
+        </w:rPr>
+      </w:pPr>
+      <w:r>
+        <w:rPr>
+          <w:rFonts w:eastAsia="Times New Roman" w:cs="Times New Roman"/>
+          <w:color w:val="000000"/>
+          <w:kern w:val="0"/>
+          <w14:ligatures w14:val="none"/>
+        </w:rPr>
+        <w:t>Dengan mengucapkan segala puji dan syukur kepada Allah SWT, kupersembahkan</w:t>
+      </w:r>
+    </w:p>
+    <w:p>
+      <w:pPr>
+        <w:spacing w:after="0" w:line="360" w:lineRule="auto"/>
+        <w:jc w:val="both"/>
+        <w:rPr>
+          <w:rFonts w:eastAsia="Times New Roman" w:cs="Times New Roman"/>
+          <w:color w:val="000000"/>
+          <w:kern w:val="0"/>
+          <w14:ligatures w14:val="none"/>
+        </w:rPr>
+      </w:pPr>
+      <w:r>
+        <w:rPr>
+          <w:rFonts w:eastAsia="Times New Roman" w:cs="Times New Roman"/>
+          <w:color w:val="000000"/>
+          <w:kern w:val="0"/>
+          <w14:ligatures w14:val="none"/>
+        </w:rPr>
+        <w:t>skripsi ini kepada:</w:t>
+      </w:r>
+    </w:p>
+    <w:p>
+      <w:pPr>
+        <w:pStyle w:val="ListParagraph"/>
+        <w:numPr>
+          <w:ilvl w:val="0"/>
+          <w:numId w:val="12"/>
+        </w:numPr>
+        <w:spacing w:before="100" w:beforeAutospacing="1" w:after="100" w:afterAutospacing="1" w:line="360" w:lineRule="auto"/>
+        <w:ind w:hanging="720"/>
+        <w:jc w:val="both"/>
+        <w:rPr>
+          <w:rFonts w:eastAsia="Times New Roman" w:cs="Times New Roman"/>
+          <w:kern w:val="0"/>
+          <w14:ligatures w14:val="none"/>
+        </w:rPr>
+      </w:pPr>
+      <w:r>
+        <w:rPr>
+          <w:rFonts w:eastAsia="Times New Roman" w:cs="Times New Roman"/>
+          <w:kern w:val="0"/>
+          <w14:ligatures w14:val="none"/>
+        </w:rPr>
+        <w:t>Kedua orang tua tercinta yang selalu memberikan doa, kasih sayang, dukungan, semangat, serta pengorbanan yang tidak ternilai sepanjang perjalanan hidup dan pendidikan saya.</w:t>
+      </w:r>
+    </w:p>
+    <w:p>
+      <w:pPr>
+        <w:numPr>
+          <w:ilvl w:val="0"/>
+          <w:numId w:val="12"/>
+        </w:numPr>
+        <w:spacing w:before="100" w:beforeAutospacing="1" w:after="100" w:afterAutospacing="1" w:line="360" w:lineRule="auto"/>
+        <w:ind w:hanging="720"/>
+        <w:jc w:val="both"/>
+        <w:rPr>
+          <w:rFonts w:eastAsia="Times New Roman" w:cs="Times New Roman"/>
+          <w:kern w:val="0"/>
+          <w14:ligatures w14:val="none"/>
+        </w:rPr>
+      </w:pPr>
+      <w:r>
+        <w:rPr>
+          <w:rFonts w:eastAsia="Times New Roman" w:cs="Times New Roman"/>
+          <w:kern w:val="0"/>
+          <w14:ligatures w14:val="none"/>
+        </w:rPr>
+        <w:t>Keluarga tercinta yang senantiasa memberikan motivasi, perhatian, dan dukungan sehingga saya dapat menyelesaikan pendidikan ini.</w:t>
+      </w:r>
+    </w:p>
+    <w:p>
+      <w:pPr>
+        <w:numPr>
+          <w:ilvl w:val="0"/>
+          <w:numId w:val="12"/>
+        </w:numPr>
+        <w:spacing w:before="100" w:beforeAutospacing="1" w:after="100" w:afterAutospacing="1" w:line="360" w:lineRule="auto"/>
+        <w:ind w:hanging="720"/>
+        <w:jc w:val="both"/>
+        <w:rPr>
+          <w:rFonts w:eastAsia="Times New Roman" w:cs="Times New Roman"/>
+          <w:kern w:val="0"/>
+          <w14:ligatures w14:val="none"/>
+        </w:rPr>
+      </w:pPr>
+      <w:r>
+        <w:rPr>
+          <w:rFonts w:eastAsia="Times New Roman" w:cs="Times New Roman"/>
+          <w:kern w:val="0"/>
+          <w14:ligatures w14:val="none"/>
+        </w:rPr>
+        <w:t>Dosen pembimbing yang telah meluangkan waktu, tenaga, dan pikiran untuk memberikan arahan, bimbingan, serta masukan selama proses penyusunan skripsi ini.</w:t>
+      </w:r>
+    </w:p>
+    <w:p>
+      <w:pPr>
+        <w:numPr>
+          <w:ilvl w:val="0"/>
+          <w:numId w:val="12"/>
+        </w:numPr>
+        <w:spacing w:before="100" w:beforeAutospacing="1" w:after="100" w:afterAutospacing="1" w:line="360" w:lineRule="auto"/>
+        <w:ind w:hanging="720"/>
+        <w:jc w:val="both"/>
+        <w:rPr>
+          <w:rFonts w:eastAsia="Times New Roman" w:cs="Times New Roman"/>
+          <w:kern w:val="0"/>
+          <w14:ligatures w14:val="none"/>
+        </w:rPr>
+      </w:pPr>
+      <w:r>
+        <w:rPr>
+          <w:rFonts w:eastAsia="Times New Roman" w:cs="Times New Roman"/>
+          <w:kern w:val="0"/>
+          <w14:ligatures w14:val="none"/>
+        </w:rPr>
+        <w:t>Pengurus Musala Al Barkah yang telah memberikan izin, bantuan, serta dukungan selama proses penelitian berlangsung.</w:t>
+      </w:r>
+    </w:p>
+    <w:p>
+      <w:pPr>
+        <w:numPr>
+          <w:ilvl w:val="0"/>
+          <w:numId w:val="12"/>
+        </w:numPr>
+        <w:spacing w:before="100" w:beforeAutospacing="1" w:after="100" w:afterAutospacing="1" w:line="360" w:lineRule="auto"/>
+        <w:ind w:hanging="720"/>
+        <w:jc w:val="both"/>
+        <w:rPr>
+          <w:rFonts w:eastAsia="Times New Roman" w:cs="Times New Roman"/>
+          <w:kern w:val="0"/>
+          <w14:ligatures w14:val="none"/>
+        </w:rPr>
+      </w:pPr>
+      <w:r>
+        <w:rPr>
+          <w:rFonts w:eastAsia="Times New Roman" w:cs="Times New Roman"/>
+          <w:kern w:val="0"/>
+          <w14:ligatures w14:val="none"/>
+        </w:rPr>
+        <w:t>Sahabat dan teman-teman seperjuangan yang selalu memberikan semangat, bantuan, dan kebersamaan selama menempuh pendidikan hingga penyusunan skripsi ini.</w:t>
+      </w:r>
+    </w:p>
+    <w:p>
+      <w:pPr>
+        <w:numPr>
+          <w:ilvl w:val="0"/>
+          <w:numId w:val="12"/>
+        </w:numPr>
+        <w:spacing w:before="100" w:beforeAutospacing="1" w:after="100" w:afterAutospacing="1" w:line="360" w:lineRule="auto"/>
+        <w:ind w:hanging="720"/>
+        <w:jc w:val="both"/>
+        <w:rPr>
+          <w:rFonts w:eastAsia="Times New Roman" w:cs="Times New Roman"/>
+          <w:kern w:val="0"/>
+          <w14:ligatures w14:val="none"/>
+        </w:rPr>
+      </w:pPr>
+      <w:r>
+        <w:rPr>
+          <w:rFonts w:eastAsia="Times New Roman" w:cs="Times New Roman"/>
+          <w:kern w:val="0"/>
+          <w14:ligatures w14:val="none"/>
+        </w:rPr>
+        <w:t>Semua pihak yang tidak dapat disebutkan satu per satu yang telah membantu dan memberikan dukungan dalam penyelesaian skripsi ini.</w:t>
+      </w:r>
+    </w:p>
+    <w:p/>
+    <w:p>
+      <w:pPr>
+        <w:spacing w:after="0" w:line="360" w:lineRule="auto"/>
+        <w:jc w:val="center"/>
+        <w:rPr>
+          <w:rFonts w:eastAsia="Times New Roman" w:cs="Times New Roman"/>
+          <w:color w:val="000000"/>
+          <w:kern w:val="0"/>
+          <w14:ligatures w14:val="none"/>
+        </w:rPr>
+      </w:pPr>
+      <w:r>
+        <w:rPr>
+          <w:rFonts w:eastAsia="Times New Roman" w:cs="Times New Roman"/>
+          <w:color w:val="000000"/>
+          <w:kern w:val="0"/>
+          <w14:ligatures w14:val="none"/>
+        </w:rPr>
+        <w:t>Tanpa doa dan dukungan mereka,</w:t>
+      </w:r>
+    </w:p>
+    <w:p>
+      <w:pPr>
+        <w:spacing w:after="0" w:line="360" w:lineRule="auto"/>
+        <w:jc w:val="center"/>
+        <w:rPr>
+          <w:rFonts w:eastAsia="Times New Roman" w:cs="Times New Roman"/>
+          <w:color w:val="000000"/>
+          <w:kern w:val="0"/>
+          <w14:ligatures w14:val="none"/>
+        </w:rPr>
+      </w:pPr>
+      <w:r>
+        <w:rPr>
+          <w:rFonts w:eastAsia="Times New Roman" w:cs="Times New Roman"/>
+          <w:color w:val="000000"/>
+          <w:kern w:val="0"/>
+          <w14:ligatures w14:val="none"/>
+        </w:rPr>
+        <w:t>karya ini tidak akan terselesaikan dengan baik</w:t>
+      </w:r>
+    </w:p>
+    <w:p/>
+    <w:p/>
+    <w:tbl>
+      <w:tblPr>
+        <w:tblStyle w:val="TableGrid"/>
+        <w:tblW w:w="0" w:type="auto"/>
+        <w:tblBorders>
+          <w:top w:val="none" w:sz="0" w:space="0" w:color="auto"/>
+          <w:left w:val="none" w:sz="0" w:space="0" w:color="auto"/>
+          <w:bottom w:val="none" w:sz="0" w:space="0" w:color="auto"/>
+          <w:right w:val="none" w:sz="0" w:space="0" w:color="auto"/>
+          <w:insideH w:val="none" w:sz="0" w:space="0" w:color="auto"/>
+          <w:insideV w:val="none" w:sz="0" w:space="0" w:color="auto"/>
+        </w:tblBorders>
+        <w:tblLook w:val="04A0" w:firstRow="1" w:lastRow="0" w:firstColumn="1" w:lastColumn="0" w:noHBand="0" w:noVBand="1"/>
+      </w:tblPr>
+      <w:tblGrid>
+        <w:gridCol w:w="1922"/>
+        <w:gridCol w:w="6013"/>
+      </w:tblGrid>
+      <w:tr>
+        <w:trPr>
+          <w:trHeight w:val="20"/>
+        </w:trPr>
+        <w:tc>
+          <w:tcPr>
+            <w:tcW w:w="1838" w:type="dxa"/>
+            <w:vAlign w:val="center"/>
+          </w:tcPr>
+          <w:p>
+            <w:pPr>
+              <w:pStyle w:val="p1"/>
+              <w:jc w:val="both"/>
+              <w:rPr>
+                <w:b/>
+                <w:bCs/>
+                <w:color w:val="000000"/>
+                <w:sz w:val="21"/>
+                <w:szCs w:val="21"/>
+              </w:rPr>
+            </w:pPr>
+            <w:r>
+              <w:rPr>
+                <w:noProof/>
+              </w:rPr>
+              <w:lastRenderedPageBreak/>
+              <w:drawing>
+                <wp:inline distT="0" distB="0" distL="0" distR="0" wp14:anchorId="656B0D86" wp14:editId="0AE98F7C">
+                  <wp:extent cx="1083365" cy="387626"/>
+                  <wp:effectExtent l="0" t="0" r="0" b="0"/>
+                  <wp:docPr id="851925233" name="Picture 851925233" descr="A logo with green and yellow text&#10;&#10;AI-generated content may be incorrect."/>
+                  <wp:cNvGraphicFramePr/>
+                  <a:graphic xmlns:a="http://schemas.openxmlformats.org/drawingml/2006/main">
+                    <a:graphicData uri="http://schemas.openxmlformats.org/drawingml/2006/picture">
+                      <pic:pic xmlns:pic="http://schemas.openxmlformats.org/drawingml/2006/picture">
+                        <pic:nvPicPr>
+                          <pic:cNvPr id="32347" name="Picture 32347" descr="A logo with green and yellow text&#10;&#10;AI-generated content may be incorrect."/>
+                          <pic:cNvPicPr/>
+                        </pic:nvPicPr>
+                        <pic:blipFill>
+                          <a:blip r:embed="rId7"/>
+                          <a:stretch>
+                            <a:fillRect/>
+                          </a:stretch>
+                        </pic:blipFill>
+                        <pic:spPr>
+                          <a:xfrm>
+                            <a:off x="0" y="0"/>
+                            <a:ext cx="1083365" cy="387626"/>
+                          </a:xfrm>
+                          <a:prstGeom prst="rect">
+                            <a:avLst/>
+                          </a:prstGeom>
+                        </pic:spPr>
+                      </pic:pic>
+                    </a:graphicData>
+                  </a:graphic>
+                </wp:inline>
+              </w:drawing>
+            </w:r>
+          </w:p>
+        </w:tc>
+        <w:tc>
+          <w:tcPr>
+            <w:tcW w:w="6087" w:type="dxa"/>
+            <w:vAlign w:val="center"/>
+          </w:tcPr>
+          <w:p>
+            <w:pPr>
+              <w:pStyle w:val="Heading1"/>
+              <w:numPr>
+                <w:ilvl w:val="0"/>
+                <w:numId w:val="0"/>
+              </w:numPr>
+              <w:spacing w:before="0" w:after="0" w:line="240" w:lineRule="auto"/>
+              <w:ind w:left="-1752"/>
+            </w:pPr>
+            <w:r>
+              <w:t>PERNYATAAN DIRI</w:t>
+            </w:r>
+          </w:p>
+        </w:tc>
+      </w:tr>
+    </w:tbl>
+    <w:p/>
+    <w:p/>
+    <w:p/>
+    <w:p>
+      <w:pPr>
+        <w:tabs>
+          <w:tab w:val="left" w:pos="993"/>
+        </w:tabs>
+        <w:spacing w:after="0" w:line="276" w:lineRule="auto"/>
+        <w:rPr>
+          <w:rFonts w:eastAsia="Times New Roman" w:cs="Times New Roman"/>
+          <w:color w:val="000000"/>
+          <w:kern w:val="0"/>
+          <w14:ligatures w14:val="none"/>
+        </w:rPr>
+      </w:pPr>
+      <w:r>
+        <w:rPr>
+          <w:rFonts w:eastAsia="Times New Roman" w:cs="Times New Roman"/>
+          <w:color w:val="000000"/>
+          <w:kern w:val="0"/>
+          <w14:ligatures w14:val="none"/>
+        </w:rPr>
+        <w:t>Dengan ini saya:</w:t>
+      </w:r>
+    </w:p>
+    <w:p>
+      <w:pPr>
+        <w:tabs>
+          <w:tab w:val="left" w:pos="993"/>
+        </w:tabs>
+        <w:spacing w:after="0" w:line="276" w:lineRule="auto"/>
+        <w:rPr>
+          <w:rFonts w:eastAsia="Times New Roman" w:cs="Times New Roman"/>
+          <w:color w:val="000000"/>
+          <w:kern w:val="0"/>
+          <w14:ligatures w14:val="none"/>
+        </w:rPr>
+      </w:pPr>
+      <w:r>
+        <w:rPr>
+          <w:rFonts w:eastAsia="Times New Roman" w:cs="Times New Roman"/>
+          <w:color w:val="000000"/>
+          <w:kern w:val="0"/>
+          <w14:ligatures w14:val="none"/>
+        </w:rPr>
+        <w:t xml:space="preserve">Nama </w:t>
+      </w:r>
+      <w:r>
+        <w:rPr>
+          <w:rFonts w:eastAsia="Times New Roman" w:cs="Times New Roman"/>
+          <w:color w:val="000000"/>
+          <w:kern w:val="0"/>
+          <w14:ligatures w14:val="none"/>
+        </w:rPr>
+        <w:tab/>
+      </w:r>
+      <w:r>
+        <w:rPr>
+          <w:rFonts w:eastAsia="Times New Roman" w:cs="Times New Roman"/>
+          <w:color w:val="000000"/>
+          <w:kern w:val="0"/>
+          <w14:ligatures w14:val="none"/>
+        </w:rPr>
+        <w:tab/>
+      </w:r>
+      <w:r>
+        <w:rPr>
+          <w:rFonts w:eastAsia="Times New Roman" w:cs="Times New Roman"/>
+          <w:color w:val="000000"/>
+          <w:kern w:val="0"/>
+          <w14:ligatures w14:val="none"/>
+        </w:rPr>
+        <w:t xml:space="preserve">: </w:t>
+      </w:r>
+      <w:r>
+        <w:rPr>
+          <w:rFonts w:eastAsia="Times New Roman" w:cs="Times New Roman"/>
+          <w:color w:val="000000"/>
+          <w:kern w:val="0"/>
+          <w14:ligatures w14:val="none"/>
+        </w:rPr>
+        <w:t>M. Rizky Maulana</w:t>
+      </w:r>
+    </w:p>
+    <w:p>
+      <w:pPr>
+        <w:tabs>
+          <w:tab w:val="left" w:pos="993"/>
+        </w:tabs>
+        <w:spacing w:after="0" w:line="276" w:lineRule="auto"/>
+        <w:rPr>
+          <w:rFonts w:eastAsia="Times New Roman" w:cs="Times New Roman"/>
+          <w:color w:val="000000"/>
+          <w:kern w:val="0"/>
+          <w14:ligatures w14:val="none"/>
+        </w:rPr>
+      </w:pPr>
+      <w:r>
+        <w:rPr>
+          <w:rFonts w:eastAsia="Times New Roman" w:cs="Times New Roman"/>
+          <w:color w:val="000000"/>
+          <w:kern w:val="0"/>
+          <w14:ligatures w14:val="none"/>
+        </w:rPr>
+        <w:t xml:space="preserve">NPM </w:t>
+      </w:r>
+      <w:r>
+        <w:rPr>
+          <w:rFonts w:eastAsia="Times New Roman" w:cs="Times New Roman"/>
+          <w:color w:val="000000"/>
+          <w:kern w:val="0"/>
+          <w14:ligatures w14:val="none"/>
+        </w:rPr>
+        <w:tab/>
+      </w:r>
+      <w:r>
+        <w:rPr>
+          <w:rFonts w:eastAsia="Times New Roman" w:cs="Times New Roman"/>
+          <w:color w:val="000000"/>
+          <w:kern w:val="0"/>
+          <w14:ligatures w14:val="none"/>
+        </w:rPr>
+        <w:tab/>
+      </w:r>
+      <w:r>
+        <w:rPr>
+          <w:rFonts w:eastAsia="Times New Roman" w:cs="Times New Roman"/>
+          <w:color w:val="000000"/>
+          <w:kern w:val="0"/>
+          <w14:ligatures w14:val="none"/>
+        </w:rPr>
+        <w:t xml:space="preserve">: </w:t>
+      </w:r>
+      <w:r>
+        <w:rPr>
+          <w:rFonts w:eastAsia="Times New Roman" w:cs="Times New Roman"/>
+          <w:color w:val="000000"/>
+          <w:kern w:val="0"/>
+          <w14:ligatures w14:val="none"/>
+        </w:rPr>
+        <w:t>2021310066</w:t>
+      </w:r>
+    </w:p>
+    <w:p>
+      <w:pPr>
+        <w:tabs>
+          <w:tab w:val="left" w:pos="993"/>
+        </w:tabs>
+        <w:spacing w:after="0" w:line="276" w:lineRule="auto"/>
+        <w:rPr>
+          <w:rFonts w:eastAsia="Times New Roman" w:cs="Times New Roman"/>
+          <w:color w:val="000000"/>
+          <w:kern w:val="0"/>
+          <w14:ligatures w14:val="none"/>
+        </w:rPr>
+      </w:pPr>
+      <w:r>
+        <w:rPr>
+          <w:rFonts w:eastAsia="Times New Roman" w:cs="Times New Roman"/>
+          <w:color w:val="000000"/>
+          <w:kern w:val="0"/>
+          <w14:ligatures w14:val="none"/>
+        </w:rPr>
+        <w:t xml:space="preserve">Jurusan </w:t>
+      </w:r>
+      <w:r>
+        <w:rPr>
+          <w:rFonts w:eastAsia="Times New Roman" w:cs="Times New Roman"/>
+          <w:color w:val="000000"/>
+          <w:kern w:val="0"/>
+          <w14:ligatures w14:val="none"/>
+        </w:rPr>
+        <w:tab/>
+      </w:r>
+      <w:r>
+        <w:rPr>
+          <w:rFonts w:eastAsia="Times New Roman" w:cs="Times New Roman"/>
+          <w:color w:val="000000"/>
+          <w:kern w:val="0"/>
+          <w14:ligatures w14:val="none"/>
+        </w:rPr>
+        <w:tab/>
+      </w:r>
+      <w:r>
+        <w:rPr>
+          <w:rFonts w:eastAsia="Times New Roman" w:cs="Times New Roman"/>
+          <w:color w:val="000000"/>
+          <w:kern w:val="0"/>
+          <w14:ligatures w14:val="none"/>
+        </w:rPr>
+        <w:t>: Teknik Informatika</w:t>
+      </w:r>
+    </w:p>
+    <w:p>
+      <w:pPr>
+        <w:tabs>
+          <w:tab w:val="left" w:pos="993"/>
+          <w:tab w:val="left" w:pos="1701"/>
+        </w:tabs>
+        <w:spacing w:after="0" w:line="276" w:lineRule="auto"/>
+        <w:ind w:left="1440" w:hanging="1440"/>
+        <w:jc w:val="both"/>
+        <w:rPr>
+          <w:rFonts w:eastAsia="Times New Roman" w:cs="Times New Roman"/>
+          <w:color w:val="000000"/>
+          <w:kern w:val="0"/>
+          <w14:ligatures w14:val="none"/>
+        </w:rPr>
+      </w:pPr>
+      <w:r>
+        <w:rPr>
+          <w:rFonts w:eastAsia="Times New Roman" w:cs="Times New Roman"/>
+          <w:color w:val="000000"/>
+          <w:kern w:val="0"/>
+          <w14:ligatures w14:val="none"/>
+        </w:rPr>
+        <w:t>Judul Skripsi</w:t>
+      </w:r>
+      <w:r>
+        <w:rPr>
+          <w:rFonts w:eastAsia="Times New Roman" w:cs="Times New Roman"/>
+          <w:color w:val="000000"/>
+          <w:kern w:val="0"/>
+          <w14:ligatures w14:val="none"/>
+        </w:rPr>
+        <w:tab/>
+      </w:r>
+      <w:r>
+        <w:rPr>
+          <w:rFonts w:eastAsia="Times New Roman" w:cs="Times New Roman"/>
+          <w:color w:val="000000"/>
+          <w:kern w:val="0"/>
+          <w14:ligatures w14:val="none"/>
+        </w:rPr>
+        <w:t>:</w:t>
+      </w:r>
+      <w:r>
+        <w:rPr>
+          <w:rFonts w:eastAsia="Times New Roman" w:cs="Times New Roman"/>
+          <w:color w:val="000000"/>
+          <w:kern w:val="0"/>
+          <w14:ligatures w14:val="none"/>
+        </w:rPr>
+        <w:t xml:space="preserve"> Perancangan Sistem Monitoring Konsumsi Energi Lampu Dan </w:t>
+      </w:r>
+    </w:p>
+    <w:p>
+      <w:pPr>
+        <w:tabs>
+          <w:tab w:val="left" w:pos="993"/>
+          <w:tab w:val="left" w:pos="1701"/>
+        </w:tabs>
+        <w:spacing w:after="0" w:line="276" w:lineRule="auto"/>
+        <w:ind w:left="1440" w:hanging="1440"/>
+        <w:jc w:val="both"/>
+        <w:rPr>
+          <w:rFonts w:eastAsia="Times New Roman" w:cs="Times New Roman"/>
+          <w:i/>
+          <w:iCs/>
+          <w:color w:val="000000"/>
+          <w:kern w:val="0"/>
+          <w14:ligatures w14:val="none"/>
+        </w:rPr>
+      </w:pPr>
+      <w:r>
+        <w:rPr>
+          <w:rFonts w:eastAsia="Times New Roman" w:cs="Times New Roman"/>
+          <w:color w:val="000000"/>
+          <w:kern w:val="0"/>
+          <w14:ligatures w14:val="none"/>
+        </w:rPr>
+        <w:tab/>
+      </w:r>
+      <w:r>
+        <w:rPr>
+          <w:rFonts w:eastAsia="Times New Roman" w:cs="Times New Roman"/>
+          <w:color w:val="000000"/>
+          <w:kern w:val="0"/>
+          <w14:ligatures w14:val="none"/>
+        </w:rPr>
+        <w:tab/>
+        <w:t xml:space="preserve">  </w:t>
+      </w:r>
+      <w:r>
+        <w:rPr>
+          <w:rFonts w:eastAsia="Times New Roman" w:cs="Times New Roman"/>
+          <w:color w:val="000000"/>
+          <w:kern w:val="0"/>
+          <w14:ligatures w14:val="none"/>
+        </w:rPr>
+        <w:t xml:space="preserve">Kipas Angin Pada   Musala Al Barkah Berbasis </w:t>
+      </w:r>
+      <w:r>
+        <w:rPr>
+          <w:rFonts w:eastAsia="Times New Roman" w:cs="Times New Roman"/>
+          <w:i/>
+          <w:iCs/>
+          <w:color w:val="000000"/>
+          <w:kern w:val="0"/>
+          <w14:ligatures w14:val="none"/>
+        </w:rPr>
+        <w:t xml:space="preserve">internet Of </w:t>
+      </w:r>
+    </w:p>
+    <w:p>
+      <w:pPr>
+        <w:tabs>
+          <w:tab w:val="left" w:pos="993"/>
+          <w:tab w:val="left" w:pos="1701"/>
+        </w:tabs>
+        <w:spacing w:after="0" w:line="276" w:lineRule="auto"/>
+        <w:ind w:left="1440" w:hanging="1440"/>
+        <w:jc w:val="both"/>
+        <w:rPr>
+          <w:rFonts w:eastAsia="Times New Roman" w:cs="Times New Roman"/>
+          <w:color w:val="000000"/>
+          <w:kern w:val="0"/>
+          <w14:ligatures w14:val="none"/>
+        </w:rPr>
+      </w:pPr>
+      <w:r>
+        <w:rPr>
+          <w:rFonts w:eastAsia="Times New Roman" w:cs="Times New Roman"/>
+          <w:i/>
+          <w:iCs/>
+          <w:color w:val="000000"/>
+          <w:kern w:val="0"/>
+          <w14:ligatures w14:val="none"/>
+        </w:rPr>
+        <w:tab/>
+      </w:r>
+      <w:r>
+        <w:rPr>
+          <w:rFonts w:eastAsia="Times New Roman" w:cs="Times New Roman"/>
+          <w:i/>
+          <w:iCs/>
+          <w:color w:val="000000"/>
+          <w:kern w:val="0"/>
+          <w14:ligatures w14:val="none"/>
+        </w:rPr>
+        <w:tab/>
+        <w:t xml:space="preserve"> </w:t>
+      </w:r>
+      <w:r>
+        <w:rPr>
+          <w:rFonts w:eastAsia="Times New Roman" w:cs="Times New Roman"/>
+          <w:i/>
+          <w:iCs/>
+          <w:color w:val="000000"/>
+          <w:kern w:val="0"/>
+          <w14:ligatures w14:val="none"/>
+        </w:rPr>
+        <w:t>Things</w:t>
+      </w:r>
+    </w:p>
+    <w:p>
+      <w:pPr>
+        <w:spacing w:after="0" w:line="360" w:lineRule="auto"/>
+        <w:rPr>
+          <w:rFonts w:eastAsia="Times New Roman" w:cs="Times New Roman"/>
+          <w:color w:val="000000"/>
+          <w:kern w:val="0"/>
+          <w14:ligatures w14:val="none"/>
+        </w:rPr>
+      </w:pPr>
+    </w:p>
+    <w:p>
+      <w:pPr>
+        <w:spacing w:after="0" w:line="360" w:lineRule="auto"/>
+        <w:ind w:firstLine="720"/>
+        <w:jc w:val="center"/>
+        <w:rPr>
+          <w:rFonts w:eastAsia="Times New Roman" w:cs="Times New Roman"/>
+          <w:color w:val="000000"/>
+          <w:kern w:val="0"/>
+          <w14:ligatures w14:val="none"/>
+        </w:rPr>
+      </w:pPr>
+      <w:r>
+        <w:rPr>
+          <w:rFonts w:eastAsia="Times New Roman" w:cs="Times New Roman"/>
+          <w:color w:val="000000"/>
+          <w:kern w:val="0"/>
+          <w14:ligatures w14:val="none"/>
+        </w:rPr>
+        <w:t>Menyatakan dengan sebenarnya,</w:t>
+      </w:r>
+    </w:p>
+    <w:p>
+      <w:pPr>
+        <w:spacing w:after="0" w:line="360" w:lineRule="auto"/>
+        <w:ind w:firstLine="720"/>
+        <w:jc w:val="center"/>
+        <w:rPr>
+          <w:rFonts w:eastAsia="Times New Roman" w:cs="Times New Roman"/>
+          <w:color w:val="000000"/>
+          <w:kern w:val="0"/>
+          <w14:ligatures w14:val="none"/>
+        </w:rPr>
+      </w:pPr>
+    </w:p>
+    <w:p>
+      <w:pPr>
+        <w:spacing w:after="0" w:line="276" w:lineRule="auto"/>
+        <w:jc w:val="both"/>
+        <w:rPr>
+          <w:rFonts w:eastAsia="Times New Roman" w:cs="Times New Roman"/>
+          <w:color w:val="000000"/>
+          <w:kern w:val="0"/>
+          <w14:ligatures w14:val="none"/>
+        </w:rPr>
+      </w:pPr>
+      <w:r>
+        <w:rPr>
+          <w:rFonts w:eastAsia="Times New Roman" w:cs="Times New Roman"/>
+          <w:color w:val="000000"/>
+          <w:kern w:val="0"/>
+          <w14:ligatures w14:val="none"/>
+        </w:rPr>
+        <w:t>Bahwa dalam penyusunan Skripsi didasarkan pada data faktual dan dapat</w:t>
+      </w:r>
+      <w:r>
+        <w:rPr>
+          <w:rFonts w:eastAsia="Times New Roman" w:cs="Times New Roman"/>
+          <w:color w:val="000000"/>
+          <w:kern w:val="0"/>
+          <w14:ligatures w14:val="none"/>
+        </w:rPr>
+        <w:t xml:space="preserve"> </w:t>
+      </w:r>
+      <w:r>
+        <w:rPr>
+          <w:rFonts w:eastAsia="Times New Roman" w:cs="Times New Roman"/>
+          <w:color w:val="000000"/>
+          <w:kern w:val="0"/>
+          <w14:ligatures w14:val="none"/>
+        </w:rPr>
+        <w:t>dipertanggungjawabkan serta merupakan karya asli penulis BUKAN karya pihak lain. Apabila dikemudian hari diketahui bahwa Skripsi penulis disusun berdasarkan data fiktif dan atau merupakan karya tiruan dan atau karya orang lain. Penulis bersedia menerima Sanksi Akademis dalam bentuk apapun.</w:t>
+      </w:r>
+    </w:p>
+    <w:p>
+      <w:pPr>
+        <w:spacing w:after="0" w:line="360" w:lineRule="auto"/>
+        <w:jc w:val="both"/>
+        <w:rPr>
+          <w:rFonts w:eastAsia="Times New Roman" w:cs="Times New Roman"/>
+          <w:color w:val="000000"/>
+          <w:kern w:val="0"/>
+          <w14:ligatures w14:val="none"/>
+        </w:rPr>
+      </w:pPr>
+    </w:p>
+    <w:p>
+      <w:pPr>
+        <w:spacing w:after="0" w:line="360" w:lineRule="auto"/>
+        <w:jc w:val="both"/>
+        <w:rPr>
+          <w:rFonts w:eastAsia="Times New Roman" w:cs="Times New Roman"/>
+          <w:color w:val="000000"/>
+          <w:kern w:val="0"/>
+          <w14:ligatures w14:val="none"/>
+        </w:rPr>
+      </w:pPr>
+      <w:r>
+        <w:rPr>
+          <w:rFonts w:eastAsia="Times New Roman" w:cs="Times New Roman"/>
+          <w:color w:val="000000"/>
+          <w:kern w:val="0"/>
+          <w14:ligatures w14:val="none"/>
+        </w:rPr>
+        <w:t>Pernyataan ini adalah persyaratan dalam Skripsi.</w:t>
+      </w:r>
+    </w:p>
+    <w:p>
+      <w:pPr>
+        <w:spacing w:after="0" w:line="360" w:lineRule="auto"/>
+        <w:jc w:val="both"/>
+        <w:rPr>
+          <w:rFonts w:eastAsia="Times New Roman" w:cs="Times New Roman"/>
+          <w:color w:val="000000"/>
+          <w:kern w:val="0"/>
+          <w14:ligatures w14:val="none"/>
+        </w:rPr>
+      </w:pPr>
+    </w:p>
+    <w:p>
+      <w:pPr>
+        <w:spacing w:after="0" w:line="360" w:lineRule="auto"/>
+        <w:jc w:val="both"/>
+        <w:rPr>
+          <w:rFonts w:eastAsia="Times New Roman" w:cs="Times New Roman"/>
+          <w:color w:val="000000"/>
+          <w:kern w:val="0"/>
+          <w14:ligatures w14:val="none"/>
+        </w:rPr>
+      </w:pPr>
+    </w:p>
+    <w:p>
+      <w:pPr>
+        <w:spacing w:after="0" w:line="360" w:lineRule="auto"/>
+        <w:jc w:val="both"/>
+        <w:rPr>
+          <w:rFonts w:eastAsia="Times New Roman" w:cs="Times New Roman"/>
+          <w:color w:val="000000"/>
+          <w:kern w:val="0"/>
+          <w14:ligatures w14:val="none"/>
+        </w:rPr>
+      </w:pPr>
+      <w:r>
+        <w:rPr>
+          <w:rFonts w:eastAsia="Times New Roman" w:cs="Times New Roman"/>
+          <w:color w:val="000000"/>
+          <w:kern w:val="0"/>
+          <w14:ligatures w14:val="none"/>
+        </w:rPr>
+        <w:t>Bekasi, 15 Mei 2025</w:t>
+      </w:r>
+    </w:p>
+    <w:p>
+      <w:pPr>
+        <w:spacing w:before="240" w:line="240" w:lineRule="auto"/>
+        <w:rPr>
+          <w:rFonts w:eastAsia="Times New Roman" w:cs="Times New Roman"/>
+          <w:color w:val="000000"/>
+          <w:kern w:val="0"/>
+          <w14:ligatures w14:val="none"/>
+        </w:rPr>
+      </w:pPr>
+      <w:r>
+        <w:rPr>
+          <w:rFonts w:eastAsia="Times New Roman" w:cs="Times New Roman"/>
+          <w:color w:val="000000"/>
+          <w:kern w:val="0"/>
+          <w14:ligatures w14:val="none"/>
+        </w:rPr>
+        <w:t>Materai</w:t>
+      </w:r>
+    </w:p>
+    <w:p>
+      <w:pPr>
+        <w:spacing w:before="240" w:line="240" w:lineRule="auto"/>
+        <w:rPr>
+          <w:rFonts w:eastAsia="Times New Roman" w:cs="Times New Roman"/>
+          <w:color w:val="000000"/>
+          <w:kern w:val="0"/>
+          <w14:ligatures w14:val="none"/>
+        </w:rPr>
+      </w:pPr>
+      <w:r>
+        <w:rPr>
+          <w:rFonts w:eastAsia="Times New Roman" w:cs="Times New Roman"/>
+          <w:color w:val="000000"/>
+          <w:kern w:val="0"/>
+          <w14:ligatures w14:val="none"/>
+        </w:rPr>
+        <w:t>Rp 10.000,-</w:t>
+      </w:r>
+    </w:p>
+    <w:p>
+      <w:pPr>
+        <w:spacing w:after="0" w:line="360" w:lineRule="auto"/>
+        <w:rPr>
+          <w:rFonts w:eastAsia="Times New Roman" w:cs="Times New Roman"/>
+          <w:color w:val="000000"/>
+          <w:kern w:val="0"/>
+          <w14:ligatures w14:val="none"/>
+        </w:rPr>
+      </w:pPr>
+      <w:r>
+        <w:rPr>
+          <w:rFonts w:eastAsia="Times New Roman" w:cs="Times New Roman"/>
+          <w:b/>
+          <w:bCs/>
+          <w:color w:val="000000"/>
+          <w:kern w:val="0"/>
+          <w14:ligatures w14:val="none"/>
+        </w:rPr>
+        <w:t>M. Rizky Maulana</w:t>
+      </w:r>
+    </w:p>
+    <w:p/>
+    <w:p/>
+    <w:p/>
+    <w:p/>
+    <w:p>
+      <w:pPr>
+        <w:pStyle w:val="Heading1"/>
+        <w:numPr>
+          <w:ilvl w:val="0"/>
+          <w:numId w:val="0"/>
+        </w:numPr>
+      </w:pPr>
+      <w:r>
+        <w:lastRenderedPageBreak/>
+        <w:t>SURAT PERNYATAAN PERSETUJUAN PUBLIKASI KARYA ILMIAHUNTUK KEPENTINGAN AKADEMIS</w:t>
+      </w:r>
+    </w:p>
+    <w:p>
+      <w:pPr>
+        <w:tabs>
+          <w:tab w:val="left" w:pos="993"/>
+        </w:tabs>
+        <w:spacing w:after="0" w:line="276" w:lineRule="auto"/>
+        <w:rPr>
+          <w:rFonts w:eastAsia="Times New Roman" w:cs="Times New Roman"/>
+          <w:color w:val="000000"/>
+          <w:kern w:val="0"/>
+          <w14:ligatures w14:val="none"/>
+        </w:rPr>
+      </w:pPr>
+      <w:r>
+        <w:rPr>
+          <w:rFonts w:eastAsia="Times New Roman" w:cs="Times New Roman"/>
+          <w:color w:val="000000"/>
+          <w:kern w:val="0"/>
+          <w14:ligatures w14:val="none"/>
+        </w:rPr>
+        <w:t>Yang bertanda tangan di bawah ini, saya:</w:t>
+      </w:r>
+    </w:p>
+    <w:p>
+      <w:pPr>
+        <w:tabs>
+          <w:tab w:val="left" w:pos="993"/>
+        </w:tabs>
+        <w:spacing w:after="0" w:line="276" w:lineRule="auto"/>
+        <w:rPr>
+          <w:rFonts w:eastAsia="Times New Roman" w:cs="Times New Roman"/>
+          <w:color w:val="000000"/>
+          <w:kern w:val="0"/>
+          <w14:ligatures w14:val="none"/>
+        </w:rPr>
+      </w:pPr>
+    </w:p>
+    <w:p>
+      <w:pPr>
+        <w:tabs>
+          <w:tab w:val="left" w:pos="993"/>
+        </w:tabs>
+        <w:spacing w:after="0" w:line="276" w:lineRule="auto"/>
+        <w:rPr>
+          <w:rFonts w:eastAsia="Times New Roman" w:cs="Times New Roman"/>
+          <w:color w:val="000000"/>
+          <w:kern w:val="0"/>
+          <w14:ligatures w14:val="none"/>
+        </w:rPr>
+      </w:pPr>
+      <w:r>
+        <w:rPr>
+          <w:rFonts w:eastAsia="Times New Roman" w:cs="Times New Roman"/>
+          <w:color w:val="000000"/>
+          <w:kern w:val="0"/>
+          <w14:ligatures w14:val="none"/>
+        </w:rPr>
+        <w:t xml:space="preserve">Nama </w:t>
+      </w:r>
+      <w:r>
+        <w:rPr>
+          <w:rFonts w:eastAsia="Times New Roman" w:cs="Times New Roman"/>
+          <w:color w:val="000000"/>
+          <w:kern w:val="0"/>
+          <w14:ligatures w14:val="none"/>
+        </w:rPr>
+        <w:tab/>
+      </w:r>
+      <w:r>
+        <w:rPr>
+          <w:rFonts w:eastAsia="Times New Roman" w:cs="Times New Roman"/>
+          <w:color w:val="000000"/>
+          <w:kern w:val="0"/>
+          <w14:ligatures w14:val="none"/>
+        </w:rPr>
+        <w:tab/>
+        <w:t>: M. Rizky Maulana</w:t>
+      </w:r>
+    </w:p>
+    <w:p>
+      <w:pPr>
+        <w:tabs>
+          <w:tab w:val="left" w:pos="993"/>
+        </w:tabs>
+        <w:spacing w:after="0" w:line="276" w:lineRule="auto"/>
+        <w:rPr>
+          <w:rFonts w:eastAsia="Times New Roman" w:cs="Times New Roman"/>
+          <w:color w:val="000000"/>
+          <w:kern w:val="0"/>
+          <w14:ligatures w14:val="none"/>
+        </w:rPr>
+      </w:pPr>
+      <w:r>
+        <w:rPr>
+          <w:rFonts w:eastAsia="Times New Roman" w:cs="Times New Roman"/>
+          <w:color w:val="000000"/>
+          <w:kern w:val="0"/>
+          <w14:ligatures w14:val="none"/>
+        </w:rPr>
+        <w:t xml:space="preserve">NPM </w:t>
+      </w:r>
+      <w:r>
+        <w:rPr>
+          <w:rFonts w:eastAsia="Times New Roman" w:cs="Times New Roman"/>
+          <w:color w:val="000000"/>
+          <w:kern w:val="0"/>
+          <w14:ligatures w14:val="none"/>
+        </w:rPr>
+        <w:tab/>
+      </w:r>
+      <w:r>
+        <w:rPr>
+          <w:rFonts w:eastAsia="Times New Roman" w:cs="Times New Roman"/>
+          <w:color w:val="000000"/>
+          <w:kern w:val="0"/>
+          <w14:ligatures w14:val="none"/>
+        </w:rPr>
+        <w:tab/>
+        <w:t>: 2021310066</w:t>
+      </w:r>
+    </w:p>
+    <w:p>
+      <w:pPr>
+        <w:tabs>
+          <w:tab w:val="left" w:pos="993"/>
+        </w:tabs>
+        <w:spacing w:after="0" w:line="276" w:lineRule="auto"/>
+        <w:rPr>
+          <w:rFonts w:eastAsia="Times New Roman" w:cs="Times New Roman"/>
+          <w:color w:val="000000"/>
+          <w:kern w:val="0"/>
+          <w14:ligatures w14:val="none"/>
+        </w:rPr>
+      </w:pPr>
+      <w:r>
+        <w:rPr>
+          <w:rFonts w:eastAsia="Times New Roman" w:cs="Times New Roman"/>
+          <w:color w:val="000000"/>
+          <w:kern w:val="0"/>
+          <w14:ligatures w14:val="none"/>
+        </w:rPr>
+        <w:t xml:space="preserve">Jurusan </w:t>
+      </w:r>
+      <w:r>
+        <w:rPr>
+          <w:rFonts w:eastAsia="Times New Roman" w:cs="Times New Roman"/>
+          <w:color w:val="000000"/>
+          <w:kern w:val="0"/>
+          <w14:ligatures w14:val="none"/>
+        </w:rPr>
+        <w:tab/>
+      </w:r>
+      <w:r>
+        <w:rPr>
+          <w:rFonts w:eastAsia="Times New Roman" w:cs="Times New Roman"/>
+          <w:color w:val="000000"/>
+          <w:kern w:val="0"/>
+          <w14:ligatures w14:val="none"/>
+        </w:rPr>
+        <w:tab/>
+        <w:t>: Teknik Informatika</w:t>
+      </w:r>
+    </w:p>
+    <w:p>
+      <w:pPr>
+        <w:tabs>
+          <w:tab w:val="left" w:pos="993"/>
+          <w:tab w:val="left" w:pos="1701"/>
+        </w:tabs>
+        <w:spacing w:after="0" w:line="276" w:lineRule="auto"/>
+        <w:ind w:left="1440" w:hanging="1440"/>
+        <w:jc w:val="both"/>
+        <w:rPr>
+          <w:rFonts w:eastAsia="Times New Roman" w:cs="Times New Roman"/>
+          <w:color w:val="000000"/>
+          <w:kern w:val="0"/>
+          <w14:ligatures w14:val="none"/>
+        </w:rPr>
+      </w:pPr>
+      <w:r>
+        <w:rPr>
+          <w:rFonts w:eastAsia="Times New Roman" w:cs="Times New Roman"/>
+          <w:color w:val="000000"/>
+          <w:kern w:val="0"/>
+          <w14:ligatures w14:val="none"/>
+        </w:rPr>
+        <w:t>Judul Skripsi</w:t>
+      </w:r>
+      <w:r>
+        <w:rPr>
+          <w:rFonts w:eastAsia="Times New Roman" w:cs="Times New Roman"/>
+          <w:color w:val="000000"/>
+          <w:kern w:val="0"/>
+          <w14:ligatures w14:val="none"/>
+        </w:rPr>
+        <w:tab/>
+        <w:t xml:space="preserve">: Perancangan Sistem Monitoring Konsumsi Energi Lampu Dan </w:t>
+      </w:r>
+    </w:p>
+    <w:p>
+      <w:pPr>
+        <w:tabs>
+          <w:tab w:val="left" w:pos="993"/>
+          <w:tab w:val="left" w:pos="1701"/>
+        </w:tabs>
+        <w:spacing w:after="0" w:line="276" w:lineRule="auto"/>
+        <w:ind w:left="1440" w:hanging="1440"/>
+        <w:jc w:val="both"/>
+        <w:rPr>
+          <w:rFonts w:eastAsia="Times New Roman" w:cs="Times New Roman"/>
+          <w:i/>
+          <w:iCs/>
+          <w:color w:val="000000"/>
+          <w:kern w:val="0"/>
+          <w14:ligatures w14:val="none"/>
+        </w:rPr>
+      </w:pPr>
+      <w:r>
+        <w:rPr>
+          <w:rFonts w:eastAsia="Times New Roman" w:cs="Times New Roman"/>
+          <w:color w:val="000000"/>
+          <w:kern w:val="0"/>
+          <w14:ligatures w14:val="none"/>
+        </w:rPr>
+        <w:tab/>
+      </w:r>
+      <w:r>
+        <w:rPr>
+          <w:rFonts w:eastAsia="Times New Roman" w:cs="Times New Roman"/>
+          <w:color w:val="000000"/>
+          <w:kern w:val="0"/>
+          <w14:ligatures w14:val="none"/>
+        </w:rPr>
+        <w:tab/>
+        <w:t xml:space="preserve">  </w:t>
+      </w:r>
+      <w:r>
+        <w:rPr>
+          <w:rFonts w:eastAsia="Times New Roman" w:cs="Times New Roman"/>
+          <w:color w:val="000000"/>
+          <w:kern w:val="0"/>
+          <w14:ligatures w14:val="none"/>
+        </w:rPr>
+        <w:t xml:space="preserve">Kipas Angin Pada   Musala Al Barkah Berbasis </w:t>
+      </w:r>
+      <w:r>
+        <w:rPr>
+          <w:rFonts w:eastAsia="Times New Roman" w:cs="Times New Roman"/>
+          <w:i/>
+          <w:iCs/>
+          <w:color w:val="000000"/>
+          <w:kern w:val="0"/>
+          <w14:ligatures w14:val="none"/>
+        </w:rPr>
+        <w:t xml:space="preserve">internet Of </w:t>
+      </w:r>
+    </w:p>
+    <w:p>
+      <w:pPr>
+        <w:tabs>
+          <w:tab w:val="left" w:pos="993"/>
+          <w:tab w:val="left" w:pos="1701"/>
+        </w:tabs>
+        <w:spacing w:after="0" w:line="276" w:lineRule="auto"/>
+        <w:ind w:left="1440" w:hanging="1440"/>
+        <w:jc w:val="both"/>
+        <w:rPr>
+          <w:rFonts w:eastAsia="Times New Roman" w:cs="Times New Roman"/>
+          <w:color w:val="000000"/>
+          <w:kern w:val="0"/>
+          <w14:ligatures w14:val="none"/>
+        </w:rPr>
+      </w:pPr>
+      <w:r>
+        <w:rPr>
+          <w:rFonts w:eastAsia="Times New Roman" w:cs="Times New Roman"/>
+          <w:i/>
+          <w:iCs/>
+          <w:color w:val="000000"/>
+          <w:kern w:val="0"/>
+          <w14:ligatures w14:val="none"/>
+        </w:rPr>
+        <w:tab/>
+      </w:r>
+      <w:r>
+        <w:rPr>
+          <w:rFonts w:eastAsia="Times New Roman" w:cs="Times New Roman"/>
+          <w:i/>
+          <w:iCs/>
+          <w:color w:val="000000"/>
+          <w:kern w:val="0"/>
+          <w14:ligatures w14:val="none"/>
+        </w:rPr>
+        <w:tab/>
+        <w:t xml:space="preserve"> </w:t>
+      </w:r>
+      <w:r>
+        <w:rPr>
+          <w:rFonts w:eastAsia="Times New Roman" w:cs="Times New Roman"/>
+          <w:i/>
+          <w:iCs/>
+          <w:color w:val="000000"/>
+          <w:kern w:val="0"/>
+          <w14:ligatures w14:val="none"/>
+        </w:rPr>
+        <w:t>Things</w:t>
+      </w:r>
+    </w:p>
+    <w:p>
+      <w:pPr>
+        <w:tabs>
+          <w:tab w:val="left" w:pos="993"/>
+          <w:tab w:val="left" w:pos="1701"/>
+        </w:tabs>
+        <w:spacing w:after="0" w:line="276" w:lineRule="auto"/>
+        <w:ind w:left="1560" w:hanging="1440"/>
+        <w:rPr>
+          <w:rFonts w:eastAsia="Times New Roman" w:cs="Times New Roman"/>
+          <w:color w:val="000000"/>
+          <w:kern w:val="0"/>
+          <w:sz w:val="18"/>
+          <w:szCs w:val="18"/>
+          <w14:ligatures w14:val="none"/>
+        </w:rPr>
+      </w:pPr>
+    </w:p>
+    <w:p>
+      <w:pPr>
+        <w:spacing w:line="240" w:lineRule="auto"/>
+        <w:jc w:val="both"/>
+      </w:pPr>
+      <w:r>
+        <w:t>Dengan ini menyetujui untuk memberikan ijin kepada pihak Universitas Bina Insani, Hak Bebas</w:t>
+      </w:r>
+      <w:r>
+        <w:t xml:space="preserve"> </w:t>
+      </w:r>
+      <w:r>
+        <w:t>Royalti Non-Eksklusif (Non-exclusive Royalti-Free Right) atas karya ilmiah kami yang berjudul: “Model</w:t>
+      </w:r>
+      <w:r>
+        <w:t xml:space="preserve"> </w:t>
+      </w:r>
+      <w:r>
+        <w:t>Implementasi Monitoring Jaringan ISP Ipteknet Berbasis Nagios Dengan Teknologi SMS”, beserta</w:t>
+      </w:r>
+      <w:r>
+        <w:t xml:space="preserve"> </w:t>
+      </w:r>
+      <w:r>
+        <w:t>perangkat yang diperlukan (apabila ada).</w:t>
+      </w:r>
+    </w:p>
+    <w:p>
+      <w:pPr>
+        <w:spacing w:line="240" w:lineRule="auto"/>
+        <w:jc w:val="both"/>
+      </w:pPr>
+      <w:r>
+        <w:t>Dengan Hak Bebas Royalti Non-Eksklusif ini pihak Universitas Bina Insani berhakmenyimpan, mengalih-media atau format-kan, mengelolaannya dalam pangkalan data (database),mendistribusikannya dan menampilkan atau mempublikasikannya di internet atau media lain</w:t>
+      </w:r>
+      <w:r>
+        <w:t xml:space="preserve"> </w:t>
+      </w:r>
+      <w:r>
+        <w:t>untuk kepentingan akademis tanpa perlu meminta ijin dari kami selama tetap mencantumkan nama</w:t>
+      </w:r>
+      <w:r>
+        <w:t xml:space="preserve"> </w:t>
+      </w:r>
+      <w:r>
+        <w:t>kami sebagai penulis/pencipta karya ilmiah tersebut.</w:t>
+      </w:r>
+    </w:p>
+    <w:p>
+      <w:pPr>
+        <w:spacing w:line="240" w:lineRule="auto"/>
+        <w:jc w:val="both"/>
+      </w:pPr>
+      <w:r>
+        <w:t>Saya bersedia untuk menanggung secara pribadi, tanpa melibatkan pihak Universitas Bina Insani,</w:t>
+      </w:r>
+      <w:r>
+        <w:t xml:space="preserve"> </w:t>
+      </w:r>
+      <w:r>
+        <w:t>segala bentuk tuntutan hukum yang timbul atas pelanggaran Hak Cipta dalam karya ilmiah saya ini.</w:t>
+      </w:r>
+    </w:p>
+    <w:p>
+      <w:pPr>
+        <w:spacing w:line="240" w:lineRule="auto"/>
+        <w:jc w:val="both"/>
+      </w:pPr>
+      <w:r>
+        <w:t>Demikian pernyataan ini saya buat dengan sebenarnya.</w:t>
+      </w:r>
+    </w:p>
+    <w:p/>
+    <w:p/>
+    <w:p>
+      <w:pPr>
+        <w:spacing w:after="0" w:line="360" w:lineRule="auto"/>
+        <w:jc w:val="both"/>
+        <w:rPr>
+          <w:rFonts w:eastAsia="Times New Roman" w:cs="Times New Roman"/>
+          <w:color w:val="000000"/>
+          <w:kern w:val="0"/>
+          <w14:ligatures w14:val="none"/>
+        </w:rPr>
+      </w:pPr>
+      <w:r>
+        <w:rPr>
+          <w:rFonts w:eastAsia="Times New Roman" w:cs="Times New Roman"/>
+          <w:color w:val="000000"/>
+          <w:kern w:val="0"/>
+          <w14:ligatures w14:val="none"/>
+        </w:rPr>
+        <w:t>Bekasi, 15 Mei 2025</w:t>
+      </w:r>
+    </w:p>
+    <w:p>
+      <w:pPr>
+        <w:spacing w:before="240" w:line="240" w:lineRule="auto"/>
+        <w:rPr>
+          <w:rFonts w:eastAsia="Times New Roman" w:cs="Times New Roman"/>
+          <w:color w:val="000000"/>
+          <w:kern w:val="0"/>
+          <w14:ligatures w14:val="none"/>
+        </w:rPr>
+      </w:pPr>
+      <w:r>
+        <w:rPr>
+          <w:rFonts w:eastAsia="Times New Roman" w:cs="Times New Roman"/>
+          <w:color w:val="000000"/>
+          <w:kern w:val="0"/>
+          <w14:ligatures w14:val="none"/>
+        </w:rPr>
+        <w:t>Materai</w:t>
+      </w:r>
+    </w:p>
+    <w:p>
+      <w:pPr>
+        <w:spacing w:before="240" w:line="240" w:lineRule="auto"/>
+        <w:rPr>
+          <w:rFonts w:eastAsia="Times New Roman" w:cs="Times New Roman"/>
+          <w:color w:val="000000"/>
+          <w:kern w:val="0"/>
+          <w14:ligatures w14:val="none"/>
+        </w:rPr>
+      </w:pPr>
+      <w:r>
+        <w:rPr>
+          <w:rFonts w:eastAsia="Times New Roman" w:cs="Times New Roman"/>
+          <w:color w:val="000000"/>
+          <w:kern w:val="0"/>
+          <w14:ligatures w14:val="none"/>
+        </w:rPr>
+        <w:t>Rp 10.000,-</w:t>
+      </w:r>
+    </w:p>
+    <w:p>
+      <w:pPr>
+        <w:spacing w:after="0" w:line="360" w:lineRule="auto"/>
+        <w:rPr>
+          <w:rFonts w:eastAsia="Times New Roman" w:cs="Times New Roman"/>
+          <w:color w:val="000000"/>
+          <w:kern w:val="0"/>
+          <w14:ligatures w14:val="none"/>
+        </w:rPr>
+      </w:pPr>
+      <w:r>
+        <w:rPr>
+          <w:rFonts w:eastAsia="Times New Roman" w:cs="Times New Roman"/>
+          <w:b/>
+          <w:bCs/>
+          <w:color w:val="000000"/>
+          <w:kern w:val="0"/>
+          <w14:ligatures w14:val="none"/>
+        </w:rPr>
+        <w:t>M. Rizky Maulana</w:t>
+      </w:r>
+    </w:p>
+    <w:p/>
+    <w:p/>
+    <w:p/>
+    <w:p/>
+    <w:p/>
+    <w:p/>
+    <w:p/>
+    <w:p/>
     <w:p/>
     <w:p>
       <w:pPr>
@@ -53,7 +1832,14 @@
         <w:rPr>
           <w:color w:val="000000" w:themeColor="text1"/>
         </w:rPr>
-        <w:t xml:space="preserve"> bersifat tidak kontinu tetapi sering berlangsung pada durasi panjang saat jam-jam ibadah dan kegiatan. Data statistik nasional menunjukkan besarnya kebutuhan energi listrik yang perlu dikelola secara lebih efisien, di mana penjualan listrik total oleh PT PLN (Persero) untuk tahun 2023 tercatat sebesar 288.435,78 GWh dan kelompok “lainnya” (termasuk fasilitas sosial dan pemerintahan) mencapai 20.396,41 GWh atau sekitar 7,07% dari total penjualan (PT PLN (Persero), 2024). Hal tersebut mengindikasikan bahwa terdapat potensi penghematan pada sektor-sektor non-perumahan, termasuk tempat ibadah. Dengan demikian, upaya untuk meningkatkan efisiensi energi melalui pemantauan dan pengendalian konsumsi lampu dan kipas angin menjadi hal yang penting untuk menekan biaya operasional serta mendukung pengelolaan fasilitas </w:t>
+        <w:t xml:space="preserve"> bersifat tidak kontinu tetapi sering berlangsung pada durasi panjang saat jam-jam ibadah dan kegiatan. Data statistik nasional menunjukkan besarnya kebutuhan energi listrik yang perlu dikelola secara lebih efisien, di mana penjualan listrik total oleh PT PLN (Persero) untuk tahun 2023 tercatat sebesar 288.435,78 GWh dan kelompok “lainnya” (termasuk fasilitas sosial dan pemerintahan) mencapai 20.396,41 GWh atau sekitar 7,07% dari total penjualan (PT PLN (Persero), 2024). Hal tersebut mengindikasikan bahwa terdapat </w:t>
+      </w:r>
+      <w:r>
+        <w:rPr>
+          <w:color w:val="000000" w:themeColor="text1"/>
+        </w:rPr>
+        <w:lastRenderedPageBreak/>
+        <w:t xml:space="preserve">potensi penghematan pada sektor-sektor non-perumahan, termasuk tempat ibadah. Dengan demikian, upaya untuk meningkatkan efisiensi energi melalui pemantauan dan pengendalian konsumsi lampu dan kipas angin menjadi hal yang penting untuk menekan biaya operasional serta mendukung pengelolaan fasilitas </w:t>
       </w:r>
       <w:r>
         <w:rPr>
@@ -93,14 +1879,7 @@
         <w:rPr>
           <w:color w:val="000000" w:themeColor="text1"/>
         </w:rPr>
-        <w:t xml:space="preserve"> masih banyak dikendalikan secara manual tanpa sistem pemantauan terintegrasi, sehingga </w:t>
-      </w:r>
-      <w:r>
-        <w:rPr>
-          <w:color w:val="000000" w:themeColor="text1"/>
-        </w:rPr>
-        <w:lastRenderedPageBreak/>
-        <w:t xml:space="preserve">pengoperasian perangkat sangat bergantung pada kebiasaan dan kedisiplinan pengurus </w:t>
+        <w:t xml:space="preserve"> masih banyak dikendalikan secara manual tanpa sistem pemantauan terintegrasi, sehingga pengoperasian perangkat sangat bergantung pada kebiasaan dan kedisiplinan pengurus </w:t>
       </w:r>
       <w:r>
         <w:rPr>
@@ -165,14 +1944,14 @@
         <w:rPr>
           <w:color w:val="000000" w:themeColor="text1"/>
         </w:rPr>
-        <w:t xml:space="preserve">Pemanfaatan IoT dalam sistem monitoring energi memungkinkan pengumpulan dan pemantauan konsumsi energi secara otomatis melalui integrasi sensor dan sistem manajemen bangunan, sehingga mengurangi ketergantungan pada pencatatan manual dan meningkatkan keandalan data operasional energi (Rajaram &amp; Swathika, 2025: 1-2). Data konsumsi energi yang diperoleh dari perangkat IoT dapat disimpan, dikelola, dan dianalisis melalui platform terintegrasi pada lapisan aplikasi, yang berfungsi sebagai sarana pemantauan, analisis data, dan pendukung pengambilan keputusan dalam pengelolaan energi bangunan secara efisien dan berkelanjutan (Zaman et al., 2024: 6-7). Oleh karena itu, pendekatan teknologi IoT yang terintegrasi dengan sistem berbasis web menjadi solusi yang </w:t>
+        <w:t xml:space="preserve">Pemanfaatan IoT dalam sistem monitoring energi memungkinkan pengumpulan dan pemantauan konsumsi energi secara otomatis melalui integrasi sensor dan sistem manajemen bangunan, sehingga mengurangi ketergantungan </w:t>
       </w:r>
       <w:r>
         <w:rPr>
           <w:color w:val="000000" w:themeColor="text1"/>
         </w:rPr>
         <w:lastRenderedPageBreak/>
-        <w:t xml:space="preserve">relevan untuk merancang sistem monitoring konsumsi energi lampu dan kipas angin pada </w:t>
+        <w:t xml:space="preserve">pada pencatatan manual dan meningkatkan keandalan data operasional energi (Rajaram &amp; Swathika, 2025: 1-2). Data konsumsi energi yang diperoleh dari perangkat IoT dapat disimpan, dikelola, dan dianalisis melalui platform terintegrasi pada lapisan aplikasi, yang berfungsi sebagai sarana pemantauan, analisis data, dan pendukung pengambilan keputusan dalam pengelolaan energi bangunan secara efisien dan berkelanjutan (Zaman et al., 2024: 6-7). Oleh karena itu, pendekatan teknologi IoT yang terintegrasi dengan sistem berbasis web menjadi solusi yang relevan untuk merancang sistem monitoring konsumsi energi lampu dan kipas angin pada </w:t>
       </w:r>
       <w:r>
         <w:rPr>
@@ -271,6 +2050,7 @@
         <w:rPr>
           <w:color w:val="000000" w:themeColor="text1"/>
         </w:rPr>
+        <w:lastRenderedPageBreak/>
         <w:t xml:space="preserve">Melalui penerapan sistem monitoring berbasis Internet of Things ini, diharapkan pengelolaan konsumsi energi listrik pada </w:t>
       </w:r>
       <w:r>
@@ -500,6 +2280,7 @@
         <w:rPr>
           <w:color w:val="000000" w:themeColor="text1"/>
         </w:rPr>
+        <w:lastRenderedPageBreak/>
         <w:t xml:space="preserve">Penelitian ini dibatasi pada perancangan sistem monitoring konsumsi energi lampu dan kipas angin pada </w:t>
       </w:r>
       <w:r>
@@ -554,7 +2335,6 @@
         <w:rPr>
           <w:color w:val="000000" w:themeColor="text1"/>
         </w:rPr>
-        <w:lastRenderedPageBreak/>
         <w:t>Penelitian ini berfokus pada penerapan teknologi Internet of Things (IoT) sebagai dasar sistem monitoring konsumsi energi (dual mode, yaitu otomatis dan manual).</w:t>
       </w:r>
     </w:p>
@@ -781,6 +2561,7 @@
         <w:pStyle w:val="Heading2"/>
       </w:pPr>
       <w:r>
+        <w:lastRenderedPageBreak/>
         <w:t>Tujuan dan Manfaat</w:t>
       </w:r>
     </w:p>
@@ -867,7 +2648,6 @@
         <w:rPr>
           <w:color w:val="000000" w:themeColor="text1"/>
         </w:rPr>
-        <w:lastRenderedPageBreak/>
         <w:t>Me</w:t>
       </w:r>
       <w:r>
@@ -1079,6 +2859,7 @@
         <w:rPr>
           <w:color w:val="000000" w:themeColor="text1"/>
         </w:rPr>
+        <w:lastRenderedPageBreak/>
         <w:t xml:space="preserve">Menjadi referensi dalam perancangan sistem monitoring konsumsi energi berbasis Internet of Things, khususnya pada penerapan monitoring energi lampu dan kipas angin di </w:t>
       </w:r>
       <w:r>
@@ -1160,7 +2941,6 @@
           <w:rFonts w:eastAsiaTheme="majorEastAsia"/>
           <w:color w:val="000000" w:themeColor="text1"/>
         </w:rPr>
-        <w:lastRenderedPageBreak/>
         <w:t xml:space="preserve">BAB I </w:t>
       </w:r>
       <w:r>
@@ -1350,7 +3130,14 @@
         <w:rPr>
           <w:color w:val="000000" w:themeColor="text1"/>
         </w:rPr>
-        <w:t>. Pembahasan meliputi desain penelitian, teknik pengumpulan data, perangkat yang digunakan, serta metode analisis data.</w:t>
+        <w:t xml:space="preserve">. Pembahasan meliputi desain penelitian, </w:t>
+      </w:r>
+      <w:r>
+        <w:rPr>
+          <w:color w:val="000000" w:themeColor="text1"/>
+        </w:rPr>
+        <w:lastRenderedPageBreak/>
+        <w:t>teknik pengumpulan data, perangkat yang digunakan, serta metode analisis data.</w:t>
       </w:r>
     </w:p>
     <w:p>
@@ -1665,7 +3452,6 @@
         <w:spacing w:before="0" w:after="0"/>
       </w:pPr>
       <w:r>
-        <w:lastRenderedPageBreak/>
         <w:br/>
         <w:t>LANDASAN TEORI</w:t>
       </w:r>
@@ -1751,7 +3537,15 @@
           <w:rFonts w:cs="Times New Roman"/>
           <w:color w:val="000000" w:themeColor="text1"/>
         </w:rPr>
-        <w:t xml:space="preserve"> (IoT) merupakan konsep teknologi yang memungkinkan berbagai perangkat fisik terhubung ke jaringan internet sehingga perangkat tersebut mampu mengumpulkan, mengirimkan, dan memproses data secara otomatis. IoT memungkinkan perangkat bekerja secara mandiri tanpa keterlibatan manusia secara langsung, sehingga sangat sesuai diterapkan pada sistem </w:t>
+        <w:t xml:space="preserve"> (IoT) merupakan konsep teknologi yang memungkinkan berbagai perangkat fisik terhubung ke jaringan internet </w:t>
+      </w:r>
+      <w:r>
+        <w:rPr>
+          <w:rFonts w:cs="Times New Roman"/>
+          <w:color w:val="000000" w:themeColor="text1"/>
+        </w:rPr>
+        <w:lastRenderedPageBreak/>
+        <w:t xml:space="preserve">sehingga perangkat tersebut mampu mengumpulkan, mengirimkan, dan memproses data secara otomatis. IoT memungkinkan perangkat bekerja secara mandiri tanpa keterlibatan manusia secara langsung, sehingga sangat sesuai diterapkan pada sistem </w:t>
       </w:r>
       <w:r>
         <w:rPr>
@@ -1808,16 +3602,7 @@
           <w:iCs/>
           <w:color w:val="000000" w:themeColor="text1"/>
         </w:rPr>
-        <w:t xml:space="preserve">“The Internet of Things (IoT) is a network of devices, </w:t>
-      </w:r>
-      <w:r>
-        <w:rPr>
-          <w:i/>
-          <w:iCs/>
-          <w:color w:val="000000" w:themeColor="text1"/>
-        </w:rPr>
-        <w:lastRenderedPageBreak/>
-        <w:t xml:space="preserve">users, and services; their connectivity enables sensing, decision-making, and reactions.” (Hercog et al., 2023: 1) </w:t>
+        <w:t xml:space="preserve">“The Internet of Things (IoT) is a network of devices, users, and services; their connectivity enables sensing, decision-making, and reactions.” (Hercog et al., 2023: 1) </w:t>
       </w:r>
     </w:p>
     <w:p>
@@ -1868,7 +3653,16 @@
           <w:iCs/>
           <w:color w:val="000000" w:themeColor="text1"/>
         </w:rPr>
-        <w:t>“IoT devices support three layers: the physical layer, which comprises sensors and actuators; the network layer, which interconnects the devices via networks all the way to the users; the application layer, which connects physical and network layers digitally and facilitates interactions between the user and other machines, thus allowing people to make decisions at a higher level of control or to automate selected tasks.” (Hercog et al., 2023: 1).</w:t>
+        <w:t xml:space="preserve">“IoT devices support three layers: the physical layer, which comprises sensors and actuators; the network layer, which interconnects the devices via networks all the way to the users; the application layer, which connects physical and network layers digitally and facilitates interactions between </w:t>
+      </w:r>
+      <w:r>
+        <w:rPr>
+          <w:i/>
+          <w:iCs/>
+          <w:color w:val="000000" w:themeColor="text1"/>
+        </w:rPr>
+        <w:lastRenderedPageBreak/>
+        <w:t>the user and other machines, thus allowing people to make decisions at a higher level of control or to automate selected tasks.” (Hercog et al., 2023: 1).</w:t>
       </w:r>
     </w:p>
     <w:p>
@@ -1912,14 +3706,7 @@
         <w:rPr>
           <w:color w:val="000000" w:themeColor="text1"/>
         </w:rPr>
-        <w:t xml:space="preserve"> untuk dianalisis. Informasi ini sangat berguna untuk </w:t>
-      </w:r>
-      <w:r>
-        <w:rPr>
-          <w:color w:val="000000" w:themeColor="text1"/>
-        </w:rPr>
-        <w:lastRenderedPageBreak/>
-        <w:t>mengetahui pola konsumsi energi dan mendukung upaya efisiensi energi (Hercog et al., 2023: 2).</w:t>
+        <w:t xml:space="preserve"> untuk dianalisis. Informasi ini sangat berguna untuk mengetahui pola konsumsi energi dan mendukung upaya efisiensi energi (Hercog et al., 2023: 2).</w:t>
       </w:r>
     </w:p>
     <w:p>
@@ -2036,6 +3823,7 @@
         <w:spacing w:after="0" w:afterAutospacing="0"/>
       </w:pPr>
       <w:r>
+        <w:lastRenderedPageBreak/>
         <w:t>ESP8266</w:t>
       </w:r>
     </w:p>
@@ -2056,7 +3844,6 @@
         <w:jc w:val="both"/>
       </w:pPr>
       <w:r>
-        <w:lastRenderedPageBreak/>
         <w:t>ESP8266 juga dapat digunakan sebagai perangkat kendali dalam sistem smart room yang terhubung dengan jaringan komputer. Dengan dukungan teknologi Wi-Fi, ESP8266 mampu mengontrol berbagai perangkat seperti lampu, AC, dan perangkat elektronik lainnya melalui smartphone sehingga memberikan kemudahan dan efisiensi dalam pengoperasian (Nugroho et al., 2023: 55).</w:t>
       </w:r>
     </w:p>
@@ -2092,6 +3879,7 @@
         <w:spacing w:after="0" w:afterAutospacing="0"/>
       </w:pPr>
       <w:r>
+        <w:lastRenderedPageBreak/>
         <w:t>Sensor PIR (HC-SR501)</w:t>
       </w:r>
     </w:p>
@@ -2153,14 +3941,7 @@
         <w:rPr>
           <w:rFonts w:cs="Times New Roman"/>
         </w:rPr>
-        <w:t xml:space="preserve">Prinsip kerja sensor PIR didasarkan pada kemampuan mendeteksi perubahan energi panas yang berada pada rentang panjang gelombang infra merah tertentu. Ketika terdapat pergerakan manusia di area jangkauan sensor, terjadi perubahan radiasi infra merah yang kemudian diubah menjadi sinyal listrik. Hal tersebut dijelaskan dalam penelitian Juliansyah et al. </w:t>
-      </w:r>
-      <w:r>
-        <w:rPr>
-          <w:rFonts w:cs="Times New Roman"/>
-        </w:rPr>
-        <w:lastRenderedPageBreak/>
-        <w:t xml:space="preserve">(2021) yang menyatakan bahwa:  “Sensor PIR digunakan karena sensor tersebut dapat mendeteksi pancaran gelombang inframerah dari manusia, sehingga objek yang tertuju adalah manusia. Sensor PIR juga menerima radiasi panas dari manusia, jadi ketika manusia bergerak sensor ini akan menerima perubahan radiasi yang dipancarkan oleh manusia.” (Juliansyah et al., 2021: 199) </w:t>
+        <w:t xml:space="preserve">Prinsip kerja sensor PIR didasarkan pada kemampuan mendeteksi perubahan energi panas yang berada pada rentang panjang gelombang infra merah tertentu. Ketika terdapat pergerakan manusia di area jangkauan sensor, terjadi perubahan radiasi infra merah yang kemudian diubah menjadi sinyal listrik. Hal tersebut dijelaskan dalam penelitian Juliansyah et al. (2021) yang menyatakan bahwa:  “Sensor PIR digunakan karena sensor tersebut dapat mendeteksi pancaran gelombang inframerah dari manusia, sehingga objek yang tertuju adalah manusia. Sensor PIR juga menerima radiasi panas dari manusia, jadi ketika manusia bergerak sensor ini akan menerima perubahan radiasi yang dipancarkan oleh manusia.” (Juliansyah et al., 2021: 199) </w:t>
       </w:r>
     </w:p>
     <w:p>
@@ -2251,6 +4032,7 @@
         <w:rPr>
           <w:rFonts w:cs="Times New Roman"/>
         </w:rPr>
+        <w:lastRenderedPageBreak/>
         <w:t>Sensor PIR HC-SR501 memiliki sudut deteksi yang lebar dan dapat mendeteksi objek bergerak dari berbagai arah, seperti depan, kanan, dan kiri. Kemampuan ini membuat sensor PIR efektif digunakan pada ruangan dengan aktivitas manusia yang dinamis (Juliansyah et al., 2021: 205). Hal ini dibuktikan dalam penelitian sistem deteksi gerak yang menyatakan bahwa: “Sensor PIR HC-SR501 juga bisa mendeteksi objek gerak dari sisi kanan, kiri dan depan.” (Juliansyah et al., 2021: 205)</w:t>
       </w:r>
     </w:p>
@@ -2317,14 +4099,7 @@
         <w:rPr>
           <w:rFonts w:cs="Times New Roman"/>
         </w:rPr>
-        <w:t xml:space="preserve">“Sensor Pasif Infra Red (PIR) yang difungsikan </w:t>
-      </w:r>
-      <w:r>
-        <w:rPr>
-          <w:rFonts w:cs="Times New Roman"/>
-        </w:rPr>
-        <w:lastRenderedPageBreak/>
-        <w:t xml:space="preserve">untuk mendeteksi orang yang berada dalam ruangan.” (Ramschie et al., 2021: 175) </w:t>
+        <w:t xml:space="preserve">“Sensor Pasif Infra Red (PIR) yang difungsikan untuk mendeteksi orang yang berada dalam ruangan.” (Ramschie et al., 2021: 175) </w:t>
       </w:r>
     </w:p>
     <w:p>
@@ -2437,6 +4212,7 @@
         <w:rPr>
           <w:color w:val="000000" w:themeColor="text1"/>
         </w:rPr>
+        <w:lastRenderedPageBreak/>
         <w:t>ESP8266</w:t>
       </w:r>
       <w:r>
@@ -2503,7 +4279,6 @@
           <w:i/>
           <w:iCs/>
         </w:rPr>
-        <w:lastRenderedPageBreak/>
         <w:t xml:space="preserve">“The PZEM-004T sensor reads the load and sends data to the NodeMCU </w:t>
       </w:r>
       <w:r>
@@ -2652,7 +4427,14 @@
         <w:rPr>
           <w:color w:val="000000" w:themeColor="text1"/>
         </w:rPr>
-        <w:t xml:space="preserve"> untuk selanjutnya disimpan dalam basis data dan ditampilkan melalui </w:t>
+        <w:t xml:space="preserve"> untuk selanjutnya disimpan dalam basis data dan </w:t>
+      </w:r>
+      <w:r>
+        <w:rPr>
+          <w:color w:val="000000" w:themeColor="text1"/>
+        </w:rPr>
+        <w:lastRenderedPageBreak/>
+        <w:t xml:space="preserve">ditampilkan melalui </w:t>
       </w:r>
       <w:r>
         <w:rPr>
@@ -2735,14 +4517,7 @@
         <w:rPr>
           <w:rFonts w:cs="Times New Roman"/>
         </w:rPr>
-        <w:t xml:space="preserve"> (IoT) untuk mengendalikan perangkat listrik berdaya besar menggunakan sinyal kendali berdaya rendah dari mikrokontroler. Relay berfungsi sebagai penghubung antara rangkaian tegangan rendah dan </w:t>
-      </w:r>
-      <w:r>
-        <w:rPr>
-          <w:rFonts w:cs="Times New Roman"/>
-        </w:rPr>
-        <w:lastRenderedPageBreak/>
-        <w:t xml:space="preserve">beban listrik bertegangan tinggi, sehingga memungkinkan pengendalian perangkat listrik secara aman tanpa menghubungkan mikrokontroler secara langsung ke sumber listrik (Nireekshana et al., 2025: 5). Hal ini sejalan dengan penjelasan Nireekshana et al. (2025) yang menyatakan bahwa: </w:t>
+        <w:t xml:space="preserve"> (IoT) untuk mengendalikan perangkat listrik berdaya besar menggunakan sinyal kendali berdaya rendah dari mikrokontroler. Relay berfungsi sebagai penghubung antara rangkaian tegangan rendah dan beban listrik bertegangan tinggi, sehingga memungkinkan pengendalian perangkat listrik secara aman tanpa menghubungkan mikrokontroler secara langsung ke sumber listrik (Nireekshana et al., 2025: 5). Hal ini sejalan dengan penjelasan Nireekshana et al. (2025) yang menyatakan bahwa: </w:t>
       </w:r>
       <w:r>
         <w:rPr>
@@ -2868,6 +4643,7 @@
         <w:rPr>
           <w:color w:val="000000" w:themeColor="text1"/>
         </w:rPr>
+        <w:lastRenderedPageBreak/>
         <w:t xml:space="preserve">Relay </w:t>
       </w:r>
       <w:r>
@@ -2914,7 +4690,6 @@
         <w:rPr>
           <w:color w:val="000000" w:themeColor="text1"/>
         </w:rPr>
-        <w:lastRenderedPageBreak/>
         <w:t xml:space="preserve">Pada implementasi sistem berbasis </w:t>
       </w:r>
       <w:r>
@@ -3092,7 +4867,14 @@
         <w:rPr>
           <w:color w:val="000000" w:themeColor="text1"/>
         </w:rPr>
-        <w:t xml:space="preserve">Lampu merupakan perangkat penerangan listrik yang termasuk ke dalam kategori beban resistif, yaitu beban listrik yang mengubah energi listrik menjadi energi lain seperti cahaya dan panas tanpa melibatkan komponen induktif atau kapasitif yang signifikan. Beban resistif memiliki karakteristik utama berupa arus dan tegangan yang berada pada fase yang sama, sehingga konsumsi dayanya relatif stabil selama perangkat beroperasi (Hartono et al., 2023: 61). Hal tersebut dijelaskan oleh Hartono et al. (2023) dalam Jurnal Cyclotron bahwa: “Beban resistif (Z = R) merupakan beban resistor murni, dimana energi listrik diubah menjadi energi panas atau mekanik dan beban ini menyerap daya semu yang seluruhnya diubah menjadi daya aktif.” (Hartono et al., 2023: 61) </w:t>
+        <w:t xml:space="preserve">Lampu merupakan perangkat penerangan listrik yang termasuk ke dalam kategori beban resistif, yaitu beban listrik yang mengubah energi listrik menjadi energi lain seperti cahaya dan panas tanpa melibatkan komponen induktif atau kapasitif yang signifikan. Beban resistif memiliki karakteristik utama berupa arus dan tegangan yang berada pada fase yang sama, sehingga konsumsi dayanya relatif </w:t>
+      </w:r>
+      <w:r>
+        <w:rPr>
+          <w:color w:val="000000" w:themeColor="text1"/>
+        </w:rPr>
+        <w:lastRenderedPageBreak/>
+        <w:t xml:space="preserve">stabil selama perangkat beroperasi (Hartono et al., 2023: 61). Hal tersebut dijelaskan oleh Hartono et al. (2023) dalam Jurnal Cyclotron bahwa: “Beban resistif (Z = R) merupakan beban resistor murni, dimana energi listrik diubah menjadi energi panas atau mekanik dan beban ini menyerap daya semu yang seluruhnya diubah menjadi daya aktif.” (Hartono et al., 2023: 61) </w:t>
       </w:r>
     </w:p>
     <w:p>
@@ -3108,7 +4890,6 @@
         <w:rPr>
           <w:color w:val="000000" w:themeColor="text1"/>
         </w:rPr>
-        <w:lastRenderedPageBreak/>
         <w:t>Lampu berdaya rendah seperti lampu AC 5 Watt banyak digunakan pada bangunan umum karena memiliki efisiensi energi yang tinggi serta konsumsi daya yang relatif kecil. Penggunaan lampu dengan daya rendah bertujuan untuk menekan konsumsi energi listrik tanpa mengurangi fungsi utama sebagai penerangan. Oleh karena itu, lampu sering dijadikan objek pengujian dalam penelitian monitoring konsumsi energi listrik (Wulandari &amp; Surantha, 2024: 3).</w:t>
       </w:r>
     </w:p>
@@ -3165,14 +4946,8 @@
         <w:rPr>
           <w:color w:val="000000" w:themeColor="text1"/>
         </w:rPr>
-        <w:t xml:space="preserve">Pada pengujian sistem monitoring daya listrik berbasis IoT, Hartono et al. (2023) menggunakan lampu sebagai representasi beban resistif dan memperoleh hasil pengukuran yang konsisten, sebagaimana ditunjukkan pada pengujian beban resistif menggunakan lampu LED:“Hasil pengujian AMPD terhadap beban resistif yang disimulasikan oleh lampu LED memberikan angka prediksi secara real-time </w:t>
-      </w:r>
-      <w:r>
-        <w:rPr>
-          <w:color w:val="000000" w:themeColor="text1"/>
-        </w:rPr>
         <w:lastRenderedPageBreak/>
-        <w:t xml:space="preserve">dengan penunjukkan angka prediksi yang mendekati dengan jumlah daya aktual pada prediksi kebutuhan energi dan mendekati jumlah biaya aktual pada prediksi biaya energi untuk beban resistif.” (Hartono et al., 2023: 64) </w:t>
+        <w:t xml:space="preserve">Pada pengujian sistem monitoring daya listrik berbasis IoT, Hartono et al. (2023) menggunakan lampu sebagai representasi beban resistif dan memperoleh hasil pengukuran yang konsisten, sebagaimana ditunjukkan pada pengujian beban resistif menggunakan lampu LED:“Hasil pengujian AMPD terhadap beban resistif yang disimulasikan oleh lampu LED memberikan angka prediksi secara real-time dengan penunjukkan angka prediksi yang mendekati dengan jumlah daya aktual pada prediksi kebutuhan energi dan mendekati jumlah biaya aktual pada prediksi biaya energi untuk beban resistif.” (Hartono et al., 2023: 64) </w:t>
       </w:r>
     </w:p>
     <w:p>
@@ -3327,7 +5102,15 @@
           <w:rFonts w:cs="Times New Roman"/>
           <w:color w:val="000000" w:themeColor="text1"/>
         </w:rPr>
-        <w:t>Karakteristik konsumsi daya pada kipas angin menunjukkan sifat beban induktif, di mana konsumsi arus dan daya tidak bersifat konstan selama perangkat beroperasi. Hal ini disebabkan oleh adanya motor listrik pada kipas angin yang bekerja secara elektromagnetik, sehingga nilai daya dapat berubah sesuai dengan kondisi kerja motor. Kondisi ini menjadikan kipas angin memiliki karakteristik konsumsi energi yang berbeda dibandingkan dengan beban resistif (Setiati et al., 2023: 56).</w:t>
+        <w:t xml:space="preserve">Karakteristik konsumsi daya pada kipas angin menunjukkan sifat beban induktif, di mana konsumsi arus dan daya tidak bersifat konstan selama perangkat beroperasi. Hal ini disebabkan oleh adanya motor listrik pada kipas angin yang bekerja secara elektromagnetik, sehingga nilai daya dapat </w:t>
+      </w:r>
+      <w:r>
+        <w:rPr>
+          <w:rFonts w:cs="Times New Roman"/>
+          <w:color w:val="000000" w:themeColor="text1"/>
+        </w:rPr>
+        <w:lastRenderedPageBreak/>
+        <w:t>berubah sesuai dengan kondisi kerja motor. Kondisi ini menjadikan kipas angin memiliki karakteristik konsumsi energi yang berbeda dibandingkan dengan beban resistif (Setiati et al., 2023: 56).</w:t>
       </w:r>
     </w:p>
     <w:p>
@@ -3354,14 +5137,7 @@
         <w:rPr>
           <w:color w:val="000000" w:themeColor="text1"/>
         </w:rPr>
-        <w:t xml:space="preserve">Hal tersebut sejalan dengan penelitian Setiati et al. yang menyatakan bahwa kipas angin merupakan perangkat berbasis motor listrik yang bekerja secara terus-menerus dan dapat menimbulkan panas berlebih apabila tidak dikendalikan dengan </w:t>
-      </w:r>
-      <w:r>
-        <w:rPr>
-          <w:color w:val="000000" w:themeColor="text1"/>
-        </w:rPr>
-        <w:lastRenderedPageBreak/>
-        <w:t>baik, yang menunjukkan adanya karakteristik kerja beban induktif pada perangkat tersebut:</w:t>
+        <w:t>Hal tersebut sejalan dengan penelitian Setiati et al. yang menyatakan bahwa kipas angin merupakan perangkat berbasis motor listrik yang bekerja secara terus-menerus dan dapat menimbulkan panas berlebih apabila tidak dikendalikan dengan baik, yang menunjukkan adanya karakteristik kerja beban induktif pada perangkat tersebut:</w:t>
       </w:r>
     </w:p>
     <w:p>
@@ -3472,7 +5248,14 @@
         <w:rPr>
           <w:color w:val="000000" w:themeColor="text1"/>
         </w:rPr>
-        <w:t>) menjadi lebih rendah dibandingkan beban resistif. Faktor daya yang rendah menunjukkan adanya daya reaktif yang cukup besar, sehingga mempengaruhi efisiensi penggunaan energi listrik. Oleh karena itu, analisis konsumsi energi pada kipas angin tidak hanya memperhatikan daya aktif, tetapi juga parameter faktor daya (Agustiarmi et al., 2025: 1411).</w:t>
+        <w:t xml:space="preserve">) menjadi lebih rendah dibandingkan beban resistif. Faktor </w:t>
+      </w:r>
+      <w:r>
+        <w:rPr>
+          <w:color w:val="000000" w:themeColor="text1"/>
+        </w:rPr>
+        <w:lastRenderedPageBreak/>
+        <w:t>daya yang rendah menunjukkan adanya daya reaktif yang cukup besar, sehingga mempengaruhi efisiensi penggunaan energi listrik. Oleh karena itu, analisis konsumsi energi pada kipas angin tidak hanya memperhatikan daya aktif, tetapi juga parameter faktor daya (Agustiarmi et al., 2025: 1411).</w:t>
       </w:r>
     </w:p>
     <w:p>
@@ -3488,7 +5271,6 @@
         <w:rPr>
           <w:color w:val="000000" w:themeColor="text1"/>
         </w:rPr>
-        <w:lastRenderedPageBreak/>
         <w:t xml:space="preserve">Dalam penelitian monitoring energi listrik berbasis IoT yang dilakukan oleh Agustiarmi et al. (2025) disebutkan bahwa beban induktif seperti kipas angin memiliki nilai faktor daya yang relatif rendah sebelum dilakukan perbaikan: </w:t>
       </w:r>
       <w:r>
@@ -3595,7 +5377,14 @@
         <w:rPr>
           <w:color w:val="000000" w:themeColor="text1"/>
         </w:rPr>
-        <w:t xml:space="preserve"> konsumsi energi yang dirancang, kipas angin AC 20 Watt digunakan sebagai objek pengujian beban induktif. Data konsumsi energi yang diperoleh dari kipas angin dibandingkan dengan data dari lampu AC 5 Watt yang merupakan beban resistif, sehingga dapat dianalisis perbedaan karakteristik konsumsi energi antara beban induktif dan beban resistif. Dengan pendekatan ini, sistem </w:t>
+        <w:t xml:space="preserve"> konsumsi energi yang dirancang, kipas angin AC 20 Watt digunakan sebagai objek pengujian beban induktif. Data konsumsi energi </w:t>
+      </w:r>
+      <w:r>
+        <w:rPr>
+          <w:color w:val="000000" w:themeColor="text1"/>
+        </w:rPr>
+        <w:lastRenderedPageBreak/>
+        <w:t xml:space="preserve">yang diperoleh dari kipas angin dibandingkan dengan data dari lampu AC 5 Watt yang merupakan beban resistif, sehingga dapat dianalisis perbedaan karakteristik konsumsi energi antara beban induktif dan beban resistif. Dengan pendekatan ini, sistem </w:t>
       </w:r>
       <w:r>
         <w:rPr>
@@ -3609,14 +5398,7 @@
         <w:rPr>
           <w:color w:val="000000" w:themeColor="text1"/>
         </w:rPr>
-        <w:t xml:space="preserve"> mampu memberikan gambaran yang lebih komprehensif </w:t>
-      </w:r>
-      <w:r>
-        <w:rPr>
-          <w:color w:val="000000" w:themeColor="text1"/>
-        </w:rPr>
-        <w:lastRenderedPageBreak/>
-        <w:t>mengenai pola penggunaan energi listrik pada perangkat dengan karakteristik beban yang berbeda.</w:t>
+        <w:t xml:space="preserve"> mampu memberikan gambaran yang lebih komprehensif mengenai pola penggunaan energi listrik pada perangkat dengan karakteristik beban yang berbeda.</w:t>
       </w:r>
     </w:p>
     <w:p>
@@ -3775,7 +5557,14 @@
         <w:rPr>
           <w:color w:val="000000" w:themeColor="text1"/>
         </w:rPr>
-        <w:t xml:space="preserve"> digunakan untuk menyediakan tegangan DC 5 volt yang digunakan oleh mikrokontroler, sensor, dan modul relay. Hal ini ditegaskan dalam penelitian Tristiantoro et al. (2025) yang menyatakan bahwa: </w:t>
+        <w:t xml:space="preserve"> digunakan untuk menyediakan tegangan DC 5 volt yang digunakan oleh mikrokontroler, sensor, dan modul relay. Hal ini ditegaskan dalam penelitian </w:t>
+      </w:r>
+      <w:r>
+        <w:rPr>
+          <w:color w:val="000000" w:themeColor="text1"/>
+        </w:rPr>
+        <w:lastRenderedPageBreak/>
+        <w:t xml:space="preserve">Tristiantoro et al. (2025) yang menyatakan bahwa: </w:t>
       </w:r>
       <w:r>
         <w:rPr>
@@ -3815,7 +5604,6 @@
         <w:rPr>
           <w:color w:val="000000" w:themeColor="text1"/>
         </w:rPr>
-        <w:lastRenderedPageBreak/>
         <w:t xml:space="preserve">Kutipan tersebut menunjukkan bahwa </w:t>
       </w:r>
       <w:r>
@@ -3972,6 +5760,7 @@
           <w:iCs/>
           <w:color w:val="000000" w:themeColor="text1"/>
         </w:rPr>
+        <w:lastRenderedPageBreak/>
         <w:t>adaptor power supply</w:t>
       </w:r>
       <w:r>
@@ -4002,7 +5791,6 @@
         <w:rPr>
           <w:color w:val="000000" w:themeColor="text1"/>
         </w:rPr>
-        <w:lastRenderedPageBreak/>
         <w:t xml:space="preserve">Pada penelitian ini, </w:t>
       </w:r>
       <w:r>
@@ -4099,14 +5887,8 @@
         <w:rPr>
           <w:color w:val="000000" w:themeColor="text1"/>
         </w:rPr>
-        <w:t xml:space="preserve">Kestabilan koneksi dan kualitas kabel jumper sangat mempengaruhi keandalan sistem, terutama dalam proses pengiriman sinyal data dan suplai tegangan rendah (DC). Koneksi yang tidak stabil dapat menyebabkan gangguan </w:t>
-      </w:r>
-      <w:r>
-        <w:rPr>
-          <w:color w:val="000000" w:themeColor="text1"/>
-        </w:rPr>
         <w:lastRenderedPageBreak/>
-        <w:t xml:space="preserve">pembacaan sensor dan menurunkan performa sistem </w:t>
+        <w:t xml:space="preserve">Kestabilan koneksi dan kualitas kabel jumper sangat mempengaruhi keandalan sistem, terutama dalam proses pengiriman sinyal data dan suplai tegangan rendah (DC). Koneksi yang tidak stabil dapat menyebabkan gangguan pembacaan sensor dan menurunkan performa sistem </w:t>
       </w:r>
       <w:r>
         <w:rPr>
@@ -4192,6 +5974,7 @@
         <w:rPr>
           <w:color w:val="000000" w:themeColor="text1"/>
         </w:rPr>
+        <w:lastRenderedPageBreak/>
         <w:t xml:space="preserve">Pada penelitian ini, kabel jumper digunakan untuk menghubungkan </w:t>
       </w:r>
       <w:r>
@@ -4204,14 +5987,7 @@
         <w:rPr>
           <w:color w:val="000000" w:themeColor="text1"/>
         </w:rPr>
-        <w:t xml:space="preserve"> dengan sensor PIR dan sensor PZEM-004T, sedangkan kabel AC digunakan untuk menghubungkan sumber listrik dengan lampu dan kipas angin </w:t>
-      </w:r>
-      <w:r>
-        <w:rPr>
-          <w:color w:val="000000" w:themeColor="text1"/>
-        </w:rPr>
-        <w:lastRenderedPageBreak/>
-        <w:t xml:space="preserve">melalui modul relay. Dengan penggunaan kabel penghubung yang sesuai, sistem monitoring konsumsi energi dapat beroperasi secara stabil, aman, dan andal dalam lingkungan </w:t>
+        <w:t xml:space="preserve"> dengan sensor PIR dan sensor PZEM-004T, sedangkan kabel AC digunakan untuk menghubungkan sumber listrik dengan lampu dan kipas angin melalui modul relay. Dengan penggunaan kabel penghubung yang sesuai, sistem monitoring konsumsi energi dapat beroperasi secara stabil, aman, dan andal dalam lingkungan </w:t>
       </w:r>
       <w:r>
         <w:rPr>
@@ -4354,6 +6130,7 @@
         <w:rPr>
           <w:color w:val="000000" w:themeColor="text1"/>
         </w:rPr>
+        <w:lastRenderedPageBreak/>
         <w:t xml:space="preserve">Ciri utama dari </w:t>
       </w:r>
       <w:r>
@@ -4368,14 +6145,7 @@
         <w:rPr>
           <w:color w:val="000000" w:themeColor="text1"/>
         </w:rPr>
-        <w:t xml:space="preserve"> adalah komunikasi yang intensif, kolaborasi tim, serta kemampuan untuk merespons perubahan secara cepat. Setiap iterasi menghasilkan bagian sistem yang dapat diuji dan dievaluasi, sehingga </w:t>
-      </w:r>
-      <w:r>
-        <w:rPr>
-          <w:color w:val="000000" w:themeColor="text1"/>
-        </w:rPr>
-        <w:lastRenderedPageBreak/>
-        <w:t>kesalahan dapat terdeteksi lebih awal dan diperbaiki pada tahap berikutnya (Anifa et al., 2024: 86).</w:t>
+        <w:t xml:space="preserve"> adalah komunikasi yang intensif, kolaborasi tim, serta kemampuan untuk merespons perubahan secara cepat. Setiap iterasi menghasilkan bagian sistem yang dapat diuji dan dievaluasi, sehingga kesalahan dapat terdeteksi lebih awal dan diperbaiki pada tahap berikutnya (Anifa et al., 2024: 86).</w:t>
       </w:r>
     </w:p>
     <w:p>
@@ -4496,6 +6266,7 @@
         <w:spacing w:after="0" w:afterAutospacing="0"/>
       </w:pPr>
       <w:r>
+        <w:lastRenderedPageBreak/>
         <w:t>Website</w:t>
       </w:r>
     </w:p>
@@ -4542,16 +6313,7 @@
           <w:iCs/>
           <w:color w:val="000000" w:themeColor="text1"/>
         </w:rPr>
-        <w:t xml:space="preserve">application </w:t>
-      </w:r>
-      <w:r>
-        <w:rPr>
-          <w:i/>
-          <w:iCs/>
-          <w:color w:val="000000" w:themeColor="text1"/>
-        </w:rPr>
-        <w:lastRenderedPageBreak/>
-        <w:t>layer</w:t>
+        <w:t>application layer</w:t>
       </w:r>
       <w:r>
         <w:rPr>
@@ -4717,6 +6479,7 @@
         <w:rPr>
           <w:color w:val="000000" w:themeColor="text1"/>
         </w:rPr>
+        <w:lastRenderedPageBreak/>
         <w:t xml:space="preserve">Dalam sistem monitoring energi listrik, </w:t>
       </w:r>
       <w:r>
@@ -4753,7 +6516,6 @@
           <w:iCs/>
           <w:color w:val="000000" w:themeColor="text1"/>
         </w:rPr>
-        <w:lastRenderedPageBreak/>
         <w:t>website</w:t>
       </w:r>
       <w:r>
@@ -4926,7 +6688,14 @@
         <w:rPr>
           <w:color w:val="000000" w:themeColor="text1"/>
         </w:rPr>
-        <w:t>, mendukung pengambilan keputusan, serta memungkinkan integrasi antara fungsi pemantauan dan pengendalian perangkat listrik.</w:t>
+        <w:t xml:space="preserve">, mendukung pengambilan keputusan, serta </w:t>
+      </w:r>
+      <w:r>
+        <w:rPr>
+          <w:color w:val="000000" w:themeColor="text1"/>
+        </w:rPr>
+        <w:lastRenderedPageBreak/>
+        <w:t>memungkinkan integrasi antara fungsi pemantauan dan pengendalian perangkat listrik.</w:t>
       </w:r>
     </w:p>
     <w:p>
@@ -5008,14 +6777,7 @@
         <w:rPr>
           <w:color w:val="000000" w:themeColor="text1"/>
         </w:rPr>
-        <w:t xml:space="preserve"> dan sensor PZEM-004T, kemudian menyajikan data tersebut dalam bentuk informasi yang mudah dipahami </w:t>
-      </w:r>
-      <w:r>
-        <w:rPr>
-          <w:color w:val="000000" w:themeColor="text1"/>
-        </w:rPr>
-        <w:lastRenderedPageBreak/>
-        <w:t xml:space="preserve">oleh pengguna. Dengan demikian, </w:t>
+        <w:t xml:space="preserve"> dan sensor PZEM-004T, kemudian menyajikan data tersebut dalam bentuk informasi yang mudah dipahami oleh pengguna. Dengan demikian, </w:t>
       </w:r>
       <w:r>
         <w:rPr>
@@ -5081,6 +6843,7 @@
         <w:jc w:val="both"/>
       </w:pPr>
       <w:r>
+        <w:lastRenderedPageBreak/>
         <w:t>“PostgreSQL merupakan salah satu sistem manajemen basis data relasional berorientasi objek yang dikenal karena kestabilan, fleksibilitas, dan dukungannya terhadap berbagai fitur canggih.” (Hafsah et al., 2025: 187)</w:t>
       </w:r>
     </w:p>
@@ -5090,11 +6853,7 @@
         <w:jc w:val="both"/>
       </w:pPr>
       <w:r>
-        <w:t xml:space="preserve">Selain memiliki performa yang baik, PostgreSQL juga mendukung pengaturan keamanan data melalui mekanisme kontrol akses pengguna dan enkripsi data. Fitur tersebut memungkinkan sistem menjaga kerahasiaan dan integritas data yang tersimpan pada database. Dalam penelitian Hafsah et al. (2025) dijelaskan bahwa </w:t>
-      </w:r>
-      <w:r>
-        <w:lastRenderedPageBreak/>
-        <w:t>keamanan database menjadi aspek penting untuk melindungi sistem dari berbagai ancaman, sebagaimana dinyatakan bahwa:</w:t>
+        <w:t>Selain memiliki performa yang baik, PostgreSQL juga mendukung pengaturan keamanan data melalui mekanisme kontrol akses pengguna dan enkripsi data. Fitur tersebut memungkinkan sistem menjaga kerahasiaan dan integritas data yang tersimpan pada database. Dalam penelitian Hafsah et al. (2025) dijelaskan bahwa keamanan database menjadi aspek penting untuk melindungi sistem dari berbagai ancaman, sebagaimana dinyatakan bahwa:</w:t>
       </w:r>
     </w:p>
     <w:p>
@@ -5134,7 +6893,11 @@
         <w:jc w:val="both"/>
       </w:pPr>
       <w:r>
-        <w:t>Dengan karakteristik tersebut, PostgreSQL sangat sesuai digunakan sebagai basis data backend pada sistem monitoring energi berbasis website dan Internet of Things (IoT). Pada penelitian ini, PostgreSQL digunakan untuk menyimpan data monitoring konsumsi energi listrik yang diperoleh dari sensor PZEM-004T, data status perangkat, serta riwayat kontrol perangkat. Penggunaan PostgreSQL memungkinkan proses penyimpanan, pengolahan, dan pengambilan data dilakukan secara efisien, stabil, dan aman untuk mendukung monitoring energi secara real-time.</w:t>
+        <w:t xml:space="preserve">Dengan karakteristik tersebut, PostgreSQL sangat sesuai digunakan sebagai basis data backend pada sistem monitoring energi berbasis website dan Internet of </w:t>
+      </w:r>
+      <w:r>
+        <w:lastRenderedPageBreak/>
+        <w:t>Things (IoT). Pada penelitian ini, PostgreSQL digunakan untuk menyimpan data monitoring konsumsi energi listrik yang diperoleh dari sensor PZEM-004T, data status perangkat, serta riwayat kontrol perangkat. Penggunaan PostgreSQL memungkinkan proses penyimpanan, pengolahan, dan pengambilan data dilakukan secara efisien, stabil, dan aman untuk mendukung monitoring energi secara real-time.</w:t>
       </w:r>
     </w:p>
     <w:p>
@@ -5143,7 +6906,6 @@
         <w:spacing w:after="0" w:afterAutospacing="0"/>
       </w:pPr>
       <w:r>
-        <w:lastRenderedPageBreak/>
         <w:t>Vue.js</w:t>
       </w:r>
     </w:p>
@@ -5332,7 +7094,14 @@
         <w:rPr>
           <w:color w:val="000000" w:themeColor="text1"/>
         </w:rPr>
-        <w:t xml:space="preserve">) secara keseluruhan (Krismanto &amp; Prihanto, 2024: 219). Hal ini berdampak pada peningkatan performa dan responsivitas aplikasi </w:t>
+        <w:t xml:space="preserve">) secara keseluruhan (Krismanto &amp; Prihanto, 2024: 219). Hal ini berdampak pada </w:t>
+      </w:r>
+      <w:r>
+        <w:rPr>
+          <w:color w:val="000000" w:themeColor="text1"/>
+        </w:rPr>
+        <w:lastRenderedPageBreak/>
+        <w:t xml:space="preserve">peningkatan performa dan responsivitas aplikasi </w:t>
       </w:r>
       <w:r>
         <w:rPr>
@@ -5428,14 +7197,7 @@
         <w:rPr>
           <w:color w:val="000000" w:themeColor="text1"/>
         </w:rPr>
-        <w:t xml:space="preserve"> akan secara otomatis memperbarui </w:t>
-      </w:r>
-      <w:r>
-        <w:rPr>
-          <w:color w:val="000000" w:themeColor="text1"/>
-        </w:rPr>
-        <w:lastRenderedPageBreak/>
-        <w:t xml:space="preserve">tampilan antarmuka pengguna tanpa memuat ulang halaman </w:t>
+        <w:t xml:space="preserve"> akan secara otomatis memperbarui tampilan antarmuka pengguna tanpa memuat ulang halaman </w:t>
       </w:r>
       <w:r>
         <w:rPr>
@@ -5605,6 +7367,7 @@
         <w:rPr>
           <w:color w:val="000000" w:themeColor="text1"/>
         </w:rPr>
+        <w:lastRenderedPageBreak/>
         <w:t xml:space="preserve">Dalam sistem berbasis </w:t>
       </w:r>
       <w:r>
@@ -5705,14 +7468,7 @@
         <w:rPr>
           <w:color w:val="000000" w:themeColor="text1"/>
         </w:rPr>
-        <w:t xml:space="preserve"> konsumsi </w:t>
-      </w:r>
-      <w:r>
-        <w:rPr>
-          <w:color w:val="000000" w:themeColor="text1"/>
-        </w:rPr>
-        <w:lastRenderedPageBreak/>
-        <w:t xml:space="preserve">energi listrik. Penggunaan Vue.js diharapkan mampu menghasilkan tampilan yang responsif, interaktif, dan mudah dikembangkan sesuai kebutuhan sistem </w:t>
+        <w:t xml:space="preserve"> konsumsi energi listrik. Penggunaan Vue.js diharapkan mampu menghasilkan tampilan yang responsif, interaktif, dan mudah dikembangkan sesuai kebutuhan sistem </w:t>
       </w:r>
       <w:r>
         <w:rPr>
@@ -5867,6 +7623,7 @@
         <w:rPr>
           <w:color w:val="000000" w:themeColor="text1"/>
         </w:rPr>
+        <w:lastRenderedPageBreak/>
         <w:t xml:space="preserve">Dalam sistem berbasis </w:t>
       </w:r>
       <w:r>
@@ -5967,7 +7724,6 @@
         <w:rPr>
           <w:color w:val="000000" w:themeColor="text1"/>
         </w:rPr>
-        <w:lastRenderedPageBreak/>
         <w:t>Menurut Veena R. S., (2024) Spring Boot memiliki keunggulan dalam penyederhanaan pengembangan aplikasi backend, sebagaimana dinyatakan bahwa:</w:t>
       </w:r>
     </w:p>
@@ -6110,6 +7866,7 @@
         <w:rPr>
           <w:color w:val="000000" w:themeColor="text1"/>
         </w:rPr>
+        <w:lastRenderedPageBreak/>
         <w:t xml:space="preserve">Keunggulan lain dari Spring Boot adalah kemampuannya untuk terintegrasi dengan berbagai jenis basis data, termasuk database NoSQL seperti </w:t>
       </w:r>
       <w:r>
@@ -6166,14 +7923,7 @@
         <w:rPr>
           <w:color w:val="000000" w:themeColor="text1"/>
         </w:rPr>
-        <w:t xml:space="preserve"> yang mengelola data hasil pengukuran dari sensor </w:t>
-      </w:r>
-      <w:r>
-        <w:rPr>
-          <w:color w:val="000000" w:themeColor="text1"/>
-        </w:rPr>
-        <w:lastRenderedPageBreak/>
-        <w:t xml:space="preserve">PZEM-004T. Data tersebut diproses dan disimpan dalam basis data, kemudian disediakan kepada </w:t>
+        <w:t xml:space="preserve"> yang mengelola data hasil pengukuran dari sensor PZEM-004T. Data tersebut diproses dan disimpan dalam basis data, kemudian disediakan kepada </w:t>
       </w:r>
       <w:r>
         <w:rPr>
@@ -6268,7 +8018,11 @@
         <w:t>Packet Delivery Ratio</w:t>
       </w:r>
       <w:r>
-        <w:t xml:space="preserve"> (PDR) yang sangat baik. Sistem tersebut dinilai andal untuk pemantauan energi jarak jauh khususnya di area perkotaan.</w:t>
+        <w:t xml:space="preserve"> (PDR) yang sangat baik. </w:t>
+      </w:r>
+      <w:r>
+        <w:lastRenderedPageBreak/>
+        <w:t>Sistem tersebut dinilai andal untuk pemantauan energi jarak jauh khususnya di area perkotaan.</w:t>
       </w:r>
     </w:p>
     <w:p>
@@ -6337,11 +8091,7 @@
         <w:t>ESP8266</w:t>
       </w:r>
       <w:r>
-        <w:t xml:space="preserve"> yang dikembangkan mampu mengukur parameter kelistrikan seperti arus, tegangan, daya, dan energi dengan tingkat deviasi kurang dari 5% dibandingkan alat ukur standar, sehingga sistem dinilai memiliki akurasi </w:t>
-      </w:r>
-      <w:r>
-        <w:lastRenderedPageBreak/>
-        <w:t>yang baik dan layak digunakan untuk monitoring konsumsi listrik rumah tangga.</w:t>
+        <w:t xml:space="preserve"> yang dikembangkan mampu mengukur parameter kelistrikan seperti arus, tegangan, daya, dan energi dengan tingkat deviasi kurang dari 5% dibandingkan alat ukur standar, sehingga sistem dinilai memiliki akurasi yang baik dan layak digunakan untuk monitoring konsumsi listrik rumah tangga.</w:t>
       </w:r>
     </w:p>
     <w:p>
@@ -6413,6 +8163,7 @@
         <w:jc w:val="both"/>
       </w:pPr>
       <w:r>
+        <w:lastRenderedPageBreak/>
         <w:t>Rifa’i et al. (2025) menjelaskan bahwa sistem monitoring energi berbasis IoT mampu merekam data historis konsumsi energi dengan tingkat akurasi yang tinggi serta memberikan notifikasi ketika terjadi lonjakan penggunaan daya, sehingga sistem dinilai efektif dan ekonomis.</w:t>
       </w:r>
     </w:p>
@@ -6440,11 +8191,7 @@
         <w:jc w:val="both"/>
       </w:pPr>
       <w:r>
-        <w:t xml:space="preserve">Yusof et al. (2023) mengemukakan bahwa sistem monitoring energi berbasis Arduino dan platform Blynk mampu merekam serta menganalisis </w:t>
-      </w:r>
-      <w:r>
-        <w:lastRenderedPageBreak/>
-        <w:t>konsumsi energi harian dengan menunjukkan adanya korelasi yang kuat antara arus, tegangan, dan daya listrik.</w:t>
+        <w:t>Yusof et al. (2023) mengemukakan bahwa sistem monitoring energi berbasis Arduino dan platform Blynk mampu merekam serta menganalisis konsumsi energi harian dengan menunjukkan adanya korelasi yang kuat antara arus, tegangan, dan daya listrik.</w:t>
       </w:r>
     </w:p>
     <w:p>
@@ -6816,7 +8563,18 @@
                 <w:sz w:val="20"/>
                 <w:szCs w:val="20"/>
               </w:rPr>
-              <w:t>International Journal of Electrical, Computer and Biomedical Engineering</w:t>
+              <w:t xml:space="preserve">International Journal of Electrical, Computer and </w:t>
+            </w:r>
+            <w:r>
+              <w:rPr>
+                <w:i/>
+                <w:iCs/>
+                <w:color w:val="000000" w:themeColor="text1"/>
+                <w:sz w:val="20"/>
+                <w:szCs w:val="20"/>
+              </w:rPr>
+              <w:lastRenderedPageBreak/>
+              <w:t>Biomedical Engineering</w:t>
             </w:r>
             <w:r>
               <w:rPr>
@@ -6856,6 +8614,7 @@
                 <w:sz w:val="20"/>
                 <w:szCs w:val="20"/>
               </w:rPr>
+              <w:lastRenderedPageBreak/>
               <w:t>Pasaribu &amp; Asvial (2024)</w:t>
             </w:r>
           </w:p>
@@ -6891,7 +8650,18 @@
                 <w:sz w:val="20"/>
                 <w:szCs w:val="20"/>
               </w:rPr>
-              <w:t>Design of NB-Iot Based Household Light Electric Energy Monitoring System</w:t>
+              <w:t>Design of NB-Iot Based Househol</w:t>
+            </w:r>
+            <w:r>
+              <w:rPr>
+                <w:i/>
+                <w:iCs/>
+                <w:color w:val="000000" w:themeColor="text1"/>
+                <w:sz w:val="20"/>
+                <w:szCs w:val="20"/>
+              </w:rPr>
+              <w:lastRenderedPageBreak/>
+              <w:t>d Light Electric Energy Monitoring System</w:t>
             </w:r>
           </w:p>
         </w:tc>
@@ -6923,6 +8693,7 @@
                 <w:sz w:val="20"/>
                 <w:szCs w:val="20"/>
               </w:rPr>
+              <w:lastRenderedPageBreak/>
               <w:t xml:space="preserve">Penelitian ini berhasil merancang sistem </w:t>
             </w:r>
             <w:r>
@@ -6941,7 +8712,16 @@
                 <w:sz w:val="20"/>
                 <w:szCs w:val="20"/>
               </w:rPr>
-              <w:t xml:space="preserve"> energi listrik rumah tangga berbasis NB-IoT yang mampu menampilkan data konsumsi energi secara </w:t>
+              <w:t xml:space="preserve"> energi listrik rumah </w:t>
+            </w:r>
+            <w:r>
+              <w:rPr>
+                <w:color w:val="000000" w:themeColor="text1"/>
+                <w:sz w:val="20"/>
+                <w:szCs w:val="20"/>
+              </w:rPr>
+              <w:lastRenderedPageBreak/>
+              <w:t xml:space="preserve">tangga berbasis NB-IoT yang mampu menampilkan data konsumsi energi secara </w:t>
             </w:r>
             <w:r>
               <w:rPr>
@@ -7009,7 +8789,17 @@
                 <w:sz w:val="20"/>
                 <w:szCs w:val="20"/>
               </w:rPr>
-              <w:t>Penelitian hanya berfokus pada performa jaringan NB-IoT dan belum menganalisis konsumsi energi berdasarkan jenis beban listrik. Selain itu, tidak ada integrasi sensor aktivitas manusia untuk mengaitkan penggunaan energi dengan keberadaan pengguna ruangan.</w:t>
+              <w:lastRenderedPageBreak/>
+              <w:t xml:space="preserve">Penelitian hanya berfokus pada performa jaringan NB-IoT dan belum </w:t>
+            </w:r>
+            <w:r>
+              <w:rPr>
+                <w:color w:val="000000" w:themeColor="text1"/>
+                <w:sz w:val="20"/>
+                <w:szCs w:val="20"/>
+              </w:rPr>
+              <w:lastRenderedPageBreak/>
+              <w:t>menganalisis konsumsi energi berdasarkan jenis beban listrik. Selain itu, tidak ada integrasi sensor aktivitas manusia untuk mengaitkan penggunaan energi dengan keberadaan pengguna ruangan.</w:t>
             </w:r>
           </w:p>
         </w:tc>
@@ -7047,6 +8837,7 @@
                 <w:sz w:val="20"/>
                 <w:szCs w:val="20"/>
               </w:rPr>
+              <w:lastRenderedPageBreak/>
               <w:t>2</w:t>
             </w:r>
           </w:p>
@@ -7081,18 +8872,7 @@
                 <w:sz w:val="20"/>
                 <w:szCs w:val="20"/>
               </w:rPr>
-              <w:t xml:space="preserve">Fourth International Conference on Fog and Mobile </w:t>
-            </w:r>
-            <w:r>
-              <w:rPr>
-                <w:i/>
-                <w:iCs/>
-                <w:color w:val="000000" w:themeColor="text1"/>
-                <w:sz w:val="20"/>
-                <w:szCs w:val="20"/>
-              </w:rPr>
-              <w:lastRenderedPageBreak/>
-              <w:t xml:space="preserve">Edge Computing (FMEC) </w:t>
+              <w:t xml:space="preserve">Fourth International Conference on Fog and Mobile Edge Computing (FMEC) </w:t>
             </w:r>
             <w:r>
               <w:rPr>
@@ -7132,7 +8912,6 @@
                 <w:sz w:val="20"/>
                 <w:szCs w:val="20"/>
               </w:rPr>
-              <w:lastRenderedPageBreak/>
               <w:t>Agyeman et al. (2019)</w:t>
             </w:r>
           </w:p>
@@ -7166,16 +8945,7 @@
                 <w:sz w:val="20"/>
                 <w:szCs w:val="20"/>
               </w:rPr>
-              <w:t xml:space="preserve">Design and Implementation of </w:t>
-            </w:r>
-            <w:r>
-              <w:rPr>
-                <w:color w:val="000000" w:themeColor="text1"/>
-                <w:sz w:val="20"/>
-                <w:szCs w:val="20"/>
-              </w:rPr>
-              <w:lastRenderedPageBreak/>
-              <w:t>an IoT-Based Energy Monitoring System for Managing Smart Homes</w:t>
+              <w:t>Design and Implementation of an IoT-Based Energy Monitoring System for Managing Smart Homes</w:t>
             </w:r>
           </w:p>
         </w:tc>
@@ -7207,7 +8977,6 @@
                 <w:sz w:val="20"/>
                 <w:szCs w:val="20"/>
               </w:rPr>
-              <w:lastRenderedPageBreak/>
               <w:t xml:space="preserve">Sistem smart meter berbasis IoT berhasil mengintegrasikan </w:t>
             </w:r>
             <w:r>
@@ -7218,7 +8987,6 @@
                 <w:sz w:val="20"/>
                 <w:szCs w:val="20"/>
               </w:rPr>
-              <w:lastRenderedPageBreak/>
               <w:t>monitoring</w:t>
             </w:r>
             <w:r>
@@ -7313,17 +9081,7 @@
                 <w:sz w:val="20"/>
                 <w:szCs w:val="20"/>
               </w:rPr>
-              <w:lastRenderedPageBreak/>
-              <w:t xml:space="preserve">Sistem dirancang untuk smart home dengan arsitektur kompleks dan biaya </w:t>
-            </w:r>
-            <w:r>
-              <w:rPr>
-                <w:color w:val="000000" w:themeColor="text1"/>
-                <w:sz w:val="20"/>
-                <w:szCs w:val="20"/>
-              </w:rPr>
-              <w:lastRenderedPageBreak/>
-              <w:t>implementasi relatif tinggi. Penelitian belum mengkaji efisiensi energi pada bangunan publik serta tidak membedakan karakteristik konsumsi energi antar jenis beban.</w:t>
+              <w:t>Sistem dirancang untuk smart home dengan arsitektur kompleks dan biaya implementasi relatif tinggi. Penelitian belum mengkaji efisiensi energi pada bangunan publik serta tidak membedakan karakteristik konsumsi energi antar jenis beban.</w:t>
             </w:r>
           </w:p>
         </w:tc>
@@ -7361,7 +9119,6 @@
                 <w:sz w:val="20"/>
                 <w:szCs w:val="20"/>
               </w:rPr>
-              <w:lastRenderedPageBreak/>
               <w:t>3</w:t>
             </w:r>
           </w:p>
@@ -7559,7 +9316,16 @@
                 <w:sz w:val="20"/>
                 <w:szCs w:val="20"/>
               </w:rPr>
-              <w:t xml:space="preserve"> mampu mengukur arus, tegangan, daya, dan energi listrik dengan tingkat deviasi kurang dari 5% dibandingkan alat ukur standar. Sistem dinilai akurat dan layak diterapkan pada rumah tangga.</w:t>
+              <w:t xml:space="preserve"> mampu mengukur arus, tegangan, daya, dan energi listrik dengan tingkat deviasi kurang dari 5% dibandingkan alat ukur standar. Sistem dinilai akurat dan </w:t>
+            </w:r>
+            <w:r>
+              <w:rPr>
+                <w:color w:val="000000" w:themeColor="text1"/>
+                <w:sz w:val="20"/>
+                <w:szCs w:val="20"/>
+              </w:rPr>
+              <w:lastRenderedPageBreak/>
+              <w:t>layak diterapkan pada rumah tangga.</w:t>
             </w:r>
           </w:p>
         </w:tc>
@@ -7591,6 +9357,7 @@
                 <w:sz w:val="20"/>
                 <w:szCs w:val="20"/>
               </w:rPr>
+              <w:lastRenderedPageBreak/>
               <w:t>Penelitian belum mengkaji perilaku konsumsi energi berdasarkan jenis beban resistif dan induktif. Selain itu, sistem belum memanfaatkan data aktivitas pengguna sebagai parameter pendukung analisis efisiensi energi.</w:t>
             </w:r>
           </w:p>
@@ -7930,16 +9697,7 @@
                 <w:sz w:val="20"/>
                 <w:szCs w:val="20"/>
               </w:rPr>
-              <w:t xml:space="preserve">Seminar Nasional Teknologi Informasi dan Bisnis (SENATIB) </w:t>
-            </w:r>
-            <w:r>
-              <w:rPr>
-                <w:color w:val="000000" w:themeColor="text1"/>
-                <w:sz w:val="20"/>
-                <w:szCs w:val="20"/>
-              </w:rPr>
-              <w:lastRenderedPageBreak/>
-              <w:t>Vol.26, No.1, ISSN 2962-1968</w:t>
+              <w:t>Seminar Nasional Teknologi Informasi dan Bisnis (SENATIB) Vol.26, No.1, ISSN 2962-1968</w:t>
             </w:r>
           </w:p>
         </w:tc>
@@ -7971,7 +9729,6 @@
                 <w:sz w:val="20"/>
                 <w:szCs w:val="20"/>
               </w:rPr>
-              <w:lastRenderedPageBreak/>
               <w:t>Nugroho et al. (2025)</w:t>
             </w:r>
           </w:p>
@@ -8031,18 +9788,7 @@
                 <w:sz w:val="20"/>
                 <w:szCs w:val="20"/>
               </w:rPr>
-              <w:t xml:space="preserve">Internet </w:t>
-            </w:r>
-            <w:r>
-              <w:rPr>
-                <w:i/>
-                <w:iCs/>
-                <w:color w:val="000000" w:themeColor="text1"/>
-                <w:sz w:val="20"/>
-                <w:szCs w:val="20"/>
-              </w:rPr>
-              <w:lastRenderedPageBreak/>
-              <w:t>of Things</w:t>
+              <w:t>Internet of Things</w:t>
             </w:r>
             <w:r>
               <w:rPr>
@@ -8082,7 +9828,6 @@
                 <w:sz w:val="20"/>
                 <w:szCs w:val="20"/>
               </w:rPr>
-              <w:lastRenderedPageBreak/>
               <w:t xml:space="preserve">Sistem </w:t>
             </w:r>
             <w:r>
@@ -8117,16 +9862,7 @@
                 <w:sz w:val="20"/>
                 <w:szCs w:val="20"/>
               </w:rPr>
-              <w:t xml:space="preserve"> dan PZEM-004T mampu membedakan karakteristik </w:t>
-            </w:r>
-            <w:r>
-              <w:rPr>
-                <w:color w:val="000000" w:themeColor="text1"/>
-                <w:sz w:val="20"/>
-                <w:szCs w:val="20"/>
-              </w:rPr>
-              <w:lastRenderedPageBreak/>
-              <w:t>beberapa jenis beban listrik berdasarkan nilai daya dan faktor daya. Sistem terbukti responsif dan stabil melalui antarmuka mobile Blynk.</w:t>
+              <w:t xml:space="preserve"> dan PZEM-004T mampu membedakan karakteristik beberapa jenis beban listrik berdasarkan nilai daya dan faktor daya. Sistem terbukti responsif dan stabil melalui antarmuka mobile Blynk.</w:t>
             </w:r>
           </w:p>
         </w:tc>
@@ -8158,17 +9894,7 @@
                 <w:sz w:val="20"/>
                 <w:szCs w:val="20"/>
               </w:rPr>
-              <w:lastRenderedPageBreak/>
-              <w:t xml:space="preserve">Penelitian hanya menganalisis perbedaan karakteristik beban secara teknis dan belum mengaitkan hasil pengukuran </w:t>
-            </w:r>
-            <w:r>
-              <w:rPr>
-                <w:color w:val="000000" w:themeColor="text1"/>
-                <w:sz w:val="20"/>
-                <w:szCs w:val="20"/>
-              </w:rPr>
-              <w:lastRenderedPageBreak/>
-              <w:t>dengan pola kehadiran atau aktivitas pengguna ruangan.</w:t>
+              <w:t>Penelitian hanya menganalisis perbedaan karakteristik beban secara teknis dan belum mengaitkan hasil pengukuran dengan pola kehadiran atau aktivitas pengguna ruangan.</w:t>
             </w:r>
           </w:p>
         </w:tc>
@@ -8206,7 +9932,6 @@
                 <w:sz w:val="20"/>
                 <w:szCs w:val="20"/>
               </w:rPr>
-              <w:lastRenderedPageBreak/>
               <w:t>6</w:t>
             </w:r>
           </w:p>
@@ -8478,6 +10203,7 @@
                 <w:sz w:val="20"/>
                 <w:szCs w:val="20"/>
               </w:rPr>
+              <w:lastRenderedPageBreak/>
               <w:t>7</w:t>
             </w:r>
           </w:p>
@@ -8962,7 +10688,6 @@
                 <w:sz w:val="20"/>
                 <w:szCs w:val="20"/>
               </w:rPr>
-              <w:lastRenderedPageBreak/>
               <w:t>9</w:t>
             </w:r>
           </w:p>
@@ -9393,6 +11118,7 @@
                 <w:sz w:val="20"/>
                 <w:szCs w:val="20"/>
               </w:rPr>
+              <w:lastRenderedPageBreak/>
               <w:t>monitoring</w:t>
             </w:r>
             <w:r>
@@ -9433,6 +11159,7 @@
                 <w:sz w:val="20"/>
                 <w:szCs w:val="20"/>
               </w:rPr>
+              <w:lastRenderedPageBreak/>
               <w:t xml:space="preserve">Teknologi yang digunakan relatif lama (Arduino + GSM) dan belum mendukung pemantauan energi berbasis </w:t>
             </w:r>
             <w:r>
@@ -9555,14 +11282,7 @@
         <w:rPr>
           <w:color w:val="000000" w:themeColor="text1"/>
         </w:rPr>
-        <w:t xml:space="preserve">, ESP8266, Arduino, serta sensor energi seperti PZEM-004T, CT sensor, dan ACS712. Sistem </w:t>
-      </w:r>
-      <w:r>
-        <w:rPr>
-          <w:color w:val="000000" w:themeColor="text1"/>
-        </w:rPr>
-        <w:lastRenderedPageBreak/>
-        <w:t xml:space="preserve">yang dikembangkan umumnya mampu mengukur parameter kelistrikan secara </w:t>
+        <w:t xml:space="preserve">, ESP8266, Arduino, serta sensor energi seperti PZEM-004T, CT sensor, dan ACS712. Sistem yang dikembangkan umumnya mampu mengukur parameter kelistrikan secara </w:t>
       </w:r>
       <w:r>
         <w:rPr>
@@ -9664,6 +11384,7 @@
         <w:rPr>
           <w:color w:val="000000" w:themeColor="text1"/>
         </w:rPr>
+        <w:lastRenderedPageBreak/>
         <w:t>Penelitian lain, seperti Almy et al. (2025), Nugroho et al. (2025), dan Rifa’i et al. (2025), menunjukkan bahwa sistem monitoring energi berbasis IoT memiliki akurasi pengukuran yang baik dan dapat digunakan sebagai solusi pemantauan konsumsi listrik skala rumah tangga. Meskipun demikian, penelitian-penelitian tersebut umumnya belum mengaitkan data konsumsi energi dengan aktivitas pengguna ruangan, sehingga analisis efisiensi energi masih bersifat teknis dan belum kontekstual.</w:t>
       </w:r>
     </w:p>
@@ -9750,14 +11471,7 @@
         <w:rPr>
           <w:color w:val="000000" w:themeColor="text1"/>
         </w:rPr>
-        <w:t xml:space="preserve"> konsumsi </w:t>
-      </w:r>
-      <w:r>
-        <w:rPr>
-          <w:color w:val="000000" w:themeColor="text1"/>
-        </w:rPr>
-        <w:lastRenderedPageBreak/>
-        <w:t xml:space="preserve">energi listrik dengan data aktivitas manusia, serta membandingkan karakteristik konsumsi energi antara beban resistif (lampu) dan beban induktif (kipas angin) dalam satu sistem terpadu. Selain itu, penerapan sistem </w:t>
+        <w:t xml:space="preserve"> konsumsi energi listrik dengan data aktivitas manusia, serta membandingkan karakteristik konsumsi energi antara beban resistif (lampu) dan beban induktif (kipas angin) dalam satu sistem terpadu. Selain itu, penerapan sistem </w:t>
       </w:r>
       <w:r>
         <w:rPr>
@@ -9853,7 +11567,14 @@
         <w:rPr>
           <w:color w:val="000000" w:themeColor="text1"/>
         </w:rPr>
-        <w:t>, tetapi juga mengintegrasikan sensor PIR untuk mendeteksi keberadaan jamaah, sehingga konsumsi energi dapat dianalisis berdasarkan aktivitas manusia dan jenis beban listrik. Dengan pendekatan tersebut, penelitian ini diharapkan dapat memberikan kontribusi dalam mendukung efisiensi dan pengelolaan energi listrik yang lebih efektif pada bangunan publik.</w:t>
+        <w:t xml:space="preserve">, tetapi juga mengintegrasikan sensor PIR untuk mendeteksi keberadaan jamaah, sehingga </w:t>
+      </w:r>
+      <w:r>
+        <w:rPr>
+          <w:color w:val="000000" w:themeColor="text1"/>
+        </w:rPr>
+        <w:lastRenderedPageBreak/>
+        <w:t>konsumsi energi dapat dianalisis berdasarkan aktivitas manusia dan jenis beban listrik. Dengan pendekatan tersebut, penelitian ini diharapkan dapat memberikan kontribusi dalam mendukung efisiensi dan pengelolaan energi listrik yang lebih efektif pada bangunan publik.</w:t>
       </w:r>
     </w:p>
     <w:p>
@@ -10386,6 +12107,122 @@
     </w:lvl>
   </w:abstractNum>
   <w:abstractNum w:abstractNumId="4" w15:restartNumberingAfterBreak="0">
+    <w:nsid w:val="2191698D"/>
+    <w:multiLevelType w:val="multilevel"/>
+    <w:tmpl w:val="3AB46964"/>
+    <w:lvl w:ilvl="0">
+      <w:start w:val="1"/>
+      <w:numFmt w:val="decimal"/>
+      <w:lvlText w:val="%1."/>
+      <w:lvlJc w:val="left"/>
+      <w:pPr>
+        <w:tabs>
+          <w:tab w:val="num" w:pos="720"/>
+        </w:tabs>
+        <w:ind w:left="720" w:hanging="360"/>
+      </w:pPr>
+      <w:rPr>
+        <w:rFonts w:ascii="Times New Roman" w:eastAsia="Times New Roman" w:hAnsi="Times New Roman" w:cs="Times New Roman"/>
+      </w:rPr>
+    </w:lvl>
+    <w:lvl w:ilvl="1" w:tentative="1">
+      <w:start w:val="1"/>
+      <w:numFmt w:val="decimal"/>
+      <w:lvlText w:val="%2."/>
+      <w:lvlJc w:val="left"/>
+      <w:pPr>
+        <w:tabs>
+          <w:tab w:val="num" w:pos="1440"/>
+        </w:tabs>
+        <w:ind w:left="1440" w:hanging="360"/>
+      </w:pPr>
+    </w:lvl>
+    <w:lvl w:ilvl="2" w:tentative="1">
+      <w:start w:val="1"/>
+      <w:numFmt w:val="decimal"/>
+      <w:lvlText w:val="%3."/>
+      <w:lvlJc w:val="left"/>
+      <w:pPr>
+        <w:tabs>
+          <w:tab w:val="num" w:pos="2160"/>
+        </w:tabs>
+        <w:ind w:left="2160" w:hanging="360"/>
+      </w:pPr>
+    </w:lvl>
+    <w:lvl w:ilvl="3" w:tentative="1">
+      <w:start w:val="1"/>
+      <w:numFmt w:val="decimal"/>
+      <w:lvlText w:val="%4."/>
+      <w:lvlJc w:val="left"/>
+      <w:pPr>
+        <w:tabs>
+          <w:tab w:val="num" w:pos="2880"/>
+        </w:tabs>
+        <w:ind w:left="2880" w:hanging="360"/>
+      </w:pPr>
+    </w:lvl>
+    <w:lvl w:ilvl="4" w:tentative="1">
+      <w:start w:val="1"/>
+      <w:numFmt w:val="decimal"/>
+      <w:lvlText w:val="%5."/>
+      <w:lvlJc w:val="left"/>
+      <w:pPr>
+        <w:tabs>
+          <w:tab w:val="num" w:pos="3600"/>
+        </w:tabs>
+        <w:ind w:left="3600" w:hanging="360"/>
+      </w:pPr>
+    </w:lvl>
+    <w:lvl w:ilvl="5" w:tentative="1">
+      <w:start w:val="1"/>
+      <w:numFmt w:val="decimal"/>
+      <w:lvlText w:val="%6."/>
+      <w:lvlJc w:val="left"/>
+      <w:pPr>
+        <w:tabs>
+          <w:tab w:val="num" w:pos="4320"/>
+        </w:tabs>
+        <w:ind w:left="4320" w:hanging="360"/>
+      </w:pPr>
+    </w:lvl>
+    <w:lvl w:ilvl="6" w:tentative="1">
+      <w:start w:val="1"/>
+      <w:numFmt w:val="decimal"/>
+      <w:lvlText w:val="%7."/>
+      <w:lvlJc w:val="left"/>
+      <w:pPr>
+        <w:tabs>
+          <w:tab w:val="num" w:pos="5040"/>
+        </w:tabs>
+        <w:ind w:left="5040" w:hanging="360"/>
+      </w:pPr>
+    </w:lvl>
+    <w:lvl w:ilvl="7" w:tentative="1">
+      <w:start w:val="1"/>
+      <w:numFmt w:val="decimal"/>
+      <w:lvlText w:val="%8."/>
+      <w:lvlJc w:val="left"/>
+      <w:pPr>
+        <w:tabs>
+          <w:tab w:val="num" w:pos="5760"/>
+        </w:tabs>
+        <w:ind w:left="5760" w:hanging="360"/>
+      </w:pPr>
+    </w:lvl>
+    <w:lvl w:ilvl="8" w:tentative="1">
+      <w:start w:val="1"/>
+      <w:numFmt w:val="decimal"/>
+      <w:lvlText w:val="%9."/>
+      <w:lvlJc w:val="left"/>
+      <w:pPr>
+        <w:tabs>
+          <w:tab w:val="num" w:pos="6480"/>
+        </w:tabs>
+        <w:ind w:left="6480" w:hanging="360"/>
+      </w:pPr>
+    </w:lvl>
+  </w:abstractNum>
+  <w:abstractNum w:abstractNumId="5" w15:restartNumberingAfterBreak="0">
     <w:nsid w:val="25CD65FA"/>
     <w:multiLevelType w:val="multilevel"/>
     <w:tmpl w:val="ED9AEC38"/>
@@ -10515,7 +12352,7 @@
       </w:rPr>
     </w:lvl>
   </w:abstractNum>
-  <w:abstractNum w:abstractNumId="5" w15:restartNumberingAfterBreak="0">
+  <w:abstractNum w:abstractNumId="6" w15:restartNumberingAfterBreak="0">
     <w:nsid w:val="30097C8A"/>
     <w:multiLevelType w:val="multilevel"/>
     <w:tmpl w:val="F8BE34BC"/>
@@ -10628,7 +12465,7 @@
       </w:rPr>
     </w:lvl>
   </w:abstractNum>
-  <w:abstractNum w:abstractNumId="6" w15:restartNumberingAfterBreak="0">
+  <w:abstractNum w:abstractNumId="7" w15:restartNumberingAfterBreak="0">
     <w:nsid w:val="59B705DA"/>
     <w:multiLevelType w:val="multilevel"/>
     <w:tmpl w:val="D3C4C790"/>
@@ -10741,7 +12578,7 @@
       </w:rPr>
     </w:lvl>
   </w:abstractNum>
-  <w:abstractNum w:abstractNumId="7" w15:restartNumberingAfterBreak="0">
+  <w:abstractNum w:abstractNumId="8" w15:restartNumberingAfterBreak="0">
     <w:nsid w:val="6559649B"/>
     <w:multiLevelType w:val="multilevel"/>
     <w:tmpl w:val="6C4C3344"/>
@@ -10854,7 +12691,7 @@
       </w:pPr>
     </w:lvl>
   </w:abstractNum>
-  <w:abstractNum w:abstractNumId="8" w15:restartNumberingAfterBreak="0">
+  <w:abstractNum w:abstractNumId="9" w15:restartNumberingAfterBreak="0">
     <w:nsid w:val="75E057DC"/>
     <w:multiLevelType w:val="multilevel"/>
     <w:tmpl w:val="E2F0C65E"/>
@@ -11005,10 +12842,10 @@
     </w:lvlOverride>
   </w:num>
   <w:num w:numId="3" w16cid:durableId="1298413875">
-    <w:abstractNumId w:val="4"/>
+    <w:abstractNumId w:val="5"/>
   </w:num>
   <w:num w:numId="4" w16cid:durableId="153224758">
-    <w:abstractNumId w:val="4"/>
+    <w:abstractNumId w:val="5"/>
   </w:num>
   <w:num w:numId="5" w16cid:durableId="550118123">
     <w:abstractNumId w:val="1"/>
@@ -11020,16 +12857,19 @@
     <w:abstractNumId w:val="3"/>
   </w:num>
   <w:num w:numId="8" w16cid:durableId="550700987">
+    <w:abstractNumId w:val="9"/>
+  </w:num>
+  <w:num w:numId="9" w16cid:durableId="908425976">
+    <w:abstractNumId w:val="7"/>
+  </w:num>
+  <w:num w:numId="10" w16cid:durableId="384837338">
     <w:abstractNumId w:val="8"/>
   </w:num>
-  <w:num w:numId="9" w16cid:durableId="908425976">
+  <w:num w:numId="11" w16cid:durableId="1287354111">
     <w:abstractNumId w:val="6"/>
   </w:num>
-  <w:num w:numId="10" w16cid:durableId="384837338">
-    <w:abstractNumId w:val="7"/>
-  </w:num>
-  <w:num w:numId="11" w16cid:durableId="1287354111">
-    <w:abstractNumId w:val="5"/>
+  <w:num w:numId="12" w16cid:durableId="15087648">
+    <w:abstractNumId w:val="4"/>
   </w:num>
 </w:numbering>
 </file>
@@ -12066,6 +13906,30 @@
       <w:rFonts w:ascii="Times New Roman" w:hAnsi="Times New Roman"/>
     </w:rPr>
   </w:style>
+  <w:style w:type="character" w:customStyle="1" w:styleId="s1">
+    <w:name w:val="s1"/>
+    <w:basedOn w:val="DefaultParagraphFont"/>
+    <w:rsid w:val="00D37722"/>
+  </w:style>
+  <w:style w:type="table" w:styleId="TableGrid">
+    <w:name w:val="Table Grid"/>
+    <w:basedOn w:val="TableNormal"/>
+    <w:uiPriority w:val="39"/>
+    <w:rsid w:val="0083083D"/>
+    <w:pPr>
+      <w:spacing w:after="0" w:line="240" w:lineRule="auto"/>
+    </w:pPr>
+    <w:tblPr>
+      <w:tblBorders>
+        <w:top w:val="single" w:sz="4" w:space="0" w:color="auto"/>
+        <w:left w:val="single" w:sz="4" w:space="0" w:color="auto"/>
+        <w:bottom w:val="single" w:sz="4" w:space="0" w:color="auto"/>
+        <w:right w:val="single" w:sz="4" w:space="0" w:color="auto"/>
+        <w:insideH w:val="single" w:sz="4" w:space="0" w:color="auto"/>
+        <w:insideV w:val="single" w:sz="4" w:space="0" w:color="auto"/>
+      </w:tblBorders>
+    </w:tblPr>
+  </w:style>
 </w:styles>
 </file>
 

</xml_diff>